<commit_message>
Botón "Mi ubicación" para trabajo en campo
- Nuevo botón con ícono de mira en la barra del mapa. Centra el mapa en la
  persona (punto azul con círculo de precisión) y reconoce y selecciona la
  colonia y la alcaldía donde está.
- Tarjeta "Tu ubicación": calle junto a la persona y hasta 5 calles
  prioritarias (Alta y Muy Alta) a menos de 300 m, con distancia y rumbo; al
  tocar una se abre su ficha con "Cómo llegar" y "Street View".
- Modo seguimiento ("Seguirme mientras camino"); arrastrar el mapa lo suspende.
- Avisos para permiso negado, GPS lento o impreciso y ubicación fuera de la
  Ciudad de México. La posición no se envía ni se guarda.
- Guía de prueba con alcaldías: se agrega la tarea 6 (ubicarse en la calle).

Co-Authored-By: Claude Opus 5.5 <noreply@anthropic.com>
Claude-Session: https://claude.ai/code/session_015MDG8SyNtwfiqop2XnMdEm
</commit_message>
<xml_diff>
--- a/06_entregables/Guia_prueba_alcaldias_calles_prioritarias.docx
+++ b/06_entregables/Guia_prueba_alcaldias_calles_prioritarias.docx
@@ -209,7 +209,7 @@
           <w:sz w:val="20"/>
           <w:szCs w:val="20"/>
         </w:rPr>
-        <w:t xml:space="preserve">30 minutos por persona, de forma individual.</w:t>
+        <w:t xml:space="preserve">30 minutos por persona, de forma individual. Las tareas 1 a 5 pueden hacerse en oficina; la 6 se hace en la calle, porque usa el GPS del teléfono.</w:t>
       </w:r>
     </w:p>
     <w:p>
@@ -412,7 +412,7 @@
           <w:sz w:val="24"/>
           <w:szCs w:val="24"/>
         </w:rPr>
-        <w:t xml:space="preserve">4. Las cinco tareas</w:t>
+        <w:t xml:space="preserve">4. Las seis tareas</w:t>
       </w:r>
     </w:p>
     <w:p>
@@ -1128,6 +1128,120 @@
                 <w:szCs w:val="18"/>
               </w:rPr>
               <w:t xml:space="preserve">Dónde busca el botón. Si el Excel se lee en el teléfono. Si la ficha le sirve para llevarla a campo.</w:t>
+            </w:r>
+          </w:p>
+        </w:tc>
+      </w:tr>
+      <w:tr>
+        <w:trPr>
+          <w:cantSplit/>
+          <w:tblHeader w:val="false"/>
+        </w:trPr>
+        <w:tc>
+          <w:tcPr>
+            <w:tcW w:type="dxa" w:w="500"/>
+            <w:shd w:fill="F4EFE9" w:color="auto" w:val="clear"/>
+            <w:tcMar>
+              <w:top w:type="dxa" w:w="70"/>
+              <w:left w:type="dxa" w:w="100"/>
+              <w:bottom w:type="dxa" w:w="70"/>
+              <w:right w:type="dxa" w:w="100"/>
+            </w:tcMar>
+            <w:vAlign w:val="top"/>
+          </w:tcPr>
+          <w:p>
+            <w:pPr>
+              <w:spacing w:after="40"/>
+              <w:jc w:val="left"/>
+            </w:pPr>
+            <w:r>
+              <w:rPr>
+                <w:rFonts w:ascii="Roboto" w:cs="Roboto" w:eastAsia="Roboto" w:hAnsi="Roboto"/>
+                <w:sz w:val="18"/>
+                <w:szCs w:val="18"/>
+              </w:rPr>
+              <w:t xml:space="preserve">6</w:t>
+            </w:r>
+          </w:p>
+        </w:tc>
+        <w:tc>
+          <w:tcPr>
+            <w:tcW w:type="dxa" w:w="3700"/>
+            <w:shd w:fill="F4EFE9" w:color="auto" w:val="clear"/>
+            <w:tcMar>
+              <w:top w:type="dxa" w:w="70"/>
+              <w:left w:type="dxa" w:w="100"/>
+              <w:bottom w:type="dxa" w:w="70"/>
+              <w:right w:type="dxa" w:w="100"/>
+            </w:tcMar>
+            <w:vAlign w:val="top"/>
+          </w:tcPr>
+          <w:p>
+            <w:pPr>
+              <w:spacing w:after="40"/>
+              <w:jc w:val="left"/>
+            </w:pPr>
+            <w:r>
+              <w:rPr>
+                <w:rFonts w:ascii="Roboto" w:cs="Roboto" w:eastAsia="Roboto" w:hAnsi="Roboto"/>
+                <w:sz w:val="18"/>
+                <w:szCs w:val="18"/>
+              </w:rPr>
+              <w:t xml:space="preserve">Ya en la calle: usa tu ubicación en el mapa y dime cuál es la calle prioritaria más cercana a ti y a cuántos metros está.</w:t>
+            </w:r>
+          </w:p>
+        </w:tc>
+        <w:tc>
+          <w:tcPr>
+            <w:tcW w:type="dxa" w:w="2300"/>
+            <w:shd w:fill="F4EFE9" w:color="auto" w:val="clear"/>
+            <w:tcMar>
+              <w:top w:type="dxa" w:w="70"/>
+              <w:left w:type="dxa" w:w="100"/>
+              <w:bottom w:type="dxa" w:w="70"/>
+              <w:right w:type="dxa" w:w="100"/>
+            </w:tcMar>
+            <w:vAlign w:val="top"/>
+          </w:tcPr>
+          <w:p>
+            <w:pPr>
+              <w:spacing w:after="40"/>
+              <w:jc w:val="left"/>
+            </w:pPr>
+            <w:r>
+              <w:rPr>
+                <w:rFonts w:ascii="Roboto" w:cs="Roboto" w:eastAsia="Roboto" w:hAnsi="Roboto"/>
+                <w:sz w:val="18"/>
+                <w:szCs w:val="18"/>
+              </w:rPr>
+              <w:t xml:space="preserve">Nombra la calle y la distancia que muestra la herramienta.</w:t>
+            </w:r>
+          </w:p>
+        </w:tc>
+        <w:tc>
+          <w:tcPr>
+            <w:tcW w:type="dxa" w:w="4040"/>
+            <w:shd w:fill="F4EFE9" w:color="auto" w:val="clear"/>
+            <w:tcMar>
+              <w:top w:type="dxa" w:w="70"/>
+              <w:left w:type="dxa" w:w="100"/>
+              <w:bottom w:type="dxa" w:w="70"/>
+              <w:right w:type="dxa" w:w="100"/>
+            </w:tcMar>
+            <w:vAlign w:val="top"/>
+          </w:tcPr>
+          <w:p>
+            <w:pPr>
+              <w:spacing w:after="40"/>
+              <w:jc w:val="left"/>
+            </w:pPr>
+            <w:r>
+              <w:rPr>
+                <w:rFonts w:ascii="Roboto" w:cs="Roboto" w:eastAsia="Roboto" w:hAnsi="Roboto"/>
+                <w:sz w:val="18"/>
+                <w:szCs w:val="18"/>
+              </w:rPr>
+              <w:t xml:space="preserve">Si encuentra el botón de ubicación (la mira, a la derecha del mapa). Si da el permiso sin dudar. Si la precisión alcanza para reconocer la calle donde está.</w:t>
             </w:r>
           </w:p>
         </w:tc>
@@ -3263,6 +3377,188 @@
           </w:p>
         </w:tc>
       </w:tr>
+      <w:tr>
+        <w:trPr>
+          <w:cantSplit/>
+          <w:tblHeader w:val="false"/>
+        </w:trPr>
+        <w:tc>
+          <w:tcPr>
+            <w:tcW w:type="dxa" w:w="500"/>
+            <w:shd w:fill="F4EFE9" w:color="auto" w:val="clear"/>
+            <w:tcMar>
+              <w:top w:type="dxa" w:w="70"/>
+              <w:left w:type="dxa" w:w="100"/>
+              <w:bottom w:type="dxa" w:w="70"/>
+              <w:right w:type="dxa" w:w="100"/>
+            </w:tcMar>
+            <w:vAlign w:val="top"/>
+          </w:tcPr>
+          <w:p>
+            <w:pPr>
+              <w:spacing w:after="40"/>
+              <w:jc w:val="left"/>
+            </w:pPr>
+            <w:r>
+              <w:rPr>
+                <w:rFonts w:ascii="Roboto" w:cs="Roboto" w:eastAsia="Roboto" w:hAnsi="Roboto"/>
+                <w:sz w:val="18"/>
+                <w:szCs w:val="18"/>
+              </w:rPr>
+              <w:t xml:space="preserve">6</w:t>
+            </w:r>
+          </w:p>
+        </w:tc>
+        <w:tc>
+          <w:tcPr>
+            <w:tcW w:type="dxa" w:w="1500"/>
+            <w:shd w:fill="F4EFE9" w:color="auto" w:val="clear"/>
+            <w:tcMar>
+              <w:top w:type="dxa" w:w="70"/>
+              <w:left w:type="dxa" w:w="100"/>
+              <w:bottom w:type="dxa" w:w="70"/>
+              <w:right w:type="dxa" w:w="100"/>
+            </w:tcMar>
+            <w:vAlign w:val="top"/>
+          </w:tcPr>
+          <w:p>
+            <w:pPr>
+              <w:spacing w:after="40"/>
+              <w:jc w:val="left"/>
+            </w:pPr>
+            <w:r>
+              <w:rPr>
+                <w:rFonts w:ascii="Roboto" w:cs="Roboto" w:eastAsia="Roboto" w:hAnsi="Roboto"/>
+                <w:sz w:val="18"/>
+                <w:szCs w:val="18"/>
+              </w:rPr>
+              <w:t xml:space="preserve">☐</w:t>
+            </w:r>
+          </w:p>
+        </w:tc>
+        <w:tc>
+          <w:tcPr>
+            <w:tcW w:type="dxa" w:w="1500"/>
+            <w:shd w:fill="F4EFE9" w:color="auto" w:val="clear"/>
+            <w:tcMar>
+              <w:top w:type="dxa" w:w="70"/>
+              <w:left w:type="dxa" w:w="100"/>
+              <w:bottom w:type="dxa" w:w="70"/>
+              <w:right w:type="dxa" w:w="100"/>
+            </w:tcMar>
+            <w:vAlign w:val="top"/>
+          </w:tcPr>
+          <w:p>
+            <w:pPr>
+              <w:spacing w:after="40"/>
+              <w:jc w:val="left"/>
+            </w:pPr>
+            <w:r>
+              <w:rPr>
+                <w:rFonts w:ascii="Roboto" w:cs="Roboto" w:eastAsia="Roboto" w:hAnsi="Roboto"/>
+                <w:sz w:val="18"/>
+                <w:szCs w:val="18"/>
+              </w:rPr>
+              <w:t xml:space="preserve">☐</w:t>
+            </w:r>
+          </w:p>
+        </w:tc>
+        <w:tc>
+          <w:tcPr>
+            <w:tcW w:type="dxa" w:w="1500"/>
+            <w:shd w:fill="F4EFE9" w:color="auto" w:val="clear"/>
+            <w:tcMar>
+              <w:top w:type="dxa" w:w="70"/>
+              <w:left w:type="dxa" w:w="100"/>
+              <w:bottom w:type="dxa" w:w="70"/>
+              <w:right w:type="dxa" w:w="100"/>
+            </w:tcMar>
+            <w:vAlign w:val="top"/>
+          </w:tcPr>
+          <w:p>
+            <w:pPr>
+              <w:spacing w:after="40"/>
+              <w:jc w:val="left"/>
+            </w:pPr>
+            <w:r>
+              <w:rPr>
+                <w:rFonts w:ascii="Roboto" w:cs="Roboto" w:eastAsia="Roboto" w:hAnsi="Roboto"/>
+                <w:sz w:val="18"/>
+                <w:szCs w:val="18"/>
+              </w:rPr>
+              <w:t xml:space="preserve">☐</w:t>
+            </w:r>
+          </w:p>
+        </w:tc>
+        <w:tc>
+          <w:tcPr>
+            <w:tcW w:type="dxa" w:w="1100"/>
+            <w:shd w:fill="F4EFE9" w:color="auto" w:val="clear"/>
+            <w:tcMar>
+              <w:top w:type="dxa" w:w="70"/>
+              <w:left w:type="dxa" w:w="100"/>
+              <w:bottom w:type="dxa" w:w="70"/>
+              <w:right w:type="dxa" w:w="100"/>
+            </w:tcMar>
+            <w:vAlign w:val="top"/>
+          </w:tcPr>
+          <w:p>
+            <w:pPr>
+              <w:spacing w:after="40"/>
+              <w:jc w:val="left"/>
+            </w:pPr>
+            <w:r>
+              <w:rPr>
+                <w:rFonts w:ascii="Roboto" w:cs="Roboto" w:eastAsia="Roboto" w:hAnsi="Roboto"/>
+                <w:sz w:val="18"/>
+                <w:szCs w:val="18"/>
+              </w:rPr>
+              <w:t xml:space="preserve"/>
+            </w:r>
+          </w:p>
+        </w:tc>
+        <w:tc>
+          <w:tcPr>
+            <w:tcW w:type="dxa" w:w="4440"/>
+            <w:shd w:fill="F4EFE9" w:color="auto" w:val="clear"/>
+            <w:tcMar>
+              <w:top w:type="dxa" w:w="70"/>
+              <w:left w:type="dxa" w:w="100"/>
+              <w:bottom w:type="dxa" w:w="70"/>
+              <w:right w:type="dxa" w:w="100"/>
+            </w:tcMar>
+            <w:vAlign w:val="top"/>
+          </w:tcPr>
+          <w:p>
+            <w:pPr>
+              <w:spacing w:after="40"/>
+              <w:jc w:val="left"/>
+            </w:pPr>
+            <w:r>
+              <w:rPr>
+                <w:rFonts w:ascii="Roboto" w:cs="Roboto" w:eastAsia="Roboto" w:hAnsi="Roboto"/>
+                <w:sz w:val="18"/>
+                <w:szCs w:val="18"/>
+              </w:rPr>
+              <w:t xml:space="preserve"/>
+            </w:r>
+          </w:p>
+          <w:p>
+            <w:pPr>
+              <w:spacing w:after="40"/>
+              <w:jc w:val="left"/>
+            </w:pPr>
+            <w:r>
+              <w:rPr>
+                <w:rFonts w:ascii="Roboto" w:cs="Roboto" w:eastAsia="Roboto" w:hAnsi="Roboto"/>
+                <w:sz w:val="18"/>
+                <w:szCs w:val="18"/>
+              </w:rPr>
+              <w:t xml:space="preserve"/>
+            </w:r>
+          </w:p>
+        </w:tc>
+      </w:tr>
     </w:tbl>
     <w:p>
       <w:pPr>
@@ -3644,20 +3940,6 @@
               <w:t xml:space="preserve"/>
             </w:r>
           </w:p>
-          <w:p>
-            <w:pPr>
-              <w:spacing w:after="40"/>
-              <w:jc w:val="left"/>
-            </w:pPr>
-            <w:r>
-              <w:rPr>
-                <w:rFonts w:ascii="Roboto" w:cs="Roboto" w:eastAsia="Roboto" w:hAnsi="Roboto"/>
-                <w:sz w:val="18"/>
-                <w:szCs w:val="18"/>
-              </w:rPr>
-              <w:t xml:space="preserve"/>
-            </w:r>
-          </w:p>
         </w:tc>
       </w:tr>
       <w:tr>
@@ -3708,20 +3990,6 @@
             </w:tcMar>
             <w:vAlign w:val="top"/>
           </w:tcPr>
-          <w:p>
-            <w:pPr>
-              <w:spacing w:after="40"/>
-              <w:jc w:val="left"/>
-            </w:pPr>
-            <w:r>
-              <w:rPr>
-                <w:rFonts w:ascii="Roboto" w:cs="Roboto" w:eastAsia="Roboto" w:hAnsi="Roboto"/>
-                <w:sz w:val="18"/>
-                <w:szCs w:val="18"/>
-              </w:rPr>
-              <w:t xml:space="preserve"/>
-            </w:r>
-          </w:p>
           <w:p>
             <w:pPr>
               <w:spacing w:after="40"/>

</xml_diff>

<commit_message>
Guía de prueba con personal de alcaldías, regenerada para la v17.29
Ocho tareas con el recorrido vigente: entrada por territorio, «Dónde empezar», cifras en Resumen, colonia-calle-tramo, ruta, capas, descargas y Mi ubicación. Capturas nuevas de la v17.29 y renglón de registro para la ventana de entrada. Sustituye a la guía del 2 de octubre.

Co-Authored-By: Claude Opus 5.5 <noreply@anthropic.com>
Claude-Session: https://claude.ai/code/session_01PTmwF6JPMydoQpNkn7dTdj
</commit_message>
<xml_diff>
--- a/06_entregables/Guia_prueba_alcaldias_calles_prioritarias.docx
+++ b/06_entregables/Guia_prueba_alcaldias_calles_prioritarias.docx
@@ -16,7 +16,7 @@
           <w:sz w:val="20"/>
           <w:szCs w:val="20"/>
         </w:rPr>
-        <w:t xml:space="preserve">Ciudad de México, a 2 de octubre de 2026</w:t>
+        <w:t xml:space="preserve">Ciudad de México, a 4 de octubre de 2026</w:t>
       </w:r>
     </w:p>
     <w:p>
@@ -50,7 +50,7 @@
           <w:sz w:val="22"/>
           <w:szCs w:val="22"/>
         </w:rPr>
-        <w:t xml:space="preserve">Herramienta «Calles prioritarias para reforestar» · versión 17.23</w:t>
+        <w:t xml:space="preserve">Herramienta «Calles prioritarias para reforestar» · versión 17.29</w:t>
       </w:r>
     </w:p>
     <w:tbl>
@@ -108,7 +108,7 @@
                 <w:sz w:val="20"/>
                 <w:szCs w:val="20"/>
               </w:rPr>
-              <w:t xml:space="preserve">Prueba de uso en teléfonos reales, con personal de alcaldías, antes de difundir la herramienta y de publicarla en la infraestructura del Sistema de Información Ambiental. Esta guía corresponde a la versión 17.23 y sustituye a la del 24 de septiembre de 2026.</w:t>
+              <w:t xml:space="preserve">Prueba de uso en teléfonos reales, con personal de alcaldías, antes de difundir la herramienta y de publicarla en la infraestructura del Sistema de Información Ambiental. Esta guía corresponde a la versión 17.29 y sustituye a la del 2 de octubre de 2026.</w:t>
             </w:r>
           </w:p>
         </w:tc>
@@ -394,7 +394,7 @@
           <w:sz w:val="20"/>
           <w:szCs w:val="20"/>
         </w:rPr>
-        <w:t xml:space="preserve"> al final de la pestaña Descargas debe leerse «Versión 17.23». Si aparece otra, se anota en el formato y se usan las capturas del anexo 1 solo como referencia.</w:t>
+        <w:t xml:space="preserve"> al final de la pestaña Descargas debe leerse «Versión 17.29». Si aparece otra, se anota en el formato y se usan las capturas del anexo 1 solo como referencia.</w:t>
       </w:r>
     </w:p>
     <w:p>
@@ -1087,7 +1087,7 @@
           <w:sz w:val="20"/>
           <w:szCs w:val="20"/>
         </w:rPr>
-        <w:t xml:space="preserve">El moderador lee cada tarea tal como está escrita, cronometra desde que termina de leerla y tiene la herramienta abierta en otro equipo para verificar las respuestas. Cada tarea se refiere a un solo ámbito: las tareas 1 y 2, a la alcaldía; de la 3 a la 7, a la colonia que la persona eligió.</w:t>
+        <w:t xml:space="preserve">El moderador lee cada tarea tal como está escrita, cronometra desde que termina de leerla y tiene la herramienta abierta en otro equipo para verificar las respuestas. Cada tarea se refiere a un solo ámbito: las tareas 1 a 3, a la alcaldía; de la 4 a la 7, a la colonia que la persona eligió.</w:t>
       </w:r>
     </w:p>
     <w:p>
@@ -1352,7 +1352,7 @@
                 <w:sz w:val="18"/>
                 <w:szCs w:val="18"/>
               </w:rPr>
-              <w:t xml:space="preserve">Abre el enlace que te enviamos y encuentra la información de tu alcaldía.</w:t>
+              <w:t xml:space="preserve">Abre el enlace que te enviamos y entra a la información de tu alcaldía.</w:t>
             </w:r>
           </w:p>
         </w:tc>
@@ -1386,7 +1386,7 @@
                 <w:sz w:val="18"/>
                 <w:szCs w:val="18"/>
               </w:rPr>
-              <w:t xml:space="preserve">Llega a las cifras de su alcaldía (el recuadro superior dice «Alcaldía» y su nombre).</w:t>
+              <w:t xml:space="preserve">Elige su alcaldía en la ventana de entrada y llega a ella (el recuadro superior dice «Alcaldía» y su nombre).</w:t>
             </w:r>
           </w:p>
         </w:tc>
@@ -1420,7 +1420,7 @@
                 <w:sz w:val="18"/>
                 <w:szCs w:val="18"/>
               </w:rPr>
-              <w:t xml:space="preserve">Segundos hasta ver el mapa y tipo de conexión. Si usa el buscador. Si entiende la fila «Atiende» (Alcaldías / Gobierno Central). Si aparece el aviso de modo ligero.</w:t>
+              <w:t xml:space="preserve">Segundos hasta ver la ventana de entrada y tipo de conexión. Si entiende la pregunta «¿Qué alcaldía quieres revisar?» o intenta cerrarla. Si aparece el aviso de modo ligero.</w:t>
             </w:r>
           </w:p>
         </w:tc>
@@ -1493,7 +1493,7 @@
                 <w:sz w:val="18"/>
                 <w:szCs w:val="18"/>
               </w:rPr>
-              <w:t xml:space="preserve">¿Cuántos kilómetros de frente prioritario tiene tu alcaldía y qué porcentaje de los kilómetros prioritarios de la ciudad representa?</w:t>
+              <w:t xml:space="preserve">Según la herramienta, ¿por qué colonia conviene empezar a plantar en tu alcaldía? ¿Y si lo que más importa es cuánta gente vive ahí?</w:t>
             </w:r>
           </w:p>
         </w:tc>
@@ -1527,7 +1527,7 @@
                 <w:sz w:val="18"/>
                 <w:szCs w:val="18"/>
               </w:rPr>
-              <w:t xml:space="preserve">Dice las dos cifras de la pestaña Resumen.</w:t>
+              <w:t xml:space="preserve">Nombra la primera colonia de la pestaña «Dónde empezar»; después cambia «Ordenar por» a habitantes y nombra la primera.</w:t>
             </w:r>
           </w:p>
         </w:tc>
@@ -1561,7 +1561,7 @@
                 <w:sz w:val="18"/>
                 <w:szCs w:val="18"/>
               </w:rPr>
-              <w:t xml:space="preserve">Si sube la hoja inferior («Ver más»). Si distingue «prioritario» (Muy Alta y Alta) de todos los frentes. Si confunde kilómetros de frente con kilómetros de calle.</w:t>
+              <w:t xml:space="preserve">Si ve la lista sin ayuda o necesita subir la hoja inferior. Si encuentra «Ordenar por». Si las colonias le parecen razonables por su conocimiento del territorio. Si pregunta qué significa «prioritario».</w:t>
             </w:r>
           </w:p>
         </w:tc>
@@ -1634,7 +1634,7 @@
                 <w:sz w:val="18"/>
                 <w:szCs w:val="18"/>
               </w:rPr>
-              <w:t xml:space="preserve">Busca una colonia que conozcas bien y dime cuál es la calle que conviene reforestar primero.</w:t>
+              <w:t xml:space="preserve">¿Cuántos kilómetros de frente prioritario tiene tu alcaldía y qué porcentaje de los kilómetros prioritarios de la ciudad representa?</w:t>
             </w:r>
           </w:p>
         </w:tc>
@@ -1668,7 +1668,7 @@
                 <w:sz w:val="18"/>
                 <w:szCs w:val="18"/>
               </w:rPr>
-              <w:t xml:space="preserve">Nombra una calle de la pestaña «Calles» de esa colonia, o la señala en el mapa.</w:t>
+              <w:t xml:space="preserve">Dice las dos cifras de la pestaña «Resumen».</w:t>
             </w:r>
           </w:p>
         </w:tc>
@@ -1702,7 +1702,7 @@
                 <w:sz w:val="18"/>
                 <w:szCs w:val="18"/>
               </w:rPr>
-              <w:t xml:space="preserve">Cómo escribe el nombre (abreviaturas, errores). Si encuentra la pestaña, que cambia de nombre: «Colonias» con una alcaldía, «Calles» con una colonia. Si la calle le parece razonable por su conocimiento del territorio.</w:t>
+              <w:t xml:space="preserve">Si encuentra la pestaña «Resumen», que ya no es la primera. Si distingue «prioritario» (Muy Alta y Alta) de todos los frentes. Si confunde kilómetros de frente con kilómetros de calle.</w:t>
             </w:r>
           </w:p>
         </w:tc>
@@ -1775,7 +1775,7 @@
                 <w:sz w:val="18"/>
                 <w:szCs w:val="18"/>
               </w:rPr>
-              <w:t xml:space="preserve">Toca esa calle en la lista. ¿Entre qué calles queda el tramo que conviene atender primero?</w:t>
+              <w:t xml:space="preserve">Elige una colonia que conozcas bien y dime cuál es la calle que conviene reforestar primero y entre qué calles queda el tramo por atender.</w:t>
             </w:r>
           </w:p>
         </w:tc>
@@ -1809,7 +1809,7 @@
                 <w:sz w:val="18"/>
                 <w:szCs w:val="18"/>
               </w:rPr>
-              <w:t xml:space="preserve">Lee, en el cuadro «Tramos de…», las calles que delimitan un tramo.</w:t>
+              <w:t xml:space="preserve">Nombra la primera calle de «Dónde empezar» de esa colonia, la toca y lee, en la pestaña «Calles», las calles que delimitan un tramo.</w:t>
             </w:r>
           </w:p>
         </w:tc>
@@ -1843,7 +1843,7 @@
                 <w:sz w:val="18"/>
                 <w:szCs w:val="18"/>
               </w:rPr>
-              <w:t xml:space="preserve">Si nota que la calle queda resaltada en el mapa. Si entiende el desglose por prioridad. Si las calles que delimitan el tramo son correctas según lo que conoce.</w:t>
+              <w:t xml:space="preserve">Si elige la colonia en la lista o con el buscador (cómo escribe el nombre). Si después de tocar la calle encuentra sus tramos, que están en la pestaña «Calles» y no en «Dónde empezar». Si nota la calle resaltada en el mapa. Si la calle y el tramo son correctos según lo que conoce.</w:t>
             </w:r>
           </w:p>
         </w:tc>
@@ -2125,7 +2125,7 @@
                 <w:sz w:val="18"/>
                 <w:szCs w:val="18"/>
               </w:rPr>
-              <w:t xml:space="preserve">Si encuentra el botón de capas (a la derecha del mapa). Si entiende que las casillas de prioridad solo cambian lo que se ve, no las cifras. Si el fondo tarda o no carga.</w:t>
+              <w:t xml:space="preserve">Si abre las capas con el botón de la derecha o con la leyenda de colores. Si entiende que las casillas de prioridad solo cambian lo que se ve, no las cifras. Si repara en «Quién atiende» y en el aviso de asignación preliminar. Si el fondo tarda o no carga.</w:t>
             </w:r>
           </w:p>
         </w:tc>
@@ -2266,7 +2266,7 @@
                 <w:sz w:val="18"/>
                 <w:szCs w:val="18"/>
               </w:rPr>
-              <w:t xml:space="preserve">Con una calle consultada, los botones del pie entregan los archivos de esa calle; los de la colonia están en la pestaña Descargas. Anotar si lo advierte o si descarga los de la calle. Si el Excel se lee en el teléfono. Si la ficha le sirve para llevarla a campo.</w:t>
+              <w:t xml:space="preserve">Con una calle consultada, los botones del pie entregan los archivos de esa calle; los de la colonia están en la pestaña «Descargas». Anotar si lo advierte o si descarga los de la calle. Si el Excel se lee en el teléfono. Si la ficha le sirve para llevarla a campo. Si pregunta por los archivos «para abrir en un mapa».</w:t>
             </w:r>
           </w:p>
         </w:tc>
@@ -2441,7 +2441,7 @@
           <w:sz w:val="20"/>
           <w:szCs w:val="20"/>
         </w:rPr>
-        <w:t xml:space="preserve">Las tareas 4 y 6 son nuevas respecto de la guía anterior: cubren la calle consultada con sus tramos, las capas, el mapa de fondo y el filtro de prioridades, que se incorporaron entre las versiones 17.3 y 17.16.</w:t>
+        <w:t xml:space="preserve">Las tareas 1 y 2 son nuevas respecto de la guía del 2 de octubre: cubren la entrada por territorio y la pestaña «Dónde empezar», incorporadas en la versión 17.28. La tarea 4 reúne las anteriores 3 y 4. La herramienta recuerda la última alcaldía consultada: si la persona ya la había abierto en ese teléfono, no verá la ventana de entrada y la tarea 1 se registra con esa nota.</w:t>
       </w:r>
     </w:p>
     <w:p>
@@ -3946,7 +3946,7 @@
           <w:sz w:val="20"/>
           <w:szCs w:val="20"/>
         </w:rPr>
-        <w:t xml:space="preserve">Capturas de la versión 17.23 en un teléfono de 390 × 844. Sirven para que el moderador reconozca a qué pantalla debe llegar la persona en cada tarea; no se muestran al participante.</w:t>
+        <w:t xml:space="preserve">Capturas de la versión 17.29 en un teléfono de 390 × 844. Sirven para que el moderador reconozca a qué pantalla debe llegar la persona en cada tarea; no se muestran al participante.</w:t>
       </w:r>
     </w:p>
     <w:tbl>
@@ -4055,7 +4055,7 @@
                 <w:sz w:val="17"/>
                 <w:szCs w:val="17"/>
               </w:rPr>
-              <w:t xml:space="preserve"> Al abrir: mapa de la ciudad, buscador y fila «Atiende».</w:t>
+              <w:t xml:space="preserve"> Tarea 1: ventana de entrada con las 16 alcaldías.</w:t>
             </w:r>
           </w:p>
         </w:tc>
@@ -4144,7 +4144,7 @@
                 <w:sz w:val="17"/>
                 <w:szCs w:val="17"/>
               </w:rPr>
-              <w:t xml:space="preserve"> Tareas 1 y 2: alcaldía elegida; la hoja inferior muestra las cifras.</w:t>
+              <w:t xml:space="preserve"> Tarea 1: alcaldía elegida; leyenda compacta sobre el mapa y pestañas en la hoja inferior.</w:t>
             </w:r>
           </w:p>
         </w:tc>
@@ -4233,7 +4233,7 @@
                 <w:sz w:val="17"/>
                 <w:szCs w:val="17"/>
               </w:rPr>
-              <w:t xml:space="preserve"> Pestañas Resumen, Colonias (o Calles) y Descargas.</w:t>
+              <w:t xml:space="preserve"> Tarea 2: «Dónde empezar» con las colonias numeradas y «Ordenar por».</w:t>
             </w:r>
           </w:p>
         </w:tc>
@@ -4266,7 +4266,7 @@
           <w:sz w:val="18"/>
           <w:szCs w:val="18"/>
         </w:rPr>
-        <w:t xml:space="preserve">Inicio, consulta de una alcaldía y pestañas de la hoja inferior. </w:t>
+        <w:t xml:space="preserve">Entrada por territorio, alcaldía elegida y pestaña «Dónde empezar». </w:t>
       </w:r>
       <w:r>
         <w:rPr>
@@ -4277,7 +4277,7 @@
           <w:sz w:val="18"/>
           <w:szCs w:val="18"/>
         </w:rPr>
-        <w:t xml:space="preserve">Fuente: herramienta «Calles prioritarias para reforestar», versión 17.23, teléfono simulado de 390 × 844, 2 de octubre de 2026.</w:t>
+        <w:t xml:space="preserve">Fuente: herramienta «Calles prioritarias para reforestar», versión 17.29, teléfono simulado de 390 × 844, 4 de octubre de 2026.</w:t>
       </w:r>
     </w:p>
     <w:tbl>
@@ -4386,7 +4386,7 @@
                 <w:sz w:val="17"/>
                 <w:szCs w:val="17"/>
               </w:rPr>
-              <w:t xml:space="preserve"> Tareas 3 y 4: colonia con la calle consultada resaltada; el pie ofrece los archivos de la calle.</w:t>
+              <w:t xml:space="preserve"> Tarea 3: pestaña «Resumen» con las cifras de la alcaldía.</w:t>
             </w:r>
           </w:p>
         </w:tc>
@@ -4475,7 +4475,7 @@
                 <w:sz w:val="17"/>
                 <w:szCs w:val="17"/>
               </w:rPr>
-              <w:t xml:space="preserve"> Tarea 4: pestaña Calles con los tramos de la calle consultada.</w:t>
+              <w:t xml:space="preserve"> Tarea 4: colonia elegida; «Dónde empezar» muestra sus calles.</w:t>
             </w:r>
           </w:p>
         </w:tc>
@@ -4564,7 +4564,7 @@
                 <w:sz w:val="17"/>
                 <w:szCs w:val="17"/>
               </w:rPr>
-              <w:t xml:space="preserve"> Tarea 6: panel de capas, mapa de fondo y opacidad.</w:t>
+              <w:t xml:space="preserve"> Tarea 4: pestaña «Calles» con los tramos de la calle consultada.</w:t>
             </w:r>
           </w:p>
         </w:tc>
@@ -4597,7 +4597,7 @@
           <w:sz w:val="18"/>
           <w:szCs w:val="18"/>
         </w:rPr>
-        <w:t xml:space="preserve">Calle consultada en el mapa, sus tramos y panel de capas. </w:t>
+        <w:t xml:space="preserve">Cifras de la alcaldía, calles de una colonia y tramos de la calle consultada. </w:t>
       </w:r>
       <w:r>
         <w:rPr>
@@ -4608,7 +4608,7 @@
           <w:sz w:val="18"/>
           <w:szCs w:val="18"/>
         </w:rPr>
-        <w:t xml:space="preserve">Fuente: herramienta «Calles prioritarias para reforestar», versión 17.23, teléfono simulado de 390 × 844, 2 de octubre de 2026.</w:t>
+        <w:t xml:space="preserve">Fuente: herramienta «Calles prioritarias para reforestar», versión 17.29, teléfono simulado de 390 × 844, 4 de octubre de 2026.</w:t>
       </w:r>
     </w:p>
     <w:tbl>
@@ -4717,7 +4717,7 @@
                 <w:sz w:val="17"/>
                 <w:szCs w:val="17"/>
               </w:rPr>
-              <w:t xml:space="preserve"> Tarea 7: pestaña Descargas y botones del pie.</w:t>
+              <w:t xml:space="preserve"> Tarea 6: panel de capas, con «Quién atiende», mapa de fondo y prioridades.</w:t>
             </w:r>
           </w:p>
         </w:tc>
@@ -4806,7 +4806,7 @@
                 <w:sz w:val="17"/>
                 <w:szCs w:val="17"/>
               </w:rPr>
-              <w:t xml:space="preserve"> Tarea 8: Mi ubicación y calles prioritarias cercanas.</w:t>
+              <w:t xml:space="preserve"> Tarea 7: pestaña «Descargas», con los archivos para abrir en un mapa.</w:t>
             </w:r>
           </w:p>
         </w:tc>
@@ -4895,7 +4895,7 @@
                 <w:sz w:val="17"/>
                 <w:szCs w:val="17"/>
               </w:rPr>
-              <w:t xml:space="preserve"> Tarjeta de la colonia al elegirla en el buscador.</w:t>
+              <w:t xml:space="preserve"> Tarea 8: Mi ubicación y calles prioritarias cercanas.</w:t>
             </w:r>
           </w:p>
         </w:tc>
@@ -4928,7 +4928,7 @@
           <w:sz w:val="18"/>
           <w:szCs w:val="18"/>
         </w:rPr>
-        <w:t xml:space="preserve">Descargas, Mi ubicación y tarjeta de la colonia. Varias capturas muestran la etiqueta «Modo ligero», propia de equipos sin aceleración gráfica; en un teléfono con aceleración no aparece. </w:t>
+        <w:t xml:space="preserve">Capas, descargas y Mi ubicación. Las capturas muestran la etiqueta «Modo ligero», propia de equipos sin aceleración gráfica; en un teléfono con aceleración no aparece y el mapa se ve completo. </w:t>
       </w:r>
       <w:r>
         <w:rPr>
@@ -4939,7 +4939,7 @@
           <w:sz w:val="18"/>
           <w:szCs w:val="18"/>
         </w:rPr>
-        <w:t xml:space="preserve">Fuente: herramienta «Calles prioritarias para reforestar», versión 17.23, teléfono simulado de 390 × 844, 2 de octubre de 2026.</w:t>
+        <w:t xml:space="preserve">Fuente: herramienta «Calles prioritarias para reforestar», versión 17.29, teléfono simulado de 390 × 844, 4 de octubre de 2026.</w:t>
       </w:r>
     </w:p>
     <w:p>
@@ -5631,7 +5631,7 @@
                 <w:sz w:val="18"/>
                 <w:szCs w:val="18"/>
               </w:rPr>
-              <w:t xml:space="preserve">Prueba de acceso previa (tabla 1)</w:t>
+              <w:t xml:space="preserve">¿Apareció la ventana de entrada?</w:t>
             </w:r>
           </w:p>
         </w:tc>
@@ -5665,7 +5665,7 @@
                 <w:sz w:val="18"/>
                 <w:szCs w:val="18"/>
               </w:rPr>
-              <w:t xml:space="preserve">☐ Abrió en la red de la alcaldía   ☐ Solo con datos móviles   ☐ No abrió</w:t>
+              <w:t xml:space="preserve">☐ Sí   ☐ No (ya había abierto la herramienta en ese teléfono)</w:t>
             </w:r>
           </w:p>
         </w:tc>
@@ -5705,6 +5705,80 @@
                 <w:sz w:val="18"/>
                 <w:szCs w:val="18"/>
               </w:rPr>
+              <w:t xml:space="preserve">Prueba de acceso previa (tabla 1)</w:t>
+            </w:r>
+          </w:p>
+        </w:tc>
+        <w:tc>
+          <w:tcPr>
+            <w:tcW w:type="dxa" w:w="6572"/>
+            <w:tcBorders>
+              <w:top w:val="single" w:color="C9C9C9" w:sz="4"/>
+              <w:left w:val="single" w:color="C9C9C9" w:sz="4"/>
+              <w:bottom w:val="single" w:color="C9C9C9" w:sz="4"/>
+              <w:right w:val="single" w:color="C9C9C9" w:sz="4"/>
+            </w:tcBorders>
+            <w:shd w:fill="F7F1F3" w:color="auto" w:val="clear"/>
+            <w:tcMar>
+              <w:top w:type="dxa" w:w="70"/>
+              <w:left w:type="dxa" w:w="100"/>
+              <w:bottom w:type="dxa" w:w="70"/>
+              <w:right w:type="dxa" w:w="100"/>
+            </w:tcMar>
+            <w:vAlign w:val="top"/>
+          </w:tcPr>
+          <w:p>
+            <w:pPr>
+              <w:spacing w:after="30" w:line="250"/>
+              <w:jc w:val="left"/>
+            </w:pPr>
+            <w:r>
+              <w:rPr>
+                <w:rFonts w:ascii="Roboto" w:cs="Roboto" w:eastAsia="Roboto" w:hAnsi="Roboto"/>
+                <w:color w:val="1A1A1A"/>
+                <w:sz w:val="18"/>
+                <w:szCs w:val="18"/>
+              </w:rPr>
+              <w:t xml:space="preserve">☐ Abrió en la red de la alcaldía   ☐ Solo con datos móviles   ☐ No abrió</w:t>
+            </w:r>
+          </w:p>
+        </w:tc>
+      </w:tr>
+      <w:tr>
+        <w:trPr>
+          <w:cantSplit/>
+          <w:trHeight w:val="380" w:hRule="atLeast"/>
+        </w:trPr>
+        <w:tc>
+          <w:tcPr>
+            <w:tcW w:type="dxa" w:w="3400"/>
+            <w:tcBorders>
+              <w:top w:val="single" w:color="C9C9C9" w:sz="4"/>
+              <w:left w:val="single" w:color="C9C9C9" w:sz="4"/>
+              <w:bottom w:val="single" w:color="C9C9C9" w:sz="4"/>
+              <w:right w:val="single" w:color="C9C9C9" w:sz="4"/>
+            </w:tcBorders>
+            <w:shd w:fill="FFFFFF" w:color="auto" w:val="clear"/>
+            <w:tcMar>
+              <w:top w:type="dxa" w:w="70"/>
+              <w:left w:type="dxa" w:w="100"/>
+              <w:bottom w:type="dxa" w:w="70"/>
+              <w:right w:type="dxa" w:w="100"/>
+            </w:tcMar>
+            <w:vAlign w:val="top"/>
+          </w:tcPr>
+          <w:p>
+            <w:pPr>
+              <w:spacing w:after="30" w:line="250"/>
+              <w:jc w:val="left"/>
+            </w:pPr>
+            <w:r>
+              <w:rPr>
+                <w:rFonts w:ascii="Roboto" w:cs="Roboto" w:eastAsia="Roboto" w:hAnsi="Roboto"/>
+                <w:color w:val="1A1A1A"/>
+                <w:sz w:val="18"/>
+                <w:szCs w:val="18"/>
+              </w:rPr>
               <w:t xml:space="preserve">Fecha y moderador</w:t>
             </w:r>
           </w:p>
@@ -5718,7 +5792,7 @@
               <w:bottom w:val="single" w:color="C9C9C9" w:sz="4"/>
               <w:right w:val="single" w:color="C9C9C9" w:sz="4"/>
             </w:tcBorders>
-            <w:shd w:fill="F7F1F3" w:color="auto" w:val="clear"/>
+            <w:shd w:fill="FFFFFF" w:color="auto" w:val="clear"/>
             <w:tcMar>
               <w:top w:type="dxa" w:w="70"/>
               <w:left w:type="dxa" w:w="100"/>

</xml_diff>

<commit_message>
v17.30: la herramienta es para las alcaldías y para el Gobierno Central
Entrada en dos pasos: primero qué se consulta (calles y colonias de las alcaldías, o vialidades primarias del Gobierno Central) y después el territorio; se recuerdan ambos.
La fila «Atiende» vuelve junto al buscador; su explicación y el aviso de asignación preliminar siguen en el panel de capas.
Textos de entrada y de ayuda: la Secretaría pone la herramienta a disposición de las alcaldías y de las dependencias del Gobierno de la Ciudad.
Recuadro del mapa en teléfono: el texto largo de Gobierno Central ya no desplaza al nombre del ámbito.
Guía de prueba: variante de las ocho tareas para personal del Gobierno Central y capturas de la v17.30.
Pruebas: doce series aprobadas (orientación, 40 verificaciones).

Co-Authored-By: Claude Opus 5.5 <noreply@anthropic.com>
Claude-Session: https://claude.ai/code/session_01PTmwF6JPMydoQpNkn7dTdj
</commit_message>
<xml_diff>
--- a/06_entregables/Guia_prueba_alcaldias_calles_prioritarias.docx
+++ b/06_entregables/Guia_prueba_alcaldias_calles_prioritarias.docx
@@ -33,7 +33,7 @@
           <w:sz w:val="30"/>
           <w:szCs w:val="30"/>
         </w:rPr>
-        <w:t xml:space="preserve">GUÍA DE PRUEBA CON PERSONAL DE ALCALDÍAS</w:t>
+        <w:t xml:space="preserve">GUÍA DE PRUEBA CON PERSONAL DE ALCALDÍAS Y DEL GOBIERNO CENTRAL</w:t>
       </w:r>
     </w:p>
     <w:p>
@@ -50,7 +50,7 @@
           <w:sz w:val="22"/>
           <w:szCs w:val="22"/>
         </w:rPr>
-        <w:t xml:space="preserve">Herramienta «Calles prioritarias para reforestar» · versión 17.29</w:t>
+        <w:t xml:space="preserve">Herramienta «Calles prioritarias para reforestar» · versión 17.30</w:t>
       </w:r>
     </w:p>
     <w:tbl>
@@ -108,7 +108,7 @@
                 <w:sz w:val="20"/>
                 <w:szCs w:val="20"/>
               </w:rPr>
-              <w:t xml:space="preserve">Prueba de uso en teléfonos reales, con personal de alcaldías, antes de difundir la herramienta y de publicarla en la infraestructura del Sistema de Información Ambiental. Esta guía corresponde a la versión 17.29 y sustituye a la del 2 de octubre de 2026.</w:t>
+              <w:t xml:space="preserve">Prueba de uso en teléfonos reales, con personal de alcaldías y de las áreas del Gobierno de la Ciudad que atienden vialidades primarias, antes de difundir la herramienta y de publicarla en la infraestructura del Sistema de Información Ambiental. Esta guía corresponde a la versión 17.30 y sustituye a las del 2 y del 4 de octubre de 2026 (versiones 17.23 y 17.29).</w:t>
             </w:r>
           </w:p>
         </w:tc>
@@ -146,7 +146,7 @@
           <w:sz w:val="20"/>
           <w:szCs w:val="20"/>
         </w:rPr>
-        <w:t xml:space="preserve">Verificar que el personal que planea y ejecuta la reforestación en las alcaldías puede, desde su propio teléfono y sin capacitación previa, encontrar su territorio, entender qué calles son prioritarias, ubicar el tramo que conviene atender, llegar a él y descargar la información para campo. La prueba detecta los ajustes necesarios antes de la difusión institucional.</w:t>
+        <w:t xml:space="preserve">La Secretaría del Medio Ambiente pone la herramienta a disposición de las alcaldías y de las dependencias del Gobierno de la Ciudad. La prueba verifica que el personal que planea y ejecuta la reforestación, en una alcaldía o en el Gobierno Central, puede desde su propio teléfono y sin capacitación previa encontrar su territorio, entender qué calles o vialidades primarias son prioritarias, ubicar el tramo que conviene atender, llegar a él y descargar la información para campo. La prueba detecta los ajustes necesarios antes de la difusión institucional.</w:t>
       </w:r>
     </w:p>
     <w:p>
@@ -195,7 +195,7 @@
           <w:sz w:val="20"/>
           <w:szCs w:val="20"/>
         </w:rPr>
-        <w:t xml:space="preserve">Participantes:</w:t>
+        <w:t xml:space="preserve">Participantes de alcaldías:</w:t>
       </w:r>
       <w:r>
         <w:rPr>
@@ -205,6 +205,44 @@
           <w:szCs w:val="20"/>
         </w:rPr>
         <w:t xml:space="preserve"> 2 o 3 alcaldías, 2 personas por alcaldía (enlace de áreas verdes y personal técnico de campo). En total, 4 a 6 personas.</w:t>
+      </w:r>
+    </w:p>
+    <w:p>
+      <w:pPr>
+        <w:spacing w:after="70" w:line="264"/>
+        <w:ind w:left="360" w:hanging="220"/>
+        <w:jc w:val="left"/>
+      </w:pPr>
+      <w:r>
+        <w:rPr>
+          <w:rFonts w:ascii="Roboto" w:cs="Roboto" w:eastAsia="Roboto" w:hAnsi="Roboto"/>
+          <w:b/>
+          <w:bCs/>
+          <w:color w:val="9D2148"/>
+          <w:sz w:val="20"/>
+          <w:szCs w:val="20"/>
+        </w:rPr>
+        <w:t xml:space="preserve">•  </w:t>
+      </w:r>
+      <w:r>
+        <w:rPr>
+          <w:rFonts w:ascii="Roboto" w:cs="Roboto" w:eastAsia="Roboto" w:hAnsi="Roboto"/>
+          <w:b/>
+          <w:bCs/>
+          <w:color w:val="1A1A1A"/>
+          <w:sz w:val="20"/>
+          <w:szCs w:val="20"/>
+        </w:rPr>
+        <w:t xml:space="preserve">Participantes del Gobierno Central:</w:t>
+      </w:r>
+      <w:r>
+        <w:rPr>
+          <w:rFonts w:ascii="Roboto" w:cs="Roboto" w:eastAsia="Roboto" w:hAnsi="Roboto"/>
+          <w:color w:val="1A1A1A"/>
+          <w:sz w:val="20"/>
+          <w:szCs w:val="20"/>
+        </w:rPr>
+        <w:t xml:space="preserve"> 2 personas de las áreas que plantan en vialidades primarias. Siguen las mismas ocho tareas, con la variante de la tabla 3.</w:t>
       </w:r>
     </w:p>
     <w:p>
@@ -394,7 +432,7 @@
           <w:sz w:val="20"/>
           <w:szCs w:val="20"/>
         </w:rPr>
-        <w:t xml:space="preserve"> al final de la pestaña Descargas debe leerse «Versión 17.29». Si aparece otra, se anota en el formato y se usan las capturas del anexo 1 solo como referencia.</w:t>
+        <w:t xml:space="preserve"> al final de la pestaña Descargas debe leerse «Versión 17.30». Si aparece otra, se anota en el formato y se usan las capturas del anexo 1 solo como referencia.</w:t>
       </w:r>
     </w:p>
     <w:p>
@@ -1386,7 +1424,7 @@
                 <w:sz w:val="18"/>
                 <w:szCs w:val="18"/>
               </w:rPr>
-              <w:t xml:space="preserve">Elige su alcaldía en la ventana de entrada y llega a ella (el recuadro superior dice «Alcaldía» y su nombre).</w:t>
+              <w:t xml:space="preserve">En la ventana de entrada elige «Calles y colonias» y después su alcaldía (el recuadro superior dice «Alcaldía» y su nombre).</w:t>
             </w:r>
           </w:p>
         </w:tc>
@@ -1420,7 +1458,7 @@
                 <w:sz w:val="18"/>
                 <w:szCs w:val="18"/>
               </w:rPr>
-              <w:t xml:space="preserve">Segundos hasta ver la ventana de entrada y tipo de conexión. Si entiende la pregunta «¿Qué alcaldía quieres revisar?» o intenta cerrarla. Si aparece el aviso de modo ligero.</w:t>
+              <w:t xml:space="preserve">Segundos hasta ver la ventana de entrada y tipo de conexión. Si entiende las dos opciones de «¿Qué quieres consultar?» o duda entre ellas. Si intenta cerrar la ventana. Si aparece el aviso de modo ligero.</w:t>
             </w:r>
           </w:p>
         </w:tc>
@@ -1561,7 +1599,7 @@
                 <w:sz w:val="18"/>
                 <w:szCs w:val="18"/>
               </w:rPr>
-              <w:t xml:space="preserve">Si ve la lista sin ayuda o necesita subir la hoja inferior. Si encuentra «Ordenar por». Si las colonias le parecen razonables por su conocimiento del territorio. Si pregunta qué significa «prioritario».</w:t>
+              <w:t xml:space="preserve">Si ve la lista sin ayuda o necesita subir la hoja inferior. Si encuentra «Ordenar por». Si las colonias le parecen razonables por su conocimiento del territorio. Si pregunta qué significa «prioritario». Si repara en la fila «Atiende», bajo el buscador.</w:t>
             </w:r>
           </w:p>
         </w:tc>
@@ -2125,7 +2163,7 @@
                 <w:sz w:val="18"/>
                 <w:szCs w:val="18"/>
               </w:rPr>
-              <w:t xml:space="preserve">Si abre las capas con el botón de la derecha o con la leyenda de colores. Si entiende que las casillas de prioridad solo cambian lo que se ve, no las cifras. Si repara en «Quién atiende» y en el aviso de asignación preliminar. Si el fondo tarda o no carga.</w:t>
+              <w:t xml:space="preserve">Si abre las capas con el botón de la derecha o con la leyenda de colores. Si entiende que las casillas de prioridad solo cambian lo que se ve, no las cifras. Si lee el aviso de asignación preliminar. Si el fondo tarda o no carga.</w:t>
             </w:r>
           </w:p>
         </w:tc>
@@ -2441,7 +2479,1346 @@
           <w:sz w:val="20"/>
           <w:szCs w:val="20"/>
         </w:rPr>
-        <w:t xml:space="preserve">Las tareas 1 y 2 son nuevas respecto de la guía del 2 de octubre: cubren la entrada por territorio y la pestaña «Dónde empezar», incorporadas en la versión 17.28. La tarea 4 reúne las anteriores 3 y 4. La herramienta recuerda la última alcaldía consultada: si la persona ya la había abierto en ese teléfono, no verá la ventana de entrada y la tarea 1 se registra con esa nota.</w:t>
+        <w:t xml:space="preserve">Las tareas 1 y 2 son nuevas respecto de la guía del 2 de octubre: cubren la entrada en dos pasos (qué se consulta y dónde) y la pestaña «Dónde empezar», incorporadas en las versiones 17.28 y 17.30. La tarea 4 reúne las anteriores 3 y 4. La herramienta recuerda la última consulta: si la persona ya la había abierto en ese teléfono, no verá la ventana de entrada y la tarea 1 se registra con esa nota.</w:t>
+      </w:r>
+    </w:p>
+    <w:p>
+      <w:pPr>
+        <w:keepNext/>
+        <w:spacing w:after="100" w:before="160" w:line="240"/>
+      </w:pPr>
+      <w:r>
+        <w:rPr>
+          <w:rFonts w:ascii="Roboto" w:cs="Roboto" w:eastAsia="Roboto" w:hAnsi="Roboto"/>
+          <w:b/>
+          <w:bCs/>
+          <w:color w:val="9D2148"/>
+          <w:sz w:val="19"/>
+          <w:szCs w:val="19"/>
+        </w:rPr>
+        <w:t xml:space="preserve">Tabla 3. </w:t>
+      </w:r>
+      <w:r>
+        <w:rPr>
+          <w:rFonts w:ascii="Roboto" w:cs="Roboto" w:eastAsia="Roboto" w:hAnsi="Roboto"/>
+          <w:color w:val="1A1A1A"/>
+          <w:sz w:val="19"/>
+          <w:szCs w:val="19"/>
+        </w:rPr>
+        <w:t xml:space="preserve">Variante de las tareas para personal del Gobierno Central</w:t>
+      </w:r>
+    </w:p>
+    <w:tbl>
+      <w:tblPr>
+        <w:tblW w:type="dxa" w:w="9972"/>
+        <w:tblBorders>
+          <w:top w:val="single" w:color="auto" w:sz="4"/>
+          <w:left w:val="single" w:color="auto" w:sz="4"/>
+          <w:bottom w:val="single" w:color="auto" w:sz="4"/>
+          <w:right w:val="single" w:color="auto" w:sz="4"/>
+          <w:insideH w:val="single" w:color="auto" w:sz="4"/>
+          <w:insideV w:val="single" w:color="auto" w:sz="4"/>
+        </w:tblBorders>
+      </w:tblPr>
+      <w:tblGrid>
+        <w:gridCol w:w="500"/>
+        <w:gridCol w:w="3300"/>
+        <w:gridCol w:w="2500"/>
+        <w:gridCol w:w="3672"/>
+      </w:tblGrid>
+      <w:tr>
+        <w:trPr>
+          <w:cantSplit/>
+          <w:tblHeader/>
+        </w:trPr>
+        <w:tc>
+          <w:tcPr>
+            <w:tcW w:type="dxa" w:w="500"/>
+            <w:tcBorders>
+              <w:top w:val="single" w:color="C9C9C9" w:sz="4"/>
+              <w:left w:val="single" w:color="C9C9C9" w:sz="4"/>
+              <w:bottom w:val="single" w:color="C9C9C9" w:sz="4"/>
+              <w:right w:val="single" w:color="C9C9C9" w:sz="4"/>
+            </w:tcBorders>
+            <w:shd w:fill="9D2148" w:color="auto" w:val="clear"/>
+            <w:tcMar>
+              <w:top w:type="dxa" w:w="70"/>
+              <w:left w:type="dxa" w:w="100"/>
+              <w:bottom w:type="dxa" w:w="70"/>
+              <w:right w:type="dxa" w:w="100"/>
+            </w:tcMar>
+            <w:vAlign w:val="center"/>
+          </w:tcPr>
+          <w:p>
+            <w:pPr>
+              <w:spacing w:after="30" w:line="250"/>
+              <w:jc w:val="left"/>
+            </w:pPr>
+            <w:r>
+              <w:rPr>
+                <w:rFonts w:ascii="Roboto" w:cs="Roboto" w:eastAsia="Roboto" w:hAnsi="Roboto"/>
+                <w:b/>
+                <w:bCs/>
+                <w:color w:val="FFFFFF"/>
+                <w:sz w:val="18"/>
+                <w:szCs w:val="18"/>
+              </w:rPr>
+              <w:t xml:space="preserve">#</w:t>
+            </w:r>
+          </w:p>
+        </w:tc>
+        <w:tc>
+          <w:tcPr>
+            <w:tcW w:type="dxa" w:w="3300"/>
+            <w:tcBorders>
+              <w:top w:val="single" w:color="C9C9C9" w:sz="4"/>
+              <w:left w:val="single" w:color="C9C9C9" w:sz="4"/>
+              <w:bottom w:val="single" w:color="C9C9C9" w:sz="4"/>
+              <w:right w:val="single" w:color="C9C9C9" w:sz="4"/>
+            </w:tcBorders>
+            <w:shd w:fill="9D2148" w:color="auto" w:val="clear"/>
+            <w:tcMar>
+              <w:top w:type="dxa" w:w="70"/>
+              <w:left w:type="dxa" w:w="100"/>
+              <w:bottom w:type="dxa" w:w="70"/>
+              <w:right w:type="dxa" w:w="100"/>
+            </w:tcMar>
+            <w:vAlign w:val="center"/>
+          </w:tcPr>
+          <w:p>
+            <w:pPr>
+              <w:spacing w:after="30" w:line="250"/>
+              <w:jc w:val="left"/>
+            </w:pPr>
+            <w:r>
+              <w:rPr>
+                <w:rFonts w:ascii="Roboto" w:cs="Roboto" w:eastAsia="Roboto" w:hAnsi="Roboto"/>
+                <w:b/>
+                <w:bCs/>
+                <w:color w:val="FFFFFF"/>
+                <w:sz w:val="18"/>
+                <w:szCs w:val="18"/>
+              </w:rPr>
+              <w:t xml:space="preserve">Tarea (se lee a la persona)</w:t>
+            </w:r>
+          </w:p>
+        </w:tc>
+        <w:tc>
+          <w:tcPr>
+            <w:tcW w:type="dxa" w:w="2500"/>
+            <w:tcBorders>
+              <w:top w:val="single" w:color="C9C9C9" w:sz="4"/>
+              <w:left w:val="single" w:color="C9C9C9" w:sz="4"/>
+              <w:bottom w:val="single" w:color="C9C9C9" w:sz="4"/>
+              <w:right w:val="single" w:color="C9C9C9" w:sz="4"/>
+            </w:tcBorders>
+            <w:shd w:fill="9D2148" w:color="auto" w:val="clear"/>
+            <w:tcMar>
+              <w:top w:type="dxa" w:w="70"/>
+              <w:left w:type="dxa" w:w="100"/>
+              <w:bottom w:type="dxa" w:w="70"/>
+              <w:right w:type="dxa" w:w="100"/>
+            </w:tcMar>
+            <w:vAlign w:val="center"/>
+          </w:tcPr>
+          <w:p>
+            <w:pPr>
+              <w:spacing w:after="30" w:line="250"/>
+              <w:jc w:val="left"/>
+            </w:pPr>
+            <w:r>
+              <w:rPr>
+                <w:rFonts w:ascii="Roboto" w:cs="Roboto" w:eastAsia="Roboto" w:hAnsi="Roboto"/>
+                <w:b/>
+                <w:bCs/>
+                <w:color w:val="FFFFFF"/>
+                <w:sz w:val="18"/>
+                <w:szCs w:val="18"/>
+              </w:rPr>
+              <w:t xml:space="preserve">Se cumple si…</w:t>
+            </w:r>
+          </w:p>
+        </w:tc>
+        <w:tc>
+          <w:tcPr>
+            <w:tcW w:type="dxa" w:w="3672"/>
+            <w:tcBorders>
+              <w:top w:val="single" w:color="C9C9C9" w:sz="4"/>
+              <w:left w:val="single" w:color="C9C9C9" w:sz="4"/>
+              <w:bottom w:val="single" w:color="C9C9C9" w:sz="4"/>
+              <w:right w:val="single" w:color="C9C9C9" w:sz="4"/>
+            </w:tcBorders>
+            <w:shd w:fill="9D2148" w:color="auto" w:val="clear"/>
+            <w:tcMar>
+              <w:top w:type="dxa" w:w="70"/>
+              <w:left w:type="dxa" w:w="100"/>
+              <w:bottom w:type="dxa" w:w="70"/>
+              <w:right w:type="dxa" w:w="100"/>
+            </w:tcMar>
+            <w:vAlign w:val="center"/>
+          </w:tcPr>
+          <w:p>
+            <w:pPr>
+              <w:spacing w:after="30" w:line="250"/>
+              <w:jc w:val="left"/>
+            </w:pPr>
+            <w:r>
+              <w:rPr>
+                <w:rFonts w:ascii="Roboto" w:cs="Roboto" w:eastAsia="Roboto" w:hAnsi="Roboto"/>
+                <w:b/>
+                <w:bCs/>
+                <w:color w:val="FFFFFF"/>
+                <w:sz w:val="18"/>
+                <w:szCs w:val="18"/>
+              </w:rPr>
+              <w:t xml:space="preserve">Qué observar</w:t>
+            </w:r>
+          </w:p>
+        </w:tc>
+      </w:tr>
+      <w:tr>
+        <w:trPr>
+          <w:cantSplit/>
+        </w:trPr>
+        <w:tc>
+          <w:tcPr>
+            <w:tcW w:type="dxa" w:w="500"/>
+            <w:tcBorders>
+              <w:top w:val="single" w:color="C9C9C9" w:sz="4"/>
+              <w:left w:val="single" w:color="C9C9C9" w:sz="4"/>
+              <w:bottom w:val="single" w:color="C9C9C9" w:sz="4"/>
+              <w:right w:val="single" w:color="C9C9C9" w:sz="4"/>
+            </w:tcBorders>
+            <w:shd w:fill="FFFFFF" w:color="auto" w:val="clear"/>
+            <w:tcMar>
+              <w:top w:type="dxa" w:w="70"/>
+              <w:left w:type="dxa" w:w="100"/>
+              <w:bottom w:type="dxa" w:w="70"/>
+              <w:right w:type="dxa" w:w="100"/>
+            </w:tcMar>
+            <w:vAlign w:val="top"/>
+          </w:tcPr>
+          <w:p>
+            <w:pPr>
+              <w:spacing w:after="30" w:line="250"/>
+              <w:jc w:val="left"/>
+            </w:pPr>
+            <w:r>
+              <w:rPr>
+                <w:rFonts w:ascii="Roboto" w:cs="Roboto" w:eastAsia="Roboto" w:hAnsi="Roboto"/>
+                <w:color w:val="1A1A1A"/>
+                <w:sz w:val="18"/>
+                <w:szCs w:val="18"/>
+              </w:rPr>
+              <w:t xml:space="preserve">1</w:t>
+            </w:r>
+          </w:p>
+        </w:tc>
+        <w:tc>
+          <w:tcPr>
+            <w:tcW w:type="dxa" w:w="3300"/>
+            <w:tcBorders>
+              <w:top w:val="single" w:color="C9C9C9" w:sz="4"/>
+              <w:left w:val="single" w:color="C9C9C9" w:sz="4"/>
+              <w:bottom w:val="single" w:color="C9C9C9" w:sz="4"/>
+              <w:right w:val="single" w:color="C9C9C9" w:sz="4"/>
+            </w:tcBorders>
+            <w:shd w:fill="FFFFFF" w:color="auto" w:val="clear"/>
+            <w:tcMar>
+              <w:top w:type="dxa" w:w="70"/>
+              <w:left w:type="dxa" w:w="100"/>
+              <w:bottom w:type="dxa" w:w="70"/>
+              <w:right w:type="dxa" w:w="100"/>
+            </w:tcMar>
+            <w:vAlign w:val="top"/>
+          </w:tcPr>
+          <w:p>
+            <w:pPr>
+              <w:spacing w:after="30" w:line="250"/>
+              <w:jc w:val="left"/>
+            </w:pPr>
+            <w:r>
+              <w:rPr>
+                <w:rFonts w:ascii="Roboto" w:cs="Roboto" w:eastAsia="Roboto" w:hAnsi="Roboto"/>
+                <w:color w:val="1A1A1A"/>
+                <w:sz w:val="18"/>
+                <w:szCs w:val="18"/>
+              </w:rPr>
+              <w:t xml:space="preserve">Abre el enlace que te enviamos y entra a las vialidades primarias de una alcaldía donde trabajes.</w:t>
+            </w:r>
+          </w:p>
+        </w:tc>
+        <w:tc>
+          <w:tcPr>
+            <w:tcW w:type="dxa" w:w="2500"/>
+            <w:tcBorders>
+              <w:top w:val="single" w:color="C9C9C9" w:sz="4"/>
+              <w:left w:val="single" w:color="C9C9C9" w:sz="4"/>
+              <w:bottom w:val="single" w:color="C9C9C9" w:sz="4"/>
+              <w:right w:val="single" w:color="C9C9C9" w:sz="4"/>
+            </w:tcBorders>
+            <w:shd w:fill="FFFFFF" w:color="auto" w:val="clear"/>
+            <w:tcMar>
+              <w:top w:type="dxa" w:w="70"/>
+              <w:left w:type="dxa" w:w="100"/>
+              <w:bottom w:type="dxa" w:w="70"/>
+              <w:right w:type="dxa" w:w="100"/>
+            </w:tcMar>
+            <w:vAlign w:val="top"/>
+          </w:tcPr>
+          <w:p>
+            <w:pPr>
+              <w:spacing w:after="30" w:line="250"/>
+              <w:jc w:val="left"/>
+            </w:pPr>
+            <w:r>
+              <w:rPr>
+                <w:rFonts w:ascii="Roboto" w:cs="Roboto" w:eastAsia="Roboto" w:hAnsi="Roboto"/>
+                <w:color w:val="1A1A1A"/>
+                <w:sz w:val="18"/>
+                <w:szCs w:val="18"/>
+              </w:rPr>
+              <w:t xml:space="preserve">En la ventana de entrada elige «Vialidades primarias» y después una alcaldía; la fila «Atiende» queda en «Gobierno Central».</w:t>
+            </w:r>
+          </w:p>
+        </w:tc>
+        <w:tc>
+          <w:tcPr>
+            <w:tcW w:type="dxa" w:w="3672"/>
+            <w:tcBorders>
+              <w:top w:val="single" w:color="C9C9C9" w:sz="4"/>
+              <w:left w:val="single" w:color="C9C9C9" w:sz="4"/>
+              <w:bottom w:val="single" w:color="C9C9C9" w:sz="4"/>
+              <w:right w:val="single" w:color="C9C9C9" w:sz="4"/>
+            </w:tcBorders>
+            <w:shd w:fill="FFFFFF" w:color="auto" w:val="clear"/>
+            <w:tcMar>
+              <w:top w:type="dxa" w:w="70"/>
+              <w:left w:type="dxa" w:w="100"/>
+              <w:bottom w:type="dxa" w:w="70"/>
+              <w:right w:type="dxa" w:w="100"/>
+            </w:tcMar>
+            <w:vAlign w:val="top"/>
+          </w:tcPr>
+          <w:p>
+            <w:pPr>
+              <w:spacing w:after="30" w:line="250"/>
+              <w:jc w:val="left"/>
+            </w:pPr>
+            <w:r>
+              <w:rPr>
+                <w:rFonts w:ascii="Roboto" w:cs="Roboto" w:eastAsia="Roboto" w:hAnsi="Roboto"/>
+                <w:color w:val="1A1A1A"/>
+                <w:sz w:val="18"/>
+                <w:szCs w:val="18"/>
+              </w:rPr>
+              <w:t xml:space="preserve">Si entiende las dos opciones de entrada. Si prefiere «Ver toda la ciudad». Segundos hasta ver el mapa.</w:t>
+            </w:r>
+          </w:p>
+        </w:tc>
+      </w:tr>
+      <w:tr>
+        <w:trPr>
+          <w:cantSplit/>
+        </w:trPr>
+        <w:tc>
+          <w:tcPr>
+            <w:tcW w:type="dxa" w:w="500"/>
+            <w:tcBorders>
+              <w:top w:val="single" w:color="C9C9C9" w:sz="4"/>
+              <w:left w:val="single" w:color="C9C9C9" w:sz="4"/>
+              <w:bottom w:val="single" w:color="C9C9C9" w:sz="4"/>
+              <w:right w:val="single" w:color="C9C9C9" w:sz="4"/>
+            </w:tcBorders>
+            <w:shd w:fill="F7F1F3" w:color="auto" w:val="clear"/>
+            <w:tcMar>
+              <w:top w:type="dxa" w:w="70"/>
+              <w:left w:type="dxa" w:w="100"/>
+              <w:bottom w:type="dxa" w:w="70"/>
+              <w:right w:type="dxa" w:w="100"/>
+            </w:tcMar>
+            <w:vAlign w:val="top"/>
+          </w:tcPr>
+          <w:p>
+            <w:pPr>
+              <w:spacing w:after="30" w:line="250"/>
+              <w:jc w:val="left"/>
+            </w:pPr>
+            <w:r>
+              <w:rPr>
+                <w:rFonts w:ascii="Roboto" w:cs="Roboto" w:eastAsia="Roboto" w:hAnsi="Roboto"/>
+                <w:color w:val="1A1A1A"/>
+                <w:sz w:val="18"/>
+                <w:szCs w:val="18"/>
+              </w:rPr>
+              <w:t xml:space="preserve">2</w:t>
+            </w:r>
+          </w:p>
+        </w:tc>
+        <w:tc>
+          <w:tcPr>
+            <w:tcW w:type="dxa" w:w="3300"/>
+            <w:tcBorders>
+              <w:top w:val="single" w:color="C9C9C9" w:sz="4"/>
+              <w:left w:val="single" w:color="C9C9C9" w:sz="4"/>
+              <w:bottom w:val="single" w:color="C9C9C9" w:sz="4"/>
+              <w:right w:val="single" w:color="C9C9C9" w:sz="4"/>
+            </w:tcBorders>
+            <w:shd w:fill="F7F1F3" w:color="auto" w:val="clear"/>
+            <w:tcMar>
+              <w:top w:type="dxa" w:w="70"/>
+              <w:left w:type="dxa" w:w="100"/>
+              <w:bottom w:type="dxa" w:w="70"/>
+              <w:right w:type="dxa" w:w="100"/>
+            </w:tcMar>
+            <w:vAlign w:val="top"/>
+          </w:tcPr>
+          <w:p>
+            <w:pPr>
+              <w:spacing w:after="30" w:line="250"/>
+              <w:jc w:val="left"/>
+            </w:pPr>
+            <w:r>
+              <w:rPr>
+                <w:rFonts w:ascii="Roboto" w:cs="Roboto" w:eastAsia="Roboto" w:hAnsi="Roboto"/>
+                <w:color w:val="1A1A1A"/>
+                <w:sz w:val="18"/>
+                <w:szCs w:val="18"/>
+              </w:rPr>
+              <w:t xml:space="preserve">Según la herramienta, ¿por qué avenida conviene empezar a plantar ahí?</w:t>
+            </w:r>
+          </w:p>
+        </w:tc>
+        <w:tc>
+          <w:tcPr>
+            <w:tcW w:type="dxa" w:w="2500"/>
+            <w:tcBorders>
+              <w:top w:val="single" w:color="C9C9C9" w:sz="4"/>
+              <w:left w:val="single" w:color="C9C9C9" w:sz="4"/>
+              <w:bottom w:val="single" w:color="C9C9C9" w:sz="4"/>
+              <w:right w:val="single" w:color="C9C9C9" w:sz="4"/>
+            </w:tcBorders>
+            <w:shd w:fill="F7F1F3" w:color="auto" w:val="clear"/>
+            <w:tcMar>
+              <w:top w:type="dxa" w:w="70"/>
+              <w:left w:type="dxa" w:w="100"/>
+              <w:bottom w:type="dxa" w:w="70"/>
+              <w:right w:type="dxa" w:w="100"/>
+            </w:tcMar>
+            <w:vAlign w:val="top"/>
+          </w:tcPr>
+          <w:p>
+            <w:pPr>
+              <w:spacing w:after="30" w:line="250"/>
+              <w:jc w:val="left"/>
+            </w:pPr>
+            <w:r>
+              <w:rPr>
+                <w:rFonts w:ascii="Roboto" w:cs="Roboto" w:eastAsia="Roboto" w:hAnsi="Roboto"/>
+                <w:color w:val="1A1A1A"/>
+                <w:sz w:val="18"/>
+                <w:szCs w:val="18"/>
+              </w:rPr>
+              <w:t xml:space="preserve">Nombra la primera avenida de la pestaña «Dónde empezar».</w:t>
+            </w:r>
+          </w:p>
+        </w:tc>
+        <w:tc>
+          <w:tcPr>
+            <w:tcW w:type="dxa" w:w="3672"/>
+            <w:tcBorders>
+              <w:top w:val="single" w:color="C9C9C9" w:sz="4"/>
+              <w:left w:val="single" w:color="C9C9C9" w:sz="4"/>
+              <w:bottom w:val="single" w:color="C9C9C9" w:sz="4"/>
+              <w:right w:val="single" w:color="C9C9C9" w:sz="4"/>
+            </w:tcBorders>
+            <w:shd w:fill="F7F1F3" w:color="auto" w:val="clear"/>
+            <w:tcMar>
+              <w:top w:type="dxa" w:w="70"/>
+              <w:left w:type="dxa" w:w="100"/>
+              <w:bottom w:type="dxa" w:w="70"/>
+              <w:right w:type="dxa" w:w="100"/>
+            </w:tcMar>
+            <w:vAlign w:val="top"/>
+          </w:tcPr>
+          <w:p>
+            <w:pPr>
+              <w:spacing w:after="30" w:line="250"/>
+              <w:jc w:val="left"/>
+            </w:pPr>
+            <w:r>
+              <w:rPr>
+                <w:rFonts w:ascii="Roboto" w:cs="Roboto" w:eastAsia="Roboto" w:hAnsi="Roboto"/>
+                <w:color w:val="1A1A1A"/>
+                <w:sz w:val="18"/>
+                <w:szCs w:val="18"/>
+              </w:rPr>
+              <w:t xml:space="preserve">Si la avenida le parece razonable por su conocimiento. Si entiende «tramos prioritarios».</w:t>
+            </w:r>
+          </w:p>
+        </w:tc>
+      </w:tr>
+      <w:tr>
+        <w:trPr>
+          <w:cantSplit/>
+        </w:trPr>
+        <w:tc>
+          <w:tcPr>
+            <w:tcW w:type="dxa" w:w="500"/>
+            <w:tcBorders>
+              <w:top w:val="single" w:color="C9C9C9" w:sz="4"/>
+              <w:left w:val="single" w:color="C9C9C9" w:sz="4"/>
+              <w:bottom w:val="single" w:color="C9C9C9" w:sz="4"/>
+              <w:right w:val="single" w:color="C9C9C9" w:sz="4"/>
+            </w:tcBorders>
+            <w:shd w:fill="FFFFFF" w:color="auto" w:val="clear"/>
+            <w:tcMar>
+              <w:top w:type="dxa" w:w="70"/>
+              <w:left w:type="dxa" w:w="100"/>
+              <w:bottom w:type="dxa" w:w="70"/>
+              <w:right w:type="dxa" w:w="100"/>
+            </w:tcMar>
+            <w:vAlign w:val="top"/>
+          </w:tcPr>
+          <w:p>
+            <w:pPr>
+              <w:spacing w:after="30" w:line="250"/>
+              <w:jc w:val="left"/>
+            </w:pPr>
+            <w:r>
+              <w:rPr>
+                <w:rFonts w:ascii="Roboto" w:cs="Roboto" w:eastAsia="Roboto" w:hAnsi="Roboto"/>
+                <w:color w:val="1A1A1A"/>
+                <w:sz w:val="18"/>
+                <w:szCs w:val="18"/>
+              </w:rPr>
+              <w:t xml:space="preserve">3</w:t>
+            </w:r>
+          </w:p>
+        </w:tc>
+        <w:tc>
+          <w:tcPr>
+            <w:tcW w:type="dxa" w:w="3300"/>
+            <w:tcBorders>
+              <w:top w:val="single" w:color="C9C9C9" w:sz="4"/>
+              <w:left w:val="single" w:color="C9C9C9" w:sz="4"/>
+              <w:bottom w:val="single" w:color="C9C9C9" w:sz="4"/>
+              <w:right w:val="single" w:color="C9C9C9" w:sz="4"/>
+            </w:tcBorders>
+            <w:shd w:fill="FFFFFF" w:color="auto" w:val="clear"/>
+            <w:tcMar>
+              <w:top w:type="dxa" w:w="70"/>
+              <w:left w:type="dxa" w:w="100"/>
+              <w:bottom w:type="dxa" w:w="70"/>
+              <w:right w:type="dxa" w:w="100"/>
+            </w:tcMar>
+            <w:vAlign w:val="top"/>
+          </w:tcPr>
+          <w:p>
+            <w:pPr>
+              <w:spacing w:after="30" w:line="250"/>
+              <w:jc w:val="left"/>
+            </w:pPr>
+            <w:r>
+              <w:rPr>
+                <w:rFonts w:ascii="Roboto" w:cs="Roboto" w:eastAsia="Roboto" w:hAnsi="Roboto"/>
+                <w:color w:val="1A1A1A"/>
+                <w:sz w:val="18"/>
+                <w:szCs w:val="18"/>
+              </w:rPr>
+              <w:t xml:space="preserve">¿Cuántos kilómetros de vialidad primaria prioritaria hay en esa alcaldía?</w:t>
+            </w:r>
+          </w:p>
+        </w:tc>
+        <w:tc>
+          <w:tcPr>
+            <w:tcW w:type="dxa" w:w="2500"/>
+            <w:tcBorders>
+              <w:top w:val="single" w:color="C9C9C9" w:sz="4"/>
+              <w:left w:val="single" w:color="C9C9C9" w:sz="4"/>
+              <w:bottom w:val="single" w:color="C9C9C9" w:sz="4"/>
+              <w:right w:val="single" w:color="C9C9C9" w:sz="4"/>
+            </w:tcBorders>
+            <w:shd w:fill="FFFFFF" w:color="auto" w:val="clear"/>
+            <w:tcMar>
+              <w:top w:type="dxa" w:w="70"/>
+              <w:left w:type="dxa" w:w="100"/>
+              <w:bottom w:type="dxa" w:w="70"/>
+              <w:right w:type="dxa" w:w="100"/>
+            </w:tcMar>
+            <w:vAlign w:val="top"/>
+          </w:tcPr>
+          <w:p>
+            <w:pPr>
+              <w:spacing w:after="30" w:line="250"/>
+              <w:jc w:val="left"/>
+            </w:pPr>
+            <w:r>
+              <w:rPr>
+                <w:rFonts w:ascii="Roboto" w:cs="Roboto" w:eastAsia="Roboto" w:hAnsi="Roboto"/>
+                <w:color w:val="1A1A1A"/>
+                <w:sz w:val="18"/>
+                <w:szCs w:val="18"/>
+              </w:rPr>
+              <w:t xml:space="preserve">Dice la cifra de la pestaña «Resumen» o del recuadro superior del mapa.</w:t>
+            </w:r>
+          </w:p>
+        </w:tc>
+        <w:tc>
+          <w:tcPr>
+            <w:tcW w:type="dxa" w:w="3672"/>
+            <w:tcBorders>
+              <w:top w:val="single" w:color="C9C9C9" w:sz="4"/>
+              <w:left w:val="single" w:color="C9C9C9" w:sz="4"/>
+              <w:bottom w:val="single" w:color="C9C9C9" w:sz="4"/>
+              <w:right w:val="single" w:color="C9C9C9" w:sz="4"/>
+            </w:tcBorders>
+            <w:shd w:fill="FFFFFF" w:color="auto" w:val="clear"/>
+            <w:tcMar>
+              <w:top w:type="dxa" w:w="70"/>
+              <w:left w:type="dxa" w:w="100"/>
+              <w:bottom w:type="dxa" w:w="70"/>
+              <w:right w:type="dxa" w:w="100"/>
+            </w:tcMar>
+            <w:vAlign w:val="top"/>
+          </w:tcPr>
+          <w:p>
+            <w:pPr>
+              <w:spacing w:after="30" w:line="250"/>
+              <w:jc w:val="left"/>
+            </w:pPr>
+            <w:r>
+              <w:rPr>
+                <w:rFonts w:ascii="Roboto" w:cs="Roboto" w:eastAsia="Roboto" w:hAnsi="Roboto"/>
+                <w:color w:val="1A1A1A"/>
+                <w:sz w:val="18"/>
+                <w:szCs w:val="18"/>
+              </w:rPr>
+              <w:t xml:space="preserve">Si distingue kilómetros de vialidad (medidos sobre el eje) de kilómetros de frente de manzana.</w:t>
+            </w:r>
+          </w:p>
+        </w:tc>
+      </w:tr>
+      <w:tr>
+        <w:trPr>
+          <w:cantSplit/>
+        </w:trPr>
+        <w:tc>
+          <w:tcPr>
+            <w:tcW w:type="dxa" w:w="500"/>
+            <w:tcBorders>
+              <w:top w:val="single" w:color="C9C9C9" w:sz="4"/>
+              <w:left w:val="single" w:color="C9C9C9" w:sz="4"/>
+              <w:bottom w:val="single" w:color="C9C9C9" w:sz="4"/>
+              <w:right w:val="single" w:color="C9C9C9" w:sz="4"/>
+            </w:tcBorders>
+            <w:shd w:fill="F7F1F3" w:color="auto" w:val="clear"/>
+            <w:tcMar>
+              <w:top w:type="dxa" w:w="70"/>
+              <w:left w:type="dxa" w:w="100"/>
+              <w:bottom w:type="dxa" w:w="70"/>
+              <w:right w:type="dxa" w:w="100"/>
+            </w:tcMar>
+            <w:vAlign w:val="top"/>
+          </w:tcPr>
+          <w:p>
+            <w:pPr>
+              <w:spacing w:after="30" w:line="250"/>
+              <w:jc w:val="left"/>
+            </w:pPr>
+            <w:r>
+              <w:rPr>
+                <w:rFonts w:ascii="Roboto" w:cs="Roboto" w:eastAsia="Roboto" w:hAnsi="Roboto"/>
+                <w:color w:val="1A1A1A"/>
+                <w:sz w:val="18"/>
+                <w:szCs w:val="18"/>
+              </w:rPr>
+              <w:t xml:space="preserve">4</w:t>
+            </w:r>
+          </w:p>
+        </w:tc>
+        <w:tc>
+          <w:tcPr>
+            <w:tcW w:type="dxa" w:w="3300"/>
+            <w:tcBorders>
+              <w:top w:val="single" w:color="C9C9C9" w:sz="4"/>
+              <w:left w:val="single" w:color="C9C9C9" w:sz="4"/>
+              <w:bottom w:val="single" w:color="C9C9C9" w:sz="4"/>
+              <w:right w:val="single" w:color="C9C9C9" w:sz="4"/>
+            </w:tcBorders>
+            <w:shd w:fill="F7F1F3" w:color="auto" w:val="clear"/>
+            <w:tcMar>
+              <w:top w:type="dxa" w:w="70"/>
+              <w:left w:type="dxa" w:w="100"/>
+              <w:bottom w:type="dxa" w:w="70"/>
+              <w:right w:type="dxa" w:w="100"/>
+            </w:tcMar>
+            <w:vAlign w:val="top"/>
+          </w:tcPr>
+          <w:p>
+            <w:pPr>
+              <w:spacing w:after="30" w:line="250"/>
+              <w:jc w:val="left"/>
+            </w:pPr>
+            <w:r>
+              <w:rPr>
+                <w:rFonts w:ascii="Roboto" w:cs="Roboto" w:eastAsia="Roboto" w:hAnsi="Roboto"/>
+                <w:color w:val="1A1A1A"/>
+                <w:sz w:val="18"/>
+                <w:szCs w:val="18"/>
+              </w:rPr>
+              <w:t xml:space="preserve">Consulta esa avenida y dime qué alcaldías cruza.</w:t>
+            </w:r>
+          </w:p>
+        </w:tc>
+        <w:tc>
+          <w:tcPr>
+            <w:tcW w:type="dxa" w:w="2500"/>
+            <w:tcBorders>
+              <w:top w:val="single" w:color="C9C9C9" w:sz="4"/>
+              <w:left w:val="single" w:color="C9C9C9" w:sz="4"/>
+              <w:bottom w:val="single" w:color="C9C9C9" w:sz="4"/>
+              <w:right w:val="single" w:color="C9C9C9" w:sz="4"/>
+            </w:tcBorders>
+            <w:shd w:fill="F7F1F3" w:color="auto" w:val="clear"/>
+            <w:tcMar>
+              <w:top w:type="dxa" w:w="70"/>
+              <w:left w:type="dxa" w:w="100"/>
+              <w:bottom w:type="dxa" w:w="70"/>
+              <w:right w:type="dxa" w:w="100"/>
+            </w:tcMar>
+            <w:vAlign w:val="top"/>
+          </w:tcPr>
+          <w:p>
+            <w:pPr>
+              <w:spacing w:after="30" w:line="250"/>
+              <w:jc w:val="left"/>
+            </w:pPr>
+            <w:r>
+              <w:rPr>
+                <w:rFonts w:ascii="Roboto" w:cs="Roboto" w:eastAsia="Roboto" w:hAnsi="Roboto"/>
+                <w:color w:val="1A1A1A"/>
+                <w:sz w:val="18"/>
+                <w:szCs w:val="18"/>
+              </w:rPr>
+              <w:t xml:space="preserve">Toca la avenida y lee, en el recuadro bajo el título, las alcaldías que cruza.</w:t>
+            </w:r>
+          </w:p>
+        </w:tc>
+        <w:tc>
+          <w:tcPr>
+            <w:tcW w:type="dxa" w:w="3672"/>
+            <w:tcBorders>
+              <w:top w:val="single" w:color="C9C9C9" w:sz="4"/>
+              <w:left w:val="single" w:color="C9C9C9" w:sz="4"/>
+              <w:bottom w:val="single" w:color="C9C9C9" w:sz="4"/>
+              <w:right w:val="single" w:color="C9C9C9" w:sz="4"/>
+            </w:tcBorders>
+            <w:shd w:fill="F7F1F3" w:color="auto" w:val="clear"/>
+            <w:tcMar>
+              <w:top w:type="dxa" w:w="70"/>
+              <w:left w:type="dxa" w:w="100"/>
+              <w:bottom w:type="dxa" w:w="70"/>
+              <w:right w:type="dxa" w:w="100"/>
+            </w:tcMar>
+            <w:vAlign w:val="top"/>
+          </w:tcPr>
+          <w:p>
+            <w:pPr>
+              <w:spacing w:after="30" w:line="250"/>
+              <w:jc w:val="left"/>
+            </w:pPr>
+            <w:r>
+              <w:rPr>
+                <w:rFonts w:ascii="Roboto" w:cs="Roboto" w:eastAsia="Roboto" w:hAnsi="Roboto"/>
+                <w:color w:val="1A1A1A"/>
+                <w:sz w:val="18"/>
+                <w:szCs w:val="18"/>
+              </w:rPr>
+              <w:t xml:space="preserve">Si nota la avenida resaltada en el mapa. Si encuentra el desglose por alcaldía en la pestaña «Avenidas».</w:t>
+            </w:r>
+          </w:p>
+        </w:tc>
+      </w:tr>
+      <w:tr>
+        <w:trPr>
+          <w:cantSplit/>
+        </w:trPr>
+        <w:tc>
+          <w:tcPr>
+            <w:tcW w:type="dxa" w:w="500"/>
+            <w:tcBorders>
+              <w:top w:val="single" w:color="C9C9C9" w:sz="4"/>
+              <w:left w:val="single" w:color="C9C9C9" w:sz="4"/>
+              <w:bottom w:val="single" w:color="C9C9C9" w:sz="4"/>
+              <w:right w:val="single" w:color="C9C9C9" w:sz="4"/>
+            </w:tcBorders>
+            <w:shd w:fill="FFFFFF" w:color="auto" w:val="clear"/>
+            <w:tcMar>
+              <w:top w:type="dxa" w:w="70"/>
+              <w:left w:type="dxa" w:w="100"/>
+              <w:bottom w:type="dxa" w:w="70"/>
+              <w:right w:type="dxa" w:w="100"/>
+            </w:tcMar>
+            <w:vAlign w:val="top"/>
+          </w:tcPr>
+          <w:p>
+            <w:pPr>
+              <w:spacing w:after="30" w:line="250"/>
+              <w:jc w:val="left"/>
+            </w:pPr>
+            <w:r>
+              <w:rPr>
+                <w:rFonts w:ascii="Roboto" w:cs="Roboto" w:eastAsia="Roboto" w:hAnsi="Roboto"/>
+                <w:color w:val="1A1A1A"/>
+                <w:sz w:val="18"/>
+                <w:szCs w:val="18"/>
+              </w:rPr>
+              <w:t xml:space="preserve">5</w:t>
+            </w:r>
+          </w:p>
+        </w:tc>
+        <w:tc>
+          <w:tcPr>
+            <w:tcW w:type="dxa" w:w="3300"/>
+            <w:tcBorders>
+              <w:top w:val="single" w:color="C9C9C9" w:sz="4"/>
+              <w:left w:val="single" w:color="C9C9C9" w:sz="4"/>
+              <w:bottom w:val="single" w:color="C9C9C9" w:sz="4"/>
+              <w:right w:val="single" w:color="C9C9C9" w:sz="4"/>
+            </w:tcBorders>
+            <w:shd w:fill="FFFFFF" w:color="auto" w:val="clear"/>
+            <w:tcMar>
+              <w:top w:type="dxa" w:w="70"/>
+              <w:left w:type="dxa" w:w="100"/>
+              <w:bottom w:type="dxa" w:w="70"/>
+              <w:right w:type="dxa" w:w="100"/>
+            </w:tcMar>
+            <w:vAlign w:val="top"/>
+          </w:tcPr>
+          <w:p>
+            <w:pPr>
+              <w:spacing w:after="30" w:line="250"/>
+              <w:jc w:val="left"/>
+            </w:pPr>
+            <w:r>
+              <w:rPr>
+                <w:rFonts w:ascii="Roboto" w:cs="Roboto" w:eastAsia="Roboto" w:hAnsi="Roboto"/>
+                <w:color w:val="1A1A1A"/>
+                <w:sz w:val="18"/>
+                <w:szCs w:val="18"/>
+              </w:rPr>
+              <w:t xml:space="preserve">Toca en el mapa un tramo de esa avenida y pide la ruta para llegar a él.</w:t>
+            </w:r>
+          </w:p>
+        </w:tc>
+        <w:tc>
+          <w:tcPr>
+            <w:tcW w:type="dxa" w:w="2500"/>
+            <w:tcBorders>
+              <w:top w:val="single" w:color="C9C9C9" w:sz="4"/>
+              <w:left w:val="single" w:color="C9C9C9" w:sz="4"/>
+              <w:bottom w:val="single" w:color="C9C9C9" w:sz="4"/>
+              <w:right w:val="single" w:color="C9C9C9" w:sz="4"/>
+            </w:tcBorders>
+            <w:shd w:fill="FFFFFF" w:color="auto" w:val="clear"/>
+            <w:tcMar>
+              <w:top w:type="dxa" w:w="70"/>
+              <w:left w:type="dxa" w:w="100"/>
+              <w:bottom w:type="dxa" w:w="70"/>
+              <w:right w:type="dxa" w:w="100"/>
+            </w:tcMar>
+            <w:vAlign w:val="top"/>
+          </w:tcPr>
+          <w:p>
+            <w:pPr>
+              <w:spacing w:after="30" w:line="250"/>
+              <w:jc w:val="left"/>
+            </w:pPr>
+            <w:r>
+              <w:rPr>
+                <w:rFonts w:ascii="Roboto" w:cs="Roboto" w:eastAsia="Roboto" w:hAnsi="Roboto"/>
+                <w:color w:val="1A1A1A"/>
+                <w:sz w:val="18"/>
+                <w:szCs w:val="18"/>
+              </w:rPr>
+              <w:t xml:space="preserve">Se abre Google Maps con el destino.</w:t>
+            </w:r>
+          </w:p>
+        </w:tc>
+        <w:tc>
+          <w:tcPr>
+            <w:tcW w:type="dxa" w:w="3672"/>
+            <w:tcBorders>
+              <w:top w:val="single" w:color="C9C9C9" w:sz="4"/>
+              <w:left w:val="single" w:color="C9C9C9" w:sz="4"/>
+              <w:bottom w:val="single" w:color="C9C9C9" w:sz="4"/>
+              <w:right w:val="single" w:color="C9C9C9" w:sz="4"/>
+            </w:tcBorders>
+            <w:shd w:fill="FFFFFF" w:color="auto" w:val="clear"/>
+            <w:tcMar>
+              <w:top w:type="dxa" w:w="70"/>
+              <w:left w:type="dxa" w:w="100"/>
+              <w:bottom w:type="dxa" w:w="70"/>
+              <w:right w:type="dxa" w:w="100"/>
+            </w:tcMar>
+            <w:vAlign w:val="top"/>
+          </w:tcPr>
+          <w:p>
+            <w:pPr>
+              <w:spacing w:after="30" w:line="250"/>
+              <w:jc w:val="left"/>
+            </w:pPr>
+            <w:r>
+              <w:rPr>
+                <w:rFonts w:ascii="Roboto" w:cs="Roboto" w:eastAsia="Roboto" w:hAnsi="Roboto"/>
+                <w:color w:val="1A1A1A"/>
+                <w:sz w:val="18"/>
+                <w:szCs w:val="18"/>
+              </w:rPr>
+              <w:t xml:space="preserve">Igual que en la guía general.</w:t>
+            </w:r>
+          </w:p>
+        </w:tc>
+      </w:tr>
+      <w:tr>
+        <w:trPr>
+          <w:cantSplit/>
+        </w:trPr>
+        <w:tc>
+          <w:tcPr>
+            <w:tcW w:type="dxa" w:w="500"/>
+            <w:tcBorders>
+              <w:top w:val="single" w:color="C9C9C9" w:sz="4"/>
+              <w:left w:val="single" w:color="C9C9C9" w:sz="4"/>
+              <w:bottom w:val="single" w:color="C9C9C9" w:sz="4"/>
+              <w:right w:val="single" w:color="C9C9C9" w:sz="4"/>
+            </w:tcBorders>
+            <w:shd w:fill="F7F1F3" w:color="auto" w:val="clear"/>
+            <w:tcMar>
+              <w:top w:type="dxa" w:w="70"/>
+              <w:left w:type="dxa" w:w="100"/>
+              <w:bottom w:type="dxa" w:w="70"/>
+              <w:right w:type="dxa" w:w="100"/>
+            </w:tcMar>
+            <w:vAlign w:val="top"/>
+          </w:tcPr>
+          <w:p>
+            <w:pPr>
+              <w:spacing w:after="30" w:line="250"/>
+              <w:jc w:val="left"/>
+            </w:pPr>
+            <w:r>
+              <w:rPr>
+                <w:rFonts w:ascii="Roboto" w:cs="Roboto" w:eastAsia="Roboto" w:hAnsi="Roboto"/>
+                <w:color w:val="1A1A1A"/>
+                <w:sz w:val="18"/>
+                <w:szCs w:val="18"/>
+              </w:rPr>
+              <w:t xml:space="preserve">6</w:t>
+            </w:r>
+          </w:p>
+        </w:tc>
+        <w:tc>
+          <w:tcPr>
+            <w:tcW w:type="dxa" w:w="3300"/>
+            <w:tcBorders>
+              <w:top w:val="single" w:color="C9C9C9" w:sz="4"/>
+              <w:left w:val="single" w:color="C9C9C9" w:sz="4"/>
+              <w:bottom w:val="single" w:color="C9C9C9" w:sz="4"/>
+              <w:right w:val="single" w:color="C9C9C9" w:sz="4"/>
+            </w:tcBorders>
+            <w:shd w:fill="F7F1F3" w:color="auto" w:val="clear"/>
+            <w:tcMar>
+              <w:top w:type="dxa" w:w="70"/>
+              <w:left w:type="dxa" w:w="100"/>
+              <w:bottom w:type="dxa" w:w="70"/>
+              <w:right w:type="dxa" w:w="100"/>
+            </w:tcMar>
+            <w:vAlign w:val="top"/>
+          </w:tcPr>
+          <w:p>
+            <w:pPr>
+              <w:spacing w:after="30" w:line="250"/>
+              <w:jc w:val="left"/>
+            </w:pPr>
+            <w:r>
+              <w:rPr>
+                <w:rFonts w:ascii="Roboto" w:cs="Roboto" w:eastAsia="Roboto" w:hAnsi="Roboto"/>
+                <w:color w:val="1A1A1A"/>
+                <w:sz w:val="18"/>
+                <w:szCs w:val="18"/>
+              </w:rPr>
+              <w:t xml:space="preserve">Pon la imagen de satélite como fondo del mapa y deja a la vista solo las prioridades Muy Alta y Alta.</w:t>
+            </w:r>
+          </w:p>
+        </w:tc>
+        <w:tc>
+          <w:tcPr>
+            <w:tcW w:type="dxa" w:w="2500"/>
+            <w:tcBorders>
+              <w:top w:val="single" w:color="C9C9C9" w:sz="4"/>
+              <w:left w:val="single" w:color="C9C9C9" w:sz="4"/>
+              <w:bottom w:val="single" w:color="C9C9C9" w:sz="4"/>
+              <w:right w:val="single" w:color="C9C9C9" w:sz="4"/>
+            </w:tcBorders>
+            <w:shd w:fill="F7F1F3" w:color="auto" w:val="clear"/>
+            <w:tcMar>
+              <w:top w:type="dxa" w:w="70"/>
+              <w:left w:type="dxa" w:w="100"/>
+              <w:bottom w:type="dxa" w:w="70"/>
+              <w:right w:type="dxa" w:w="100"/>
+            </w:tcMar>
+            <w:vAlign w:val="top"/>
+          </w:tcPr>
+          <w:p>
+            <w:pPr>
+              <w:spacing w:after="30" w:line="250"/>
+              <w:jc w:val="left"/>
+            </w:pPr>
+            <w:r>
+              <w:rPr>
+                <w:rFonts w:ascii="Roboto" w:cs="Roboto" w:eastAsia="Roboto" w:hAnsi="Roboto"/>
+                <w:color w:val="1A1A1A"/>
+                <w:sz w:val="18"/>
+                <w:szCs w:val="18"/>
+              </w:rPr>
+              <w:t xml:space="preserve">El mapa muestra el satélite y solo dos prioridades.</w:t>
+            </w:r>
+          </w:p>
+        </w:tc>
+        <w:tc>
+          <w:tcPr>
+            <w:tcW w:type="dxa" w:w="3672"/>
+            <w:tcBorders>
+              <w:top w:val="single" w:color="C9C9C9" w:sz="4"/>
+              <w:left w:val="single" w:color="C9C9C9" w:sz="4"/>
+              <w:bottom w:val="single" w:color="C9C9C9" w:sz="4"/>
+              <w:right w:val="single" w:color="C9C9C9" w:sz="4"/>
+            </w:tcBorders>
+            <w:shd w:fill="F7F1F3" w:color="auto" w:val="clear"/>
+            <w:tcMar>
+              <w:top w:type="dxa" w:w="70"/>
+              <w:left w:type="dxa" w:w="100"/>
+              <w:bottom w:type="dxa" w:w="70"/>
+              <w:right w:type="dxa" w:w="100"/>
+            </w:tcMar>
+            <w:vAlign w:val="top"/>
+          </w:tcPr>
+          <w:p>
+            <w:pPr>
+              <w:spacing w:after="30" w:line="250"/>
+              <w:jc w:val="left"/>
+            </w:pPr>
+            <w:r>
+              <w:rPr>
+                <w:rFonts w:ascii="Roboto" w:cs="Roboto" w:eastAsia="Roboto" w:hAnsi="Roboto"/>
+                <w:color w:val="1A1A1A"/>
+                <w:sz w:val="18"/>
+                <w:szCs w:val="18"/>
+              </w:rPr>
+              <w:t xml:space="preserve">Igual que en la guía general.</w:t>
+            </w:r>
+          </w:p>
+        </w:tc>
+      </w:tr>
+      <w:tr>
+        <w:trPr>
+          <w:cantSplit/>
+        </w:trPr>
+        <w:tc>
+          <w:tcPr>
+            <w:tcW w:type="dxa" w:w="500"/>
+            <w:tcBorders>
+              <w:top w:val="single" w:color="C9C9C9" w:sz="4"/>
+              <w:left w:val="single" w:color="C9C9C9" w:sz="4"/>
+              <w:bottom w:val="single" w:color="C9C9C9" w:sz="4"/>
+              <w:right w:val="single" w:color="C9C9C9" w:sz="4"/>
+            </w:tcBorders>
+            <w:shd w:fill="FFFFFF" w:color="auto" w:val="clear"/>
+            <w:tcMar>
+              <w:top w:type="dxa" w:w="70"/>
+              <w:left w:type="dxa" w:w="100"/>
+              <w:bottom w:type="dxa" w:w="70"/>
+              <w:right w:type="dxa" w:w="100"/>
+            </w:tcMar>
+            <w:vAlign w:val="top"/>
+          </w:tcPr>
+          <w:p>
+            <w:pPr>
+              <w:spacing w:after="30" w:line="250"/>
+              <w:jc w:val="left"/>
+            </w:pPr>
+            <w:r>
+              <w:rPr>
+                <w:rFonts w:ascii="Roboto" w:cs="Roboto" w:eastAsia="Roboto" w:hAnsi="Roboto"/>
+                <w:color w:val="1A1A1A"/>
+                <w:sz w:val="18"/>
+                <w:szCs w:val="18"/>
+              </w:rPr>
+              <w:t xml:space="preserve">7</w:t>
+            </w:r>
+          </w:p>
+        </w:tc>
+        <w:tc>
+          <w:tcPr>
+            <w:tcW w:type="dxa" w:w="3300"/>
+            <w:tcBorders>
+              <w:top w:val="single" w:color="C9C9C9" w:sz="4"/>
+              <w:left w:val="single" w:color="C9C9C9" w:sz="4"/>
+              <w:bottom w:val="single" w:color="C9C9C9" w:sz="4"/>
+              <w:right w:val="single" w:color="C9C9C9" w:sz="4"/>
+            </w:tcBorders>
+            <w:shd w:fill="FFFFFF" w:color="auto" w:val="clear"/>
+            <w:tcMar>
+              <w:top w:type="dxa" w:w="70"/>
+              <w:left w:type="dxa" w:w="100"/>
+              <w:bottom w:type="dxa" w:w="70"/>
+              <w:right w:type="dxa" w:w="100"/>
+            </w:tcMar>
+            <w:vAlign w:val="top"/>
+          </w:tcPr>
+          <w:p>
+            <w:pPr>
+              <w:spacing w:after="30" w:line="250"/>
+              <w:jc w:val="left"/>
+            </w:pPr>
+            <w:r>
+              <w:rPr>
+                <w:rFonts w:ascii="Roboto" w:cs="Roboto" w:eastAsia="Roboto" w:hAnsi="Roboto"/>
+                <w:color w:val="1A1A1A"/>
+                <w:sz w:val="18"/>
+                <w:szCs w:val="18"/>
+              </w:rPr>
+              <w:t xml:space="preserve">Descarga el Excel de tramos prioritarios y la ficha PDF de la avenida, y ábrelos en tu teléfono.</w:t>
+            </w:r>
+          </w:p>
+        </w:tc>
+        <w:tc>
+          <w:tcPr>
+            <w:tcW w:type="dxa" w:w="2500"/>
+            <w:tcBorders>
+              <w:top w:val="single" w:color="C9C9C9" w:sz="4"/>
+              <w:left w:val="single" w:color="C9C9C9" w:sz="4"/>
+              <w:bottom w:val="single" w:color="C9C9C9" w:sz="4"/>
+              <w:right w:val="single" w:color="C9C9C9" w:sz="4"/>
+            </w:tcBorders>
+            <w:shd w:fill="FFFFFF" w:color="auto" w:val="clear"/>
+            <w:tcMar>
+              <w:top w:type="dxa" w:w="70"/>
+              <w:left w:type="dxa" w:w="100"/>
+              <w:bottom w:type="dxa" w:w="70"/>
+              <w:right w:type="dxa" w:w="100"/>
+            </w:tcMar>
+            <w:vAlign w:val="top"/>
+          </w:tcPr>
+          <w:p>
+            <w:pPr>
+              <w:spacing w:after="30" w:line="250"/>
+              <w:jc w:val="left"/>
+            </w:pPr>
+            <w:r>
+              <w:rPr>
+                <w:rFonts w:ascii="Roboto" w:cs="Roboto" w:eastAsia="Roboto" w:hAnsi="Roboto"/>
+                <w:color w:val="1A1A1A"/>
+                <w:sz w:val="18"/>
+                <w:szCs w:val="18"/>
+              </w:rPr>
+              <w:t xml:space="preserve">Ambos archivos se abren y son de la avenida consultada.</w:t>
+            </w:r>
+          </w:p>
+        </w:tc>
+        <w:tc>
+          <w:tcPr>
+            <w:tcW w:type="dxa" w:w="3672"/>
+            <w:tcBorders>
+              <w:top w:val="single" w:color="C9C9C9" w:sz="4"/>
+              <w:left w:val="single" w:color="C9C9C9" w:sz="4"/>
+              <w:bottom w:val="single" w:color="C9C9C9" w:sz="4"/>
+              <w:right w:val="single" w:color="C9C9C9" w:sz="4"/>
+            </w:tcBorders>
+            <w:shd w:fill="FFFFFF" w:color="auto" w:val="clear"/>
+            <w:tcMar>
+              <w:top w:type="dxa" w:w="70"/>
+              <w:left w:type="dxa" w:w="100"/>
+              <w:bottom w:type="dxa" w:w="70"/>
+              <w:right w:type="dxa" w:w="100"/>
+            </w:tcMar>
+            <w:vAlign w:val="top"/>
+          </w:tcPr>
+          <w:p>
+            <w:pPr>
+              <w:spacing w:after="30" w:line="250"/>
+              <w:jc w:val="left"/>
+            </w:pPr>
+            <w:r>
+              <w:rPr>
+                <w:rFonts w:ascii="Roboto" w:cs="Roboto" w:eastAsia="Roboto" w:hAnsi="Roboto"/>
+                <w:color w:val="1A1A1A"/>
+                <w:sz w:val="18"/>
+                <w:szCs w:val="18"/>
+              </w:rPr>
+              <w:t xml:space="preserve">Si el Excel se lee en el teléfono. Si la ficha le sirve para campo. Si pregunta por los archivos «para abrir en un mapa».</w:t>
+            </w:r>
+          </w:p>
+        </w:tc>
+      </w:tr>
+      <w:tr>
+        <w:trPr>
+          <w:cantSplit/>
+        </w:trPr>
+        <w:tc>
+          <w:tcPr>
+            <w:tcW w:type="dxa" w:w="500"/>
+            <w:tcBorders>
+              <w:top w:val="single" w:color="C9C9C9" w:sz="4"/>
+              <w:left w:val="single" w:color="C9C9C9" w:sz="4"/>
+              <w:bottom w:val="single" w:color="C9C9C9" w:sz="4"/>
+              <w:right w:val="single" w:color="C9C9C9" w:sz="4"/>
+            </w:tcBorders>
+            <w:shd w:fill="F7F1F3" w:color="auto" w:val="clear"/>
+            <w:tcMar>
+              <w:top w:type="dxa" w:w="70"/>
+              <w:left w:type="dxa" w:w="100"/>
+              <w:bottom w:type="dxa" w:w="70"/>
+              <w:right w:type="dxa" w:w="100"/>
+            </w:tcMar>
+            <w:vAlign w:val="top"/>
+          </w:tcPr>
+          <w:p>
+            <w:pPr>
+              <w:spacing w:after="30" w:line="250"/>
+              <w:jc w:val="left"/>
+            </w:pPr>
+            <w:r>
+              <w:rPr>
+                <w:rFonts w:ascii="Roboto" w:cs="Roboto" w:eastAsia="Roboto" w:hAnsi="Roboto"/>
+                <w:color w:val="1A1A1A"/>
+                <w:sz w:val="18"/>
+                <w:szCs w:val="18"/>
+              </w:rPr>
+              <w:t xml:space="preserve">8</w:t>
+            </w:r>
+          </w:p>
+        </w:tc>
+        <w:tc>
+          <w:tcPr>
+            <w:tcW w:type="dxa" w:w="3300"/>
+            <w:tcBorders>
+              <w:top w:val="single" w:color="C9C9C9" w:sz="4"/>
+              <w:left w:val="single" w:color="C9C9C9" w:sz="4"/>
+              <w:bottom w:val="single" w:color="C9C9C9" w:sz="4"/>
+              <w:right w:val="single" w:color="C9C9C9" w:sz="4"/>
+            </w:tcBorders>
+            <w:shd w:fill="F7F1F3" w:color="auto" w:val="clear"/>
+            <w:tcMar>
+              <w:top w:type="dxa" w:w="70"/>
+              <w:left w:type="dxa" w:w="100"/>
+              <w:bottom w:type="dxa" w:w="70"/>
+              <w:right w:type="dxa" w:w="100"/>
+            </w:tcMar>
+            <w:vAlign w:val="top"/>
+          </w:tcPr>
+          <w:p>
+            <w:pPr>
+              <w:spacing w:after="30" w:line="250"/>
+              <w:jc w:val="left"/>
+            </w:pPr>
+            <w:r>
+              <w:rPr>
+                <w:rFonts w:ascii="Roboto" w:cs="Roboto" w:eastAsia="Roboto" w:hAnsi="Roboto"/>
+                <w:color w:val="1A1A1A"/>
+                <w:sz w:val="18"/>
+                <w:szCs w:val="18"/>
+              </w:rPr>
+              <w:t xml:space="preserve">Ya en la calle: usa tu ubicación en el mapa y dime cuál es la calle prioritaria más cercana a ti y a cuántos metros está.</w:t>
+            </w:r>
+          </w:p>
+        </w:tc>
+        <w:tc>
+          <w:tcPr>
+            <w:tcW w:type="dxa" w:w="2500"/>
+            <w:tcBorders>
+              <w:top w:val="single" w:color="C9C9C9" w:sz="4"/>
+              <w:left w:val="single" w:color="C9C9C9" w:sz="4"/>
+              <w:bottom w:val="single" w:color="C9C9C9" w:sz="4"/>
+              <w:right w:val="single" w:color="C9C9C9" w:sz="4"/>
+            </w:tcBorders>
+            <w:shd w:fill="F7F1F3" w:color="auto" w:val="clear"/>
+            <w:tcMar>
+              <w:top w:type="dxa" w:w="70"/>
+              <w:left w:type="dxa" w:w="100"/>
+              <w:bottom w:type="dxa" w:w="70"/>
+              <w:right w:type="dxa" w:w="100"/>
+            </w:tcMar>
+            <w:vAlign w:val="top"/>
+          </w:tcPr>
+          <w:p>
+            <w:pPr>
+              <w:spacing w:after="30" w:line="250"/>
+              <w:jc w:val="left"/>
+            </w:pPr>
+            <w:r>
+              <w:rPr>
+                <w:rFonts w:ascii="Roboto" w:cs="Roboto" w:eastAsia="Roboto" w:hAnsi="Roboto"/>
+                <w:color w:val="1A1A1A"/>
+                <w:sz w:val="18"/>
+                <w:szCs w:val="18"/>
+              </w:rPr>
+              <w:t xml:space="preserve">Nombra la calle y la distancia que muestra la herramienta.</w:t>
+            </w:r>
+          </w:p>
+        </w:tc>
+        <w:tc>
+          <w:tcPr>
+            <w:tcW w:type="dxa" w:w="3672"/>
+            <w:tcBorders>
+              <w:top w:val="single" w:color="C9C9C9" w:sz="4"/>
+              <w:left w:val="single" w:color="C9C9C9" w:sz="4"/>
+              <w:bottom w:val="single" w:color="C9C9C9" w:sz="4"/>
+              <w:right w:val="single" w:color="C9C9C9" w:sz="4"/>
+            </w:tcBorders>
+            <w:shd w:fill="F7F1F3" w:color="auto" w:val="clear"/>
+            <w:tcMar>
+              <w:top w:type="dxa" w:w="70"/>
+              <w:left w:type="dxa" w:w="100"/>
+              <w:bottom w:type="dxa" w:w="70"/>
+              <w:right w:type="dxa" w:w="100"/>
+            </w:tcMar>
+            <w:vAlign w:val="top"/>
+          </w:tcPr>
+          <w:p>
+            <w:pPr>
+              <w:spacing w:after="30" w:line="250"/>
+              <w:jc w:val="left"/>
+            </w:pPr>
+            <w:r>
+              <w:rPr>
+                <w:rFonts w:ascii="Roboto" w:cs="Roboto" w:eastAsia="Roboto" w:hAnsi="Roboto"/>
+                <w:color w:val="1A1A1A"/>
+                <w:sz w:val="18"/>
+                <w:szCs w:val="18"/>
+              </w:rPr>
+              <w:t xml:space="preserve">Igual que en la guía general.</w:t>
+            </w:r>
+          </w:p>
+        </w:tc>
+      </w:tr>
+    </w:tbl>
+    <w:p>
+      <w:pPr>
+        <w:spacing w:after="200" w:before="70" w:line="220"/>
+      </w:pPr>
+      <w:r>
+        <w:rPr>
+          <w:rFonts w:ascii="Roboto" w:cs="Roboto" w:eastAsia="Roboto" w:hAnsi="Roboto"/>
+          <w:i/>
+          <w:iCs/>
+          <w:color w:val="55585A"/>
+          <w:sz w:val="16"/>
+          <w:szCs w:val="16"/>
+        </w:rPr>
+        <w:t xml:space="preserve">Nota: las vialidades primarias y de acceso controlado corresponden al Gobierno de la Ciudad. La asignación de cada frente a la alcaldía o al Gobierno Central es preliminar; la herramienta lo advierte.</w:t>
       </w:r>
     </w:p>
     <w:p>
@@ -2705,7 +4082,7 @@
           <w:sz w:val="19"/>
           <w:szCs w:val="19"/>
         </w:rPr>
-        <w:t xml:space="preserve">Tabla 3. </w:t>
+        <w:t xml:space="preserve">Tabla 4. </w:t>
       </w:r>
       <w:r>
         <w:rPr>
@@ -3461,7 +4838,7 @@
           <w:sz w:val="16"/>
           <w:szCs w:val="16"/>
         </w:rPr>
-        <w:t xml:space="preserve">Nota: «con ayuda» y «no lo logró» cuentan como no cumplida sin ayuda. Una tarea registrada como «no aplicable por red» no entra en la proporción.</w:t>
+        <w:t xml:space="preserve">Nota: «con ayuda» y «no lo logró» cuentan como no cumplida sin ayuda. Una tarea registrada como «no aplicable por red» no entra en la proporción. La proporción se calcula con las personas de alcaldías; las dos del Gobierno Central se registran aparte y, por ser dos, cualquier tarea que alguna no cumpla sin ayuda se revisa.</w:t>
       </w:r>
     </w:p>
     <w:p>
@@ -3478,7 +4855,7 @@
           <w:sz w:val="19"/>
           <w:szCs w:val="19"/>
         </w:rPr>
-        <w:t xml:space="preserve">Tabla 4. </w:t>
+        <w:t xml:space="preserve">Tabla 5. </w:t>
       </w:r>
       <w:r>
         <w:rPr>
@@ -3946,7 +5323,7 @@
           <w:sz w:val="20"/>
           <w:szCs w:val="20"/>
         </w:rPr>
-        <w:t xml:space="preserve">Capturas de la versión 17.29 en un teléfono de 390 × 844. Sirven para que el moderador reconozca a qué pantalla debe llegar la persona en cada tarea; no se muestran al participante.</w:t>
+        <w:t xml:space="preserve">Capturas de la versión 17.30 en un teléfono de 390 × 844. Sirven para que el moderador reconozca a qué pantalla debe llegar la persona en cada tarea; no se muestran al participante.</w:t>
       </w:r>
     </w:p>
     <w:tbl>
@@ -4055,7 +5432,7 @@
                 <w:sz w:val="17"/>
                 <w:szCs w:val="17"/>
               </w:rPr>
-              <w:t xml:space="preserve"> Tarea 1: ventana de entrada con las 16 alcaldías.</w:t>
+              <w:t xml:space="preserve"> Tarea 1: primer paso de la entrada, «¿Qué quieres consultar?».</w:t>
             </w:r>
           </w:p>
         </w:tc>
@@ -4144,7 +5521,7 @@
                 <w:sz w:val="17"/>
                 <w:szCs w:val="17"/>
               </w:rPr>
-              <w:t xml:space="preserve"> Tarea 1: alcaldía elegida; leyenda compacta sobre el mapa y pestañas en la hoja inferior.</w:t>
+              <w:t xml:space="preserve"> Tarea 1: segundo paso, con las 16 alcaldías.</w:t>
             </w:r>
           </w:p>
         </w:tc>
@@ -4233,7 +5610,7 @@
                 <w:sz w:val="17"/>
                 <w:szCs w:val="17"/>
               </w:rPr>
-              <w:t xml:space="preserve"> Tarea 2: «Dónde empezar» con las colonias numeradas y «Ordenar por».</w:t>
+              <w:t xml:space="preserve"> Alcaldía elegida: leyenda compacta sobre el mapa y pestañas en la hoja inferior.</w:t>
             </w:r>
           </w:p>
         </w:tc>
@@ -4266,7 +5643,7 @@
           <w:sz w:val="18"/>
           <w:szCs w:val="18"/>
         </w:rPr>
-        <w:t xml:space="preserve">Entrada por territorio, alcaldía elegida y pestaña «Dónde empezar». </w:t>
+        <w:t xml:space="preserve">Entrada en dos pasos y alcaldía elegida. </w:t>
       </w:r>
       <w:r>
         <w:rPr>
@@ -4277,7 +5654,7 @@
           <w:sz w:val="18"/>
           <w:szCs w:val="18"/>
         </w:rPr>
-        <w:t xml:space="preserve">Fuente: herramienta «Calles prioritarias para reforestar», versión 17.29, teléfono simulado de 390 × 844, 4 de octubre de 2026.</w:t>
+        <w:t xml:space="preserve">Fuente: herramienta «Calles prioritarias para reforestar», versión 17.30, teléfono simulado de 390 × 844, 4 de octubre de 2026.</w:t>
       </w:r>
     </w:p>
     <w:tbl>
@@ -4386,7 +5763,7 @@
                 <w:sz w:val="17"/>
                 <w:szCs w:val="17"/>
               </w:rPr>
-              <w:t xml:space="preserve"> Tarea 3: pestaña «Resumen» con las cifras de la alcaldía.</w:t>
+              <w:t xml:space="preserve"> Tarea 2: «Dónde empezar» con las colonias numeradas y «Ordenar por».</w:t>
             </w:r>
           </w:p>
         </w:tc>
@@ -4475,7 +5852,7 @@
                 <w:sz w:val="17"/>
                 <w:szCs w:val="17"/>
               </w:rPr>
-              <w:t xml:space="preserve"> Tarea 4: colonia elegida; «Dónde empezar» muestra sus calles.</w:t>
+              <w:t xml:space="preserve"> Tarea 3: pestaña «Resumen» con las cifras de la alcaldía.</w:t>
             </w:r>
           </w:p>
         </w:tc>
@@ -4564,7 +5941,7 @@
                 <w:sz w:val="17"/>
                 <w:szCs w:val="17"/>
               </w:rPr>
-              <w:t xml:space="preserve"> Tarea 4: pestaña «Calles» con los tramos de la calle consultada.</w:t>
+              <w:t xml:space="preserve"> Tarea 4: colonia elegida; «Dónde empezar» muestra sus calles.</w:t>
             </w:r>
           </w:p>
         </w:tc>
@@ -4597,7 +5974,7 @@
           <w:sz w:val="18"/>
           <w:szCs w:val="18"/>
         </w:rPr>
-        <w:t xml:space="preserve">Cifras de la alcaldía, calles de una colonia y tramos de la calle consultada. </w:t>
+        <w:t xml:space="preserve">Colonias por atender, cifras de la alcaldía y calles de una colonia. </w:t>
       </w:r>
       <w:r>
         <w:rPr>
@@ -4608,7 +5985,7 @@
           <w:sz w:val="18"/>
           <w:szCs w:val="18"/>
         </w:rPr>
-        <w:t xml:space="preserve">Fuente: herramienta «Calles prioritarias para reforestar», versión 17.29, teléfono simulado de 390 × 844, 4 de octubre de 2026.</w:t>
+        <w:t xml:space="preserve">Fuente: herramienta «Calles prioritarias para reforestar», versión 17.30, teléfono simulado de 390 × 844, 4 de octubre de 2026.</w:t>
       </w:r>
     </w:p>
     <w:tbl>
@@ -4717,7 +6094,7 @@
                 <w:sz w:val="17"/>
                 <w:szCs w:val="17"/>
               </w:rPr>
-              <w:t xml:space="preserve"> Tarea 6: panel de capas, con «Quién atiende», mapa de fondo y prioridades.</w:t>
+              <w:t xml:space="preserve"> Tarea 4: pestaña «Calles» con los tramos de la calle consultada.</w:t>
             </w:r>
           </w:p>
         </w:tc>
@@ -4806,7 +6183,7 @@
                 <w:sz w:val="17"/>
                 <w:szCs w:val="17"/>
               </w:rPr>
-              <w:t xml:space="preserve"> Tarea 7: pestaña «Descargas», con los archivos para abrir en un mapa.</w:t>
+              <w:t xml:space="preserve"> Tarea 6: panel de capas, con mapa de fondo y prioridades.</w:t>
             </w:r>
           </w:p>
         </w:tc>
@@ -4895,7 +6272,7 @@
                 <w:sz w:val="17"/>
                 <w:szCs w:val="17"/>
               </w:rPr>
-              <w:t xml:space="preserve"> Tarea 8: Mi ubicación y calles prioritarias cercanas.</w:t>
+              <w:t xml:space="preserve"> Tarea 7: pestaña «Descargas», con los archivos para abrir en un mapa.</w:t>
             </w:r>
           </w:p>
         </w:tc>
@@ -4928,7 +6305,7 @@
           <w:sz w:val="18"/>
           <w:szCs w:val="18"/>
         </w:rPr>
-        <w:t xml:space="preserve">Capas, descargas y Mi ubicación. Las capturas muestran la etiqueta «Modo ligero», propia de equipos sin aceleración gráfica; en un teléfono con aceleración no aparece y el mapa se ve completo. </w:t>
+        <w:t xml:space="preserve">Tramos de la calle consultada, capas y descargas. </w:t>
       </w:r>
       <w:r>
         <w:rPr>
@@ -4939,7 +6316,338 @@
           <w:sz w:val="18"/>
           <w:szCs w:val="18"/>
         </w:rPr>
-        <w:t xml:space="preserve">Fuente: herramienta «Calles prioritarias para reforestar», versión 17.29, teléfono simulado de 390 × 844, 4 de octubre de 2026.</w:t>
+        <w:t xml:space="preserve">Fuente: herramienta «Calles prioritarias para reforestar», versión 17.30, teléfono simulado de 390 × 844, 4 de octubre de 2026.</w:t>
+      </w:r>
+    </w:p>
+    <w:tbl>
+      <w:tblPr>
+        <w:tblW w:type="dxa" w:w="9972"/>
+        <w:tblBorders>
+          <w:top w:val="none" w:color="FFFFFF" w:sz="0"/>
+          <w:left w:val="none" w:color="FFFFFF" w:sz="0"/>
+          <w:bottom w:val="none" w:color="FFFFFF" w:sz="0"/>
+          <w:right w:val="none" w:color="FFFFFF" w:sz="0"/>
+          <w:insideH w:val="none" w:color="FFFFFF" w:sz="0"/>
+          <w:insideV w:val="none" w:color="FFFFFF" w:sz="0"/>
+        </w:tblBorders>
+      </w:tblPr>
+      <w:tblGrid>
+        <w:gridCol w:w="3324"/>
+        <w:gridCol w:w="3324"/>
+        <w:gridCol w:w="3324"/>
+      </w:tblGrid>
+      <w:tr>
+        <w:trPr>
+          <w:cantSplit/>
+        </w:trPr>
+        <w:tc>
+          <w:tcPr>
+            <w:tcW w:type="dxa" w:w="3324"/>
+            <w:tcBorders>
+              <w:top w:val="none" w:color="FFFFFF" w:sz="0"/>
+              <w:left w:val="none" w:color="FFFFFF" w:sz="0"/>
+              <w:bottom w:val="none" w:color="FFFFFF" w:sz="0"/>
+              <w:right w:val="none" w:color="FFFFFF" w:sz="0"/>
+            </w:tcBorders>
+            <w:tcMar>
+              <w:top w:type="dxa" w:w="40"/>
+              <w:left w:type="dxa" w:w="60"/>
+              <w:bottom w:type="dxa" w:w="40"/>
+              <w:right w:type="dxa" w:w="60"/>
+            </w:tcMar>
+          </w:tcPr>
+          <w:p>
+            <w:pPr>
+              <w:spacing w:after="40"/>
+              <w:jc w:val="center"/>
+            </w:pPr>
+            <w:r>
+              <w:drawing>
+                <wp:inline distT="0" distB="0" distL="0" distR="0">
+                  <wp:extent cx="1314450" cy="2847975"/>
+                  <wp:effectExtent t="0" r="0" b="0" l="0"/>
+                  <wp:docPr id="1" name="" descr="" title=""/>
+                  <wp:cNvGraphicFramePr>
+                    <a:graphicFrameLocks xmlns:a="http://schemas.openxmlformats.org/drawingml/2006/main" noChangeAspect="1"/>
+                  </wp:cNvGraphicFramePr>
+                  <a:graphic xmlns:a="http://schemas.openxmlformats.org/drawingml/2006/main">
+                    <a:graphicData uri="http://schemas.openxmlformats.org/drawingml/2006/picture">
+                      <pic:pic xmlns:pic="http://schemas.openxmlformats.org/drawingml/2006/picture">
+                        <pic:nvPicPr>
+                          <pic:cNvPr id="0" name="" descr=""/>
+                          <pic:cNvPicPr>
+                            <a:picLocks noChangeAspect="1" noChangeArrowheads="1"/>
+                          </pic:cNvPicPr>
+                        </pic:nvPicPr>
+                        <pic:blipFill>
+                          <a:blip r:embed="rId20" cstate="none"/>
+                          <a:srcRect/>
+                          <a:stretch>
+                            <a:fillRect/>
+                          </a:stretch>
+                        </pic:blipFill>
+                        <pic:spPr bwMode="auto">
+                          <a:xfrm>
+                            <a:off x="0" y="0"/>
+                            <a:ext cx="1314450" cy="2847975"/>
+                          </a:xfrm>
+                          <a:prstGeom prst="rect">
+                            <a:avLst/>
+                          </a:prstGeom>
+                        </pic:spPr>
+                      </pic:pic>
+                    </a:graphicData>
+                  </a:graphic>
+                </wp:inline>
+              </w:drawing>
+            </w:r>
+          </w:p>
+          <w:p>
+            <w:pPr>
+              <w:spacing w:after="0" w:line="230"/>
+              <w:jc w:val="center"/>
+            </w:pPr>
+            <w:r>
+              <w:rPr>
+                <w:rFonts w:ascii="Roboto" w:cs="Roboto" w:eastAsia="Roboto" w:hAnsi="Roboto"/>
+                <w:b/>
+                <w:bCs/>
+                <w:color w:val="55585A"/>
+                <w:sz w:val="17"/>
+                <w:szCs w:val="17"/>
+              </w:rPr>
+              <w:t xml:space="preserve">j)</w:t>
+            </w:r>
+            <w:r>
+              <w:rPr>
+                <w:rFonts w:ascii="Roboto" w:cs="Roboto" w:eastAsia="Roboto" w:hAnsi="Roboto"/>
+                <w:color w:val="55585A"/>
+                <w:sz w:val="17"/>
+                <w:szCs w:val="17"/>
+              </w:rPr>
+              <w:t xml:space="preserve"> Tarea 8: Mi ubicación y calles prioritarias cercanas.</w:t>
+            </w:r>
+          </w:p>
+        </w:tc>
+        <w:tc>
+          <w:tcPr>
+            <w:tcW w:type="dxa" w:w="3324"/>
+            <w:tcBorders>
+              <w:top w:val="none" w:color="FFFFFF" w:sz="0"/>
+              <w:left w:val="none" w:color="FFFFFF" w:sz="0"/>
+              <w:bottom w:val="none" w:color="FFFFFF" w:sz="0"/>
+              <w:right w:val="none" w:color="FFFFFF" w:sz="0"/>
+            </w:tcBorders>
+            <w:tcMar>
+              <w:top w:type="dxa" w:w="40"/>
+              <w:left w:type="dxa" w:w="60"/>
+              <w:bottom w:type="dxa" w:w="40"/>
+              <w:right w:type="dxa" w:w="60"/>
+            </w:tcMar>
+          </w:tcPr>
+          <w:p>
+            <w:pPr>
+              <w:spacing w:after="40"/>
+              <w:jc w:val="center"/>
+            </w:pPr>
+            <w:r>
+              <w:drawing>
+                <wp:inline distT="0" distB="0" distL="0" distR="0">
+                  <wp:extent cx="1314450" cy="2847975"/>
+                  <wp:effectExtent t="0" r="0" b="0" l="0"/>
+                  <wp:docPr id="1" name="" descr="" title=""/>
+                  <wp:cNvGraphicFramePr>
+                    <a:graphicFrameLocks xmlns:a="http://schemas.openxmlformats.org/drawingml/2006/main" noChangeAspect="1"/>
+                  </wp:cNvGraphicFramePr>
+                  <a:graphic xmlns:a="http://schemas.openxmlformats.org/drawingml/2006/main">
+                    <a:graphicData uri="http://schemas.openxmlformats.org/drawingml/2006/picture">
+                      <pic:pic xmlns:pic="http://schemas.openxmlformats.org/drawingml/2006/picture">
+                        <pic:nvPicPr>
+                          <pic:cNvPr id="0" name="" descr=""/>
+                          <pic:cNvPicPr>
+                            <a:picLocks noChangeAspect="1" noChangeArrowheads="1"/>
+                          </pic:cNvPicPr>
+                        </pic:nvPicPr>
+                        <pic:blipFill>
+                          <a:blip r:embed="rId21" cstate="none"/>
+                          <a:srcRect/>
+                          <a:stretch>
+                            <a:fillRect/>
+                          </a:stretch>
+                        </pic:blipFill>
+                        <pic:spPr bwMode="auto">
+                          <a:xfrm>
+                            <a:off x="0" y="0"/>
+                            <a:ext cx="1314450" cy="2847975"/>
+                          </a:xfrm>
+                          <a:prstGeom prst="rect">
+                            <a:avLst/>
+                          </a:prstGeom>
+                        </pic:spPr>
+                      </pic:pic>
+                    </a:graphicData>
+                  </a:graphic>
+                </wp:inline>
+              </w:drawing>
+            </w:r>
+          </w:p>
+          <w:p>
+            <w:pPr>
+              <w:spacing w:after="0" w:line="230"/>
+              <w:jc w:val="center"/>
+            </w:pPr>
+            <w:r>
+              <w:rPr>
+                <w:rFonts w:ascii="Roboto" w:cs="Roboto" w:eastAsia="Roboto" w:hAnsi="Roboto"/>
+                <w:b/>
+                <w:bCs/>
+                <w:color w:val="55585A"/>
+                <w:sz w:val="17"/>
+                <w:szCs w:val="17"/>
+              </w:rPr>
+              <w:t xml:space="preserve">k)</w:t>
+            </w:r>
+            <w:r>
+              <w:rPr>
+                <w:rFonts w:ascii="Roboto" w:cs="Roboto" w:eastAsia="Roboto" w:hAnsi="Roboto"/>
+                <w:color w:val="55585A"/>
+                <w:sz w:val="17"/>
+                <w:szCs w:val="17"/>
+              </w:rPr>
+              <w:t xml:space="preserve"> Gobierno Central, tarea 2: avenidas por atender en «Dónde empezar».</w:t>
+            </w:r>
+          </w:p>
+        </w:tc>
+        <w:tc>
+          <w:tcPr>
+            <w:tcW w:type="dxa" w:w="3324"/>
+            <w:tcBorders>
+              <w:top w:val="none" w:color="FFFFFF" w:sz="0"/>
+              <w:left w:val="none" w:color="FFFFFF" w:sz="0"/>
+              <w:bottom w:val="none" w:color="FFFFFF" w:sz="0"/>
+              <w:right w:val="none" w:color="FFFFFF" w:sz="0"/>
+            </w:tcBorders>
+            <w:tcMar>
+              <w:top w:type="dxa" w:w="40"/>
+              <w:left w:type="dxa" w:w="60"/>
+              <w:bottom w:type="dxa" w:w="40"/>
+              <w:right w:type="dxa" w:w="60"/>
+            </w:tcMar>
+          </w:tcPr>
+          <w:p>
+            <w:pPr>
+              <w:spacing w:after="40"/>
+              <w:jc w:val="center"/>
+            </w:pPr>
+            <w:r>
+              <w:drawing>
+                <wp:inline distT="0" distB="0" distL="0" distR="0">
+                  <wp:extent cx="1314450" cy="2847975"/>
+                  <wp:effectExtent t="0" r="0" b="0" l="0"/>
+                  <wp:docPr id="1" name="" descr="" title=""/>
+                  <wp:cNvGraphicFramePr>
+                    <a:graphicFrameLocks xmlns:a="http://schemas.openxmlformats.org/drawingml/2006/main" noChangeAspect="1"/>
+                  </wp:cNvGraphicFramePr>
+                  <a:graphic xmlns:a="http://schemas.openxmlformats.org/drawingml/2006/main">
+                    <a:graphicData uri="http://schemas.openxmlformats.org/drawingml/2006/picture">
+                      <pic:pic xmlns:pic="http://schemas.openxmlformats.org/drawingml/2006/picture">
+                        <pic:nvPicPr>
+                          <pic:cNvPr id="0" name="" descr=""/>
+                          <pic:cNvPicPr>
+                            <a:picLocks noChangeAspect="1" noChangeArrowheads="1"/>
+                          </pic:cNvPicPr>
+                        </pic:nvPicPr>
+                        <pic:blipFill>
+                          <a:blip r:embed="rId22" cstate="none"/>
+                          <a:srcRect/>
+                          <a:stretch>
+                            <a:fillRect/>
+                          </a:stretch>
+                        </pic:blipFill>
+                        <pic:spPr bwMode="auto">
+                          <a:xfrm>
+                            <a:off x="0" y="0"/>
+                            <a:ext cx="1314450" cy="2847975"/>
+                          </a:xfrm>
+                          <a:prstGeom prst="rect">
+                            <a:avLst/>
+                          </a:prstGeom>
+                        </pic:spPr>
+                      </pic:pic>
+                    </a:graphicData>
+                  </a:graphic>
+                </wp:inline>
+              </w:drawing>
+            </w:r>
+          </w:p>
+          <w:p>
+            <w:pPr>
+              <w:spacing w:after="0" w:line="230"/>
+              <w:jc w:val="center"/>
+            </w:pPr>
+            <w:r>
+              <w:rPr>
+                <w:rFonts w:ascii="Roboto" w:cs="Roboto" w:eastAsia="Roboto" w:hAnsi="Roboto"/>
+                <w:b/>
+                <w:bCs/>
+                <w:color w:val="55585A"/>
+                <w:sz w:val="17"/>
+                <w:szCs w:val="17"/>
+              </w:rPr>
+              <w:t xml:space="preserve">l)</w:t>
+            </w:r>
+            <w:r>
+              <w:rPr>
+                <w:rFonts w:ascii="Roboto" w:cs="Roboto" w:eastAsia="Roboto" w:hAnsi="Roboto"/>
+                <w:color w:val="55585A"/>
+                <w:sz w:val="17"/>
+                <w:szCs w:val="17"/>
+              </w:rPr>
+              <w:t xml:space="preserve"> Gobierno Central, tarea 4: avenida consultada y alcaldías que cruza.</w:t>
+            </w:r>
+          </w:p>
+        </w:tc>
+      </w:tr>
+    </w:tbl>
+    <w:p>
+      <w:pPr>
+        <w:spacing w:after="220" w:before="80" w:line="240"/>
+        <w:jc w:val="center"/>
+      </w:pPr>
+      <w:r>
+        <w:rPr>
+          <w:rFonts w:ascii="Roboto" w:cs="Roboto" w:eastAsia="Roboto" w:hAnsi="Roboto"/>
+          <w:b/>
+          <w:bCs/>
+          <w:i/>
+          <w:iCs/>
+          <w:color w:val="55585A"/>
+          <w:sz w:val="18"/>
+          <w:szCs w:val="18"/>
+        </w:rPr>
+        <w:t xml:space="preserve">Figura 4. </w:t>
+      </w:r>
+      <w:r>
+        <w:rPr>
+          <w:rFonts w:ascii="Roboto" w:cs="Roboto" w:eastAsia="Roboto" w:hAnsi="Roboto"/>
+          <w:i/>
+          <w:iCs/>
+          <w:color w:val="55585A"/>
+          <w:sz w:val="18"/>
+          <w:szCs w:val="18"/>
+        </w:rPr>
+        <w:t xml:space="preserve">Mi ubicación y variante del Gobierno Central. Las capturas muestran la etiqueta «Modo ligero», propia de equipos sin aceleración gráfica; en un teléfono con aceleración no aparece y el mapa se ve completo. </w:t>
+      </w:r>
+      <w:r>
+        <w:rPr>
+          <w:rFonts w:ascii="Roboto" w:cs="Roboto" w:eastAsia="Roboto" w:hAnsi="Roboto"/>
+          <w:i/>
+          <w:iCs/>
+          <w:color w:val="55585A"/>
+          <w:sz w:val="18"/>
+          <w:szCs w:val="18"/>
+        </w:rPr>
+        <w:t xml:space="preserve">Fuente: herramienta «Calles prioritarias para reforestar», versión 17.30, teléfono simulado de 390 × 844, 4 de octubre de 2026.</w:t>
       </w:r>
     </w:p>
     <w:p>
@@ -5061,7 +6769,7 @@
       <w:tr>
         <w:trPr>
           <w:cantSplit/>
-          <w:trHeight w:val="380" w:hRule="atLeast"/>
+          <w:trHeight w:val="320" w:hRule="atLeast"/>
         </w:trPr>
         <w:tc>
           <w:tcPr>
@@ -5093,7 +6801,7 @@
                 <w:sz w:val="18"/>
                 <w:szCs w:val="18"/>
               </w:rPr>
-              <w:t xml:space="preserve">Alcaldía</w:t>
+              <w:t xml:space="preserve">Grupo</w:t>
             </w:r>
           </w:p>
         </w:tc>
@@ -5120,13 +6828,22 @@
               <w:spacing w:after="30" w:line="250"/>
               <w:jc w:val="left"/>
             </w:pPr>
+            <w:r>
+              <w:rPr>
+                <w:rFonts w:ascii="Roboto" w:cs="Roboto" w:eastAsia="Roboto" w:hAnsi="Roboto"/>
+                <w:color w:val="1A1A1A"/>
+                <w:sz w:val="18"/>
+                <w:szCs w:val="18"/>
+              </w:rPr>
+              <w:t xml:space="preserve">☐ Alcaldía   ☐ Gobierno Central</w:t>
+            </w:r>
           </w:p>
         </w:tc>
       </w:tr>
       <w:tr>
         <w:trPr>
           <w:cantSplit/>
-          <w:trHeight w:val="380" w:hRule="atLeast"/>
+          <w:trHeight w:val="320" w:hRule="atLeast"/>
         </w:trPr>
         <w:tc>
           <w:tcPr>
@@ -5158,7 +6875,7 @@
                 <w:sz w:val="18"/>
                 <w:szCs w:val="18"/>
               </w:rPr>
-              <w:t xml:space="preserve">Nombre y cargo</w:t>
+              <w:t xml:space="preserve">Alcaldía o dependencia</w:t>
             </w:r>
           </w:p>
         </w:tc>
@@ -5191,7 +6908,7 @@
       <w:tr>
         <w:trPr>
           <w:cantSplit/>
-          <w:trHeight w:val="380" w:hRule="atLeast"/>
+          <w:trHeight w:val="320" w:hRule="atLeast"/>
         </w:trPr>
         <w:tc>
           <w:tcPr>
@@ -5223,7 +6940,7 @@
                 <w:sz w:val="18"/>
                 <w:szCs w:val="18"/>
               </w:rPr>
-              <w:t xml:space="preserve">Teléfono (marca y modelo)</w:t>
+              <w:t xml:space="preserve">Nombre y cargo</w:t>
             </w:r>
           </w:p>
         </w:tc>
@@ -5256,7 +6973,7 @@
       <w:tr>
         <w:trPr>
           <w:cantSplit/>
-          <w:trHeight w:val="380" w:hRule="atLeast"/>
+          <w:trHeight w:val="320" w:hRule="atLeast"/>
         </w:trPr>
         <w:tc>
           <w:tcPr>
@@ -5288,7 +7005,7 @@
                 <w:sz w:val="18"/>
                 <w:szCs w:val="18"/>
               </w:rPr>
-              <w:t xml:space="preserve">Navegador</w:t>
+              <w:t xml:space="preserve">Teléfono (marca y modelo)</w:t>
             </w:r>
           </w:p>
         </w:tc>
@@ -5321,7 +7038,7 @@
       <w:tr>
         <w:trPr>
           <w:cantSplit/>
-          <w:trHeight w:val="380" w:hRule="atLeast"/>
+          <w:trHeight w:val="320" w:hRule="atLeast"/>
         </w:trPr>
         <w:tc>
           <w:tcPr>
@@ -5353,7 +7070,7 @@
                 <w:sz w:val="18"/>
                 <w:szCs w:val="18"/>
               </w:rPr>
-              <w:t xml:space="preserve">Conexión</w:t>
+              <w:t xml:space="preserve">Navegador</w:t>
             </w:r>
           </w:p>
         </w:tc>
@@ -5380,22 +7097,13 @@
               <w:spacing w:after="30" w:line="250"/>
               <w:jc w:val="left"/>
             </w:pPr>
-            <w:r>
-              <w:rPr>
-                <w:rFonts w:ascii="Roboto" w:cs="Roboto" w:eastAsia="Roboto" w:hAnsi="Roboto"/>
-                <w:color w:val="1A1A1A"/>
-                <w:sz w:val="18"/>
-                <w:szCs w:val="18"/>
-              </w:rPr>
-              <w:t xml:space="preserve">☐ Datos móviles   ☐ Wifi   ☐ Primero datos, después wifi</w:t>
-            </w:r>
           </w:p>
         </w:tc>
       </w:tr>
       <w:tr>
         <w:trPr>
           <w:cantSplit/>
-          <w:trHeight w:val="380" w:hRule="atLeast"/>
+          <w:trHeight w:val="320" w:hRule="atLeast"/>
         </w:trPr>
         <w:tc>
           <w:tcPr>
@@ -5427,7 +7135,7 @@
                 <w:sz w:val="18"/>
                 <w:szCs w:val="18"/>
               </w:rPr>
-              <w:t xml:space="preserve">Versión que muestra el panel</w:t>
+              <w:t xml:space="preserve">Conexión</w:t>
             </w:r>
           </w:p>
         </w:tc>
@@ -5454,13 +7162,22 @@
               <w:spacing w:after="30" w:line="250"/>
               <w:jc w:val="left"/>
             </w:pPr>
+            <w:r>
+              <w:rPr>
+                <w:rFonts w:ascii="Roboto" w:cs="Roboto" w:eastAsia="Roboto" w:hAnsi="Roboto"/>
+                <w:color w:val="1A1A1A"/>
+                <w:sz w:val="18"/>
+                <w:szCs w:val="18"/>
+              </w:rPr>
+              <w:t xml:space="preserve">☐ Datos móviles   ☐ Wifi   ☐ Primero datos, después wifi</w:t>
+            </w:r>
           </w:p>
         </w:tc>
       </w:tr>
       <w:tr>
         <w:trPr>
           <w:cantSplit/>
-          <w:trHeight w:val="380" w:hRule="atLeast"/>
+          <w:trHeight w:val="320" w:hRule="atLeast"/>
         </w:trPr>
         <w:tc>
           <w:tcPr>
@@ -5492,7 +7209,7 @@
                 <w:sz w:val="18"/>
                 <w:szCs w:val="18"/>
               </w:rPr>
-              <w:t xml:space="preserve">Segundos hasta ver el mapa</w:t>
+              <w:t xml:space="preserve">Versión que muestra el panel</w:t>
             </w:r>
           </w:p>
         </w:tc>
@@ -5525,7 +7242,7 @@
       <w:tr>
         <w:trPr>
           <w:cantSplit/>
-          <w:trHeight w:val="380" w:hRule="atLeast"/>
+          <w:trHeight w:val="320" w:hRule="atLeast"/>
         </w:trPr>
         <w:tc>
           <w:tcPr>
@@ -5557,7 +7274,7 @@
                 <w:sz w:val="18"/>
                 <w:szCs w:val="18"/>
               </w:rPr>
-              <w:t xml:space="preserve">¿Apareció el aviso de modo ligero?</w:t>
+              <w:t xml:space="preserve">Segundos hasta ver el mapa</w:t>
             </w:r>
           </w:p>
         </w:tc>
@@ -5584,22 +7301,13 @@
               <w:spacing w:after="30" w:line="250"/>
               <w:jc w:val="left"/>
             </w:pPr>
-            <w:r>
-              <w:rPr>
-                <w:rFonts w:ascii="Roboto" w:cs="Roboto" w:eastAsia="Roboto" w:hAnsi="Roboto"/>
-                <w:color w:val="1A1A1A"/>
-                <w:sz w:val="18"/>
-                <w:szCs w:val="18"/>
-              </w:rPr>
-              <w:t xml:space="preserve">☐ Sí   ☐ No</w:t>
-            </w:r>
           </w:p>
         </w:tc>
       </w:tr>
       <w:tr>
         <w:trPr>
           <w:cantSplit/>
-          <w:trHeight w:val="380" w:hRule="atLeast"/>
+          <w:trHeight w:val="320" w:hRule="atLeast"/>
         </w:trPr>
         <w:tc>
           <w:tcPr>
@@ -5631,7 +7339,7 @@
                 <w:sz w:val="18"/>
                 <w:szCs w:val="18"/>
               </w:rPr>
-              <w:t xml:space="preserve">¿Apareció la ventana de entrada?</w:t>
+              <w:t xml:space="preserve">¿Apareció el aviso de modo ligero?</w:t>
             </w:r>
           </w:p>
         </w:tc>
@@ -5665,7 +7373,7 @@
                 <w:sz w:val="18"/>
                 <w:szCs w:val="18"/>
               </w:rPr>
-              <w:t xml:space="preserve">☐ Sí   ☐ No (ya había abierto la herramienta en ese teléfono)</w:t>
+              <w:t xml:space="preserve">☐ Sí   ☐ No</w:t>
             </w:r>
           </w:p>
         </w:tc>
@@ -5673,7 +7381,7 @@
       <w:tr>
         <w:trPr>
           <w:cantSplit/>
-          <w:trHeight w:val="380" w:hRule="atLeast"/>
+          <w:trHeight w:val="320" w:hRule="atLeast"/>
         </w:trPr>
         <w:tc>
           <w:tcPr>
@@ -5705,7 +7413,7 @@
                 <w:sz w:val="18"/>
                 <w:szCs w:val="18"/>
               </w:rPr>
-              <w:t xml:space="preserve">Prueba de acceso previa (tabla 1)</w:t>
+              <w:t xml:space="preserve">¿Apareció la ventana de entrada?</w:t>
             </w:r>
           </w:p>
         </w:tc>
@@ -5739,7 +7447,7 @@
                 <w:sz w:val="18"/>
                 <w:szCs w:val="18"/>
               </w:rPr>
-              <w:t xml:space="preserve">☐ Abrió en la red de la alcaldía   ☐ Solo con datos móviles   ☐ No abrió</w:t>
+              <w:t xml:space="preserve">☐ Sí   ☐ No (ya había abierto la herramienta en ese teléfono)</w:t>
             </w:r>
           </w:p>
         </w:tc>
@@ -5747,7 +7455,155 @@
       <w:tr>
         <w:trPr>
           <w:cantSplit/>
-          <w:trHeight w:val="380" w:hRule="atLeast"/>
+          <w:trHeight w:val="320" w:hRule="atLeast"/>
+        </w:trPr>
+        <w:tc>
+          <w:tcPr>
+            <w:tcW w:type="dxa" w:w="3400"/>
+            <w:tcBorders>
+              <w:top w:val="single" w:color="C9C9C9" w:sz="4"/>
+              <w:left w:val="single" w:color="C9C9C9" w:sz="4"/>
+              <w:bottom w:val="single" w:color="C9C9C9" w:sz="4"/>
+              <w:right w:val="single" w:color="C9C9C9" w:sz="4"/>
+            </w:tcBorders>
+            <w:shd w:fill="FFFFFF" w:color="auto" w:val="clear"/>
+            <w:tcMar>
+              <w:top w:type="dxa" w:w="70"/>
+              <w:left w:type="dxa" w:w="100"/>
+              <w:bottom w:type="dxa" w:w="70"/>
+              <w:right w:type="dxa" w:w="100"/>
+            </w:tcMar>
+            <w:vAlign w:val="top"/>
+          </w:tcPr>
+          <w:p>
+            <w:pPr>
+              <w:spacing w:after="30" w:line="250"/>
+              <w:jc w:val="left"/>
+            </w:pPr>
+            <w:r>
+              <w:rPr>
+                <w:rFonts w:ascii="Roboto" w:cs="Roboto" w:eastAsia="Roboto" w:hAnsi="Roboto"/>
+                <w:color w:val="1A1A1A"/>
+                <w:sz w:val="18"/>
+                <w:szCs w:val="18"/>
+              </w:rPr>
+              <w:t xml:space="preserve">Opción que eligió al entrar</w:t>
+            </w:r>
+          </w:p>
+        </w:tc>
+        <w:tc>
+          <w:tcPr>
+            <w:tcW w:type="dxa" w:w="6572"/>
+            <w:tcBorders>
+              <w:top w:val="single" w:color="C9C9C9" w:sz="4"/>
+              <w:left w:val="single" w:color="C9C9C9" w:sz="4"/>
+              <w:bottom w:val="single" w:color="C9C9C9" w:sz="4"/>
+              <w:right w:val="single" w:color="C9C9C9" w:sz="4"/>
+            </w:tcBorders>
+            <w:shd w:fill="FFFFFF" w:color="auto" w:val="clear"/>
+            <w:tcMar>
+              <w:top w:type="dxa" w:w="70"/>
+              <w:left w:type="dxa" w:w="100"/>
+              <w:bottom w:type="dxa" w:w="70"/>
+              <w:right w:type="dxa" w:w="100"/>
+            </w:tcMar>
+            <w:vAlign w:val="top"/>
+          </w:tcPr>
+          <w:p>
+            <w:pPr>
+              <w:spacing w:after="30" w:line="250"/>
+              <w:jc w:val="left"/>
+            </w:pPr>
+            <w:r>
+              <w:rPr>
+                <w:rFonts w:ascii="Roboto" w:cs="Roboto" w:eastAsia="Roboto" w:hAnsi="Roboto"/>
+                <w:color w:val="1A1A1A"/>
+                <w:sz w:val="18"/>
+                <w:szCs w:val="18"/>
+              </w:rPr>
+              <w:t xml:space="preserve">☐ Calles y colonias   ☐ Vialidades primarias</w:t>
+            </w:r>
+          </w:p>
+        </w:tc>
+      </w:tr>
+      <w:tr>
+        <w:trPr>
+          <w:cantSplit/>
+          <w:trHeight w:val="320" w:hRule="atLeast"/>
+        </w:trPr>
+        <w:tc>
+          <w:tcPr>
+            <w:tcW w:type="dxa" w:w="3400"/>
+            <w:tcBorders>
+              <w:top w:val="single" w:color="C9C9C9" w:sz="4"/>
+              <w:left w:val="single" w:color="C9C9C9" w:sz="4"/>
+              <w:bottom w:val="single" w:color="C9C9C9" w:sz="4"/>
+              <w:right w:val="single" w:color="C9C9C9" w:sz="4"/>
+            </w:tcBorders>
+            <w:shd w:fill="F7F1F3" w:color="auto" w:val="clear"/>
+            <w:tcMar>
+              <w:top w:type="dxa" w:w="70"/>
+              <w:left w:type="dxa" w:w="100"/>
+              <w:bottom w:type="dxa" w:w="70"/>
+              <w:right w:type="dxa" w:w="100"/>
+            </w:tcMar>
+            <w:vAlign w:val="top"/>
+          </w:tcPr>
+          <w:p>
+            <w:pPr>
+              <w:spacing w:after="30" w:line="250"/>
+              <w:jc w:val="left"/>
+            </w:pPr>
+            <w:r>
+              <w:rPr>
+                <w:rFonts w:ascii="Roboto" w:cs="Roboto" w:eastAsia="Roboto" w:hAnsi="Roboto"/>
+                <w:color w:val="1A1A1A"/>
+                <w:sz w:val="18"/>
+                <w:szCs w:val="18"/>
+              </w:rPr>
+              <w:t xml:space="preserve">Prueba de acceso previa (tabla 1)</w:t>
+            </w:r>
+          </w:p>
+        </w:tc>
+        <w:tc>
+          <w:tcPr>
+            <w:tcW w:type="dxa" w:w="6572"/>
+            <w:tcBorders>
+              <w:top w:val="single" w:color="C9C9C9" w:sz="4"/>
+              <w:left w:val="single" w:color="C9C9C9" w:sz="4"/>
+              <w:bottom w:val="single" w:color="C9C9C9" w:sz="4"/>
+              <w:right w:val="single" w:color="C9C9C9" w:sz="4"/>
+            </w:tcBorders>
+            <w:shd w:fill="F7F1F3" w:color="auto" w:val="clear"/>
+            <w:tcMar>
+              <w:top w:type="dxa" w:w="70"/>
+              <w:left w:type="dxa" w:w="100"/>
+              <w:bottom w:type="dxa" w:w="70"/>
+              <w:right w:type="dxa" w:w="100"/>
+            </w:tcMar>
+            <w:vAlign w:val="top"/>
+          </w:tcPr>
+          <w:p>
+            <w:pPr>
+              <w:spacing w:after="30" w:line="250"/>
+              <w:jc w:val="left"/>
+            </w:pPr>
+            <w:r>
+              <w:rPr>
+                <w:rFonts w:ascii="Roboto" w:cs="Roboto" w:eastAsia="Roboto" w:hAnsi="Roboto"/>
+                <w:color w:val="1A1A1A"/>
+                <w:sz w:val="18"/>
+                <w:szCs w:val="18"/>
+              </w:rPr>
+              <w:t xml:space="preserve">☐ Abrió en la red de la alcaldía   ☐ Solo con datos móviles   ☐ No abrió</w:t>
+            </w:r>
+          </w:p>
+        </w:tc>
+      </w:tr>
+      <w:tr>
+        <w:trPr>
+          <w:cantSplit/>
+          <w:trHeight w:val="320" w:hRule="atLeast"/>
         </w:trPr>
         <w:tc>
           <w:tcPr>
@@ -6097,7 +7953,7 @@
       <w:tr>
         <w:trPr>
           <w:cantSplit/>
-          <w:trHeight w:val="480" w:hRule="atLeast"/>
+          <w:trHeight w:val="420" w:hRule="atLeast"/>
         </w:trPr>
         <w:tc>
           <w:tcPr>
@@ -6323,7 +8179,7 @@
       <w:tr>
         <w:trPr>
           <w:cantSplit/>
-          <w:trHeight w:val="480" w:hRule="atLeast"/>
+          <w:trHeight w:val="420" w:hRule="atLeast"/>
         </w:trPr>
         <w:tc>
           <w:tcPr>
@@ -6549,7 +8405,7 @@
       <w:tr>
         <w:trPr>
           <w:cantSplit/>
-          <w:trHeight w:val="480" w:hRule="atLeast"/>
+          <w:trHeight w:val="420" w:hRule="atLeast"/>
         </w:trPr>
         <w:tc>
           <w:tcPr>
@@ -6775,7 +8631,7 @@
       <w:tr>
         <w:trPr>
           <w:cantSplit/>
-          <w:trHeight w:val="480" w:hRule="atLeast"/>
+          <w:trHeight w:val="420" w:hRule="atLeast"/>
         </w:trPr>
         <w:tc>
           <w:tcPr>
@@ -7001,7 +8857,7 @@
       <w:tr>
         <w:trPr>
           <w:cantSplit/>
-          <w:trHeight w:val="480" w:hRule="atLeast"/>
+          <w:trHeight w:val="420" w:hRule="atLeast"/>
         </w:trPr>
         <w:tc>
           <w:tcPr>
@@ -7227,7 +9083,7 @@
       <w:tr>
         <w:trPr>
           <w:cantSplit/>
-          <w:trHeight w:val="480" w:hRule="atLeast"/>
+          <w:trHeight w:val="420" w:hRule="atLeast"/>
         </w:trPr>
         <w:tc>
           <w:tcPr>
@@ -7453,7 +9309,7 @@
       <w:tr>
         <w:trPr>
           <w:cantSplit/>
-          <w:trHeight w:val="480" w:hRule="atLeast"/>
+          <w:trHeight w:val="420" w:hRule="atLeast"/>
         </w:trPr>
         <w:tc>
           <w:tcPr>
@@ -7679,7 +9535,7 @@
       <w:tr>
         <w:trPr>
           <w:cantSplit/>
-          <w:trHeight w:val="480" w:hRule="atLeast"/>
+          <w:trHeight w:val="420" w:hRule="atLeast"/>
         </w:trPr>
         <w:tc>
           <w:tcPr>
@@ -8005,7 +9861,7 @@
       <w:tr>
         <w:trPr>
           <w:cantSplit/>
-          <w:trHeight w:val="380" w:hRule="atLeast"/>
+          <w:trHeight w:val="320" w:hRule="atLeast"/>
         </w:trPr>
         <w:tc>
           <w:tcPr>
@@ -8079,7 +9935,7 @@
       <w:tr>
         <w:trPr>
           <w:cantSplit/>
-          <w:trHeight w:val="380" w:hRule="atLeast"/>
+          <w:trHeight w:val="320" w:hRule="atLeast"/>
         </w:trPr>
         <w:tc>
           <w:tcPr>
@@ -8153,7 +10009,7 @@
       <w:tr>
         <w:trPr>
           <w:cantSplit/>
-          <w:trHeight w:val="380" w:hRule="atLeast"/>
+          <w:trHeight w:val="320" w:hRule="atLeast"/>
         </w:trPr>
         <w:tc>
           <w:tcPr>

</xml_diff>

<commit_message>
Guía de prueba con personal de alcaldías, actualizada a la v17.38
Nueve tareas en 40 minutos. La tarea 8 (nueva) pone a prueba la fila «Banqueta»; la tarea 5 añade la revisión en Street View, y en la tarea 1 se observa el recorrido guiado. La tarea 8 no aplica al Gobierno Central.
Tabla 4 nueva: variante con acceso por cuenta (tarea 0 y cierre de sesión), solo si la prueba se hace en el servidor del SIA.
Formato de registro con renglones de recorrido y de acceso con cuenta. Anexo 1 con las doce capturas rehechas en la v17.38 y dos figuras más.

Co-Authored-By: Claude Opus 5.5 <noreply@anthropic.com>
</commit_message>
<xml_diff>
--- a/06_entregables/Guia_prueba_alcaldias_calles_prioritarias.docx
+++ b/06_entregables/Guia_prueba_alcaldias_calles_prioritarias.docx
@@ -16,7 +16,7 @@
           <w:sz w:val="20"/>
           <w:szCs w:val="20"/>
         </w:rPr>
-        <w:t xml:space="preserve">Ciudad de México, a 4 de octubre de 2026</w:t>
+        <w:t xml:space="preserve">Ciudad de México, a 5 de octubre de 2026</w:t>
       </w:r>
     </w:p>
     <w:p>
@@ -108,7 +108,7 @@
                 <w:sz w:val="20"/>
                 <w:szCs w:val="20"/>
               </w:rPr>
-              <w:t xml:space="preserve">Prueba de uso en teléfonos reales, con personal de alcaldías y de las áreas del Gobierno de la Ciudad que atienden vialidades primarias, antes de difundir la herramienta y de publicarla en la infraestructura del Sistema de Información Ambiental. Esta guía corresponde a la versión 17.30 y sustituye a las del 2 y del 4 de octubre de 2026 (versiones 17.23 y 17.29).</w:t>
+              <w:t xml:space="preserve">Prueba de uso en teléfonos reales, con personal de alcaldías y de las áreas del Gobierno de la Ciudad que atienden vialidades primarias, antes de difundir la herramienta y de publicarla en la infraestructura del Sistema de Información Ambiental. Esta guía corresponde a la versión 17.38 y sustituye a las del 2 y del 4 de octubre de 2026 (versiones 17.23 a 17.30).</w:t>
             </w:r>
           </w:p>
         </w:tc>
@@ -242,7 +242,7 @@
           <w:sz w:val="20"/>
           <w:szCs w:val="20"/>
         </w:rPr>
-        <w:t xml:space="preserve"> 2 personas de las áreas que plantan en vialidades primarias. Siguen las mismas ocho tareas, con la variante de la tabla 3.</w:t>
+        <w:t xml:space="preserve"> 2 personas de las áreas que plantan en vialidades primarias. Siguen las mismas tareas, con la variante de la tabla 3; la tarea 8 no les aplica.</w:t>
       </w:r>
     </w:p>
     <w:p>
@@ -280,7 +280,7 @@
           <w:sz w:val="20"/>
           <w:szCs w:val="20"/>
         </w:rPr>
-        <w:t xml:space="preserve"> 35 minutos por persona, de forma individual. Las tareas 1 a 7 pueden hacerse en oficina; la 8 se hace en la calle, porque usa el GPS del teléfono.</w:t>
+        <w:t xml:space="preserve"> 40 minutos por persona, de forma individual. Las tareas 1 a 8 pueden hacerse en oficina; la 9 se hace en la calle, porque usa el GPS del teléfono.</w:t>
       </w:r>
     </w:p>
     <w:p>
@@ -432,7 +432,7 @@
           <w:sz w:val="20"/>
           <w:szCs w:val="20"/>
         </w:rPr>
-        <w:t xml:space="preserve"> al final de la pestaña Descargas debe leerse «Versión 17.30». Si aparece otra, se anota en el formato y se usan las capturas del anexo 1 solo como referencia.</w:t>
+        <w:t xml:space="preserve"> al final de la pestaña Descargas debe leerse «Versión 17.38». Si aparece otra, se anota en el formato y se usan las capturas del anexo 1 solo como referencia.</w:t>
       </w:r>
     </w:p>
     <w:p>
@@ -1110,7 +1110,7 @@
           <w:sz w:val="24"/>
           <w:szCs w:val="24"/>
         </w:rPr>
-        <w:t xml:space="preserve">5. Las ocho tareas</w:t>
+        <w:t xml:space="preserve">5. Las nueve tareas</w:t>
       </w:r>
     </w:p>
     <w:p>
@@ -1125,7 +1125,7 @@
           <w:sz w:val="20"/>
           <w:szCs w:val="20"/>
         </w:rPr>
-        <w:t xml:space="preserve">El moderador lee cada tarea tal como está escrita, cronometra desde que termina de leerla y tiene la herramienta abierta en otro equipo para verificar las respuestas. Cada tarea se refiere a un solo ámbito: las tareas 1 a 3, a la alcaldía; de la 4 a la 7, a la colonia que la persona eligió.</w:t>
+        <w:t xml:space="preserve">El moderador lee cada tarea tal como está escrita, cronometra desde que termina de leerla y tiene la herramienta abierta en otro equipo para verificar las respuestas. Cada tarea se refiere a un solo ámbito: las tareas 1 a 3, a la alcaldía; de la 4 a la 8, a la colonia que la persona eligió.</w:t>
       </w:r>
     </w:p>
     <w:p>
@@ -1458,7 +1458,7 @@
                 <w:sz w:val="18"/>
                 <w:szCs w:val="18"/>
               </w:rPr>
-              <w:t xml:space="preserve">Segundos hasta ver la ventana de entrada y tipo de conexión. Si entiende las dos opciones de «¿Qué quieres consultar?» o duda entre ellas. Si intenta cerrar la ventana. Si aparece el aviso de modo ligero.</w:t>
+              <w:t xml:space="preserve">Segundos hasta ver la ventana de entrada y tipo de conexión. Si entiende las dos opciones de «¿Qué quieres consultar?» o duda entre ellas. Si intenta cerrar la ventana. Si aparece el aviso de modo ligero. Al entrar por primera vez arranca solo el recorrido guiado: si lo sigue completo, lo deja antes del final («Salir del recorrido») o lo cierra, y cuánto tarda; ese tiempo no cuenta para la tarea.</w:t>
             </w:r>
           </w:p>
         </w:tc>
@@ -1954,7 +1954,7 @@
                 <w:sz w:val="18"/>
                 <w:szCs w:val="18"/>
               </w:rPr>
-              <w:t xml:space="preserve">Toca en el mapa un frente de esa calle y pide la ruta para llegar a él.</w:t>
+              <w:t xml:space="preserve">Toca en el mapa un frente de esa calle, revisa en Street View si tiene banqueta y pide la ruta para llegar a él.</w:t>
             </w:r>
           </w:p>
         </w:tc>
@@ -1988,7 +1988,7 @@
                 <w:sz w:val="18"/>
                 <w:szCs w:val="18"/>
               </w:rPr>
-              <w:t xml:space="preserve">Se abre Google Maps con el destino.</w:t>
+              <w:t xml:space="preserve">Abre Street View desde la ficha del frente y después Google Maps con el destino.</w:t>
             </w:r>
           </w:p>
         </w:tc>
@@ -2022,7 +2022,7 @@
                 <w:sz w:val="18"/>
                 <w:szCs w:val="18"/>
               </w:rPr>
-              <w:t xml:space="preserve">Si acierta a tocar el frente en pantalla chica. Si usa «Cómo llegar», «Street View» o «Copiar coordenadas».</w:t>
+              <w:t xml:space="preserve">Si acierta a tocar el frente en pantalla chica. Si encuentra «Street View» en la ficha y sabe decir, por la imagen, si hay banqueta y espacio para plantar. Si usa «Cómo llegar» o «Copiar coordenadas».</w:t>
             </w:r>
           </w:p>
         </w:tc>
@@ -2377,6 +2377,147 @@
                 <w:sz w:val="18"/>
                 <w:szCs w:val="18"/>
               </w:rPr>
+              <w:t xml:space="preserve">En esa colonia, ¿cuántos kilómetros prioritarios tienen banqueta según la herramienta? Después deja en el mapa solo las calles que hay que revisar en sitio.</w:t>
+            </w:r>
+          </w:p>
+        </w:tc>
+        <w:tc>
+          <w:tcPr>
+            <w:tcW w:type="dxa" w:w="2500"/>
+            <w:tcBorders>
+              <w:top w:val="single" w:color="C9C9C9" w:sz="4"/>
+              <w:left w:val="single" w:color="C9C9C9" w:sz="4"/>
+              <w:bottom w:val="single" w:color="C9C9C9" w:sz="4"/>
+              <w:right w:val="single" w:color="C9C9C9" w:sz="4"/>
+            </w:tcBorders>
+            <w:shd w:fill="F7F1F3" w:color="auto" w:val="clear"/>
+            <w:tcMar>
+              <w:top w:type="dxa" w:w="70"/>
+              <w:left w:type="dxa" w:w="100"/>
+              <w:bottom w:type="dxa" w:w="70"/>
+              <w:right w:type="dxa" w:w="100"/>
+            </w:tcMar>
+            <w:vAlign w:val="top"/>
+          </w:tcPr>
+          <w:p>
+            <w:pPr>
+              <w:spacing w:after="30" w:line="250"/>
+              <w:jc w:val="left"/>
+            </w:pPr>
+            <w:r>
+              <w:rPr>
+                <w:rFonts w:ascii="Roboto" w:cs="Roboto" w:eastAsia="Roboto" w:hAnsi="Roboto"/>
+                <w:color w:val="1A1A1A"/>
+                <w:sz w:val="18"/>
+                <w:szCs w:val="18"/>
+              </w:rPr>
+              <w:t xml:space="preserve">Dice la cifra «con banqueta» del desglose de la pestaña «Resumen» y elige «Sin o por verificar» en la fila «Banqueta».</w:t>
+            </w:r>
+          </w:p>
+        </w:tc>
+        <w:tc>
+          <w:tcPr>
+            <w:tcW w:type="dxa" w:w="3672"/>
+            <w:tcBorders>
+              <w:top w:val="single" w:color="C9C9C9" w:sz="4"/>
+              <w:left w:val="single" w:color="C9C9C9" w:sz="4"/>
+              <w:bottom w:val="single" w:color="C9C9C9" w:sz="4"/>
+              <w:right w:val="single" w:color="C9C9C9" w:sz="4"/>
+            </w:tcBorders>
+            <w:shd w:fill="F7F1F3" w:color="auto" w:val="clear"/>
+            <w:tcMar>
+              <w:top w:type="dxa" w:w="70"/>
+              <w:left w:type="dxa" w:w="100"/>
+              <w:bottom w:type="dxa" w:w="70"/>
+              <w:right w:type="dxa" w:w="100"/>
+            </w:tcMar>
+            <w:vAlign w:val="top"/>
+          </w:tcPr>
+          <w:p>
+            <w:pPr>
+              <w:spacing w:after="30" w:line="250"/>
+              <w:jc w:val="left"/>
+            </w:pPr>
+            <w:r>
+              <w:rPr>
+                <w:rFonts w:ascii="Roboto" w:cs="Roboto" w:eastAsia="Roboto" w:hAnsi="Roboto"/>
+                <w:color w:val="1A1A1A"/>
+                <w:sz w:val="18"/>
+                <w:szCs w:val="18"/>
+              </w:rPr>
+              <w:t xml:space="preserve">Si encuentra la fila «Banqueta», bajo «Atiende». Si entiende que «Sin o por verificar» no descarta calles, sino que pide reconocimiento en sitio. Si nota que el mapa, las cifras y las descargas siguen el filtro. Si la cifra le parece creíble por lo que conoce (el dato es de INEGI 2020).</w:t>
+            </w:r>
+          </w:p>
+        </w:tc>
+      </w:tr>
+      <w:tr>
+        <w:trPr>
+          <w:cantSplit/>
+        </w:trPr>
+        <w:tc>
+          <w:tcPr>
+            <w:tcW w:type="dxa" w:w="500"/>
+            <w:tcBorders>
+              <w:top w:val="single" w:color="C9C9C9" w:sz="4"/>
+              <w:left w:val="single" w:color="C9C9C9" w:sz="4"/>
+              <w:bottom w:val="single" w:color="C9C9C9" w:sz="4"/>
+              <w:right w:val="single" w:color="C9C9C9" w:sz="4"/>
+            </w:tcBorders>
+            <w:shd w:fill="FFFFFF" w:color="auto" w:val="clear"/>
+            <w:tcMar>
+              <w:top w:type="dxa" w:w="70"/>
+              <w:left w:type="dxa" w:w="100"/>
+              <w:bottom w:type="dxa" w:w="70"/>
+              <w:right w:type="dxa" w:w="100"/>
+            </w:tcMar>
+            <w:vAlign w:val="top"/>
+          </w:tcPr>
+          <w:p>
+            <w:pPr>
+              <w:spacing w:after="30" w:line="250"/>
+              <w:jc w:val="left"/>
+            </w:pPr>
+            <w:r>
+              <w:rPr>
+                <w:rFonts w:ascii="Roboto" w:cs="Roboto" w:eastAsia="Roboto" w:hAnsi="Roboto"/>
+                <w:color w:val="1A1A1A"/>
+                <w:sz w:val="18"/>
+                <w:szCs w:val="18"/>
+              </w:rPr>
+              <w:t xml:space="preserve">9</w:t>
+            </w:r>
+          </w:p>
+        </w:tc>
+        <w:tc>
+          <w:tcPr>
+            <w:tcW w:type="dxa" w:w="3300"/>
+            <w:tcBorders>
+              <w:top w:val="single" w:color="C9C9C9" w:sz="4"/>
+              <w:left w:val="single" w:color="C9C9C9" w:sz="4"/>
+              <w:bottom w:val="single" w:color="C9C9C9" w:sz="4"/>
+              <w:right w:val="single" w:color="C9C9C9" w:sz="4"/>
+            </w:tcBorders>
+            <w:shd w:fill="FFFFFF" w:color="auto" w:val="clear"/>
+            <w:tcMar>
+              <w:top w:type="dxa" w:w="70"/>
+              <w:left w:type="dxa" w:w="100"/>
+              <w:bottom w:type="dxa" w:w="70"/>
+              <w:right w:type="dxa" w:w="100"/>
+            </w:tcMar>
+            <w:vAlign w:val="top"/>
+          </w:tcPr>
+          <w:p>
+            <w:pPr>
+              <w:spacing w:after="30" w:line="250"/>
+              <w:jc w:val="left"/>
+            </w:pPr>
+            <w:r>
+              <w:rPr>
+                <w:rFonts w:ascii="Roboto" w:cs="Roboto" w:eastAsia="Roboto" w:hAnsi="Roboto"/>
+                <w:color w:val="1A1A1A"/>
+                <w:sz w:val="18"/>
+                <w:szCs w:val="18"/>
+              </w:rPr>
               <w:t xml:space="preserve">Ya en la calle: usa tu ubicación en el mapa y dime cuál es la calle prioritaria más cercana a ti y a cuántos metros está.</w:t>
             </w:r>
           </w:p>
@@ -2390,7 +2531,7 @@
               <w:bottom w:val="single" w:color="C9C9C9" w:sz="4"/>
               <w:right w:val="single" w:color="C9C9C9" w:sz="4"/>
             </w:tcBorders>
-            <w:shd w:fill="F7F1F3" w:color="auto" w:val="clear"/>
+            <w:shd w:fill="FFFFFF" w:color="auto" w:val="clear"/>
             <w:tcMar>
               <w:top w:type="dxa" w:w="70"/>
               <w:left w:type="dxa" w:w="100"/>
@@ -2424,7 +2565,7 @@
               <w:bottom w:val="single" w:color="C9C9C9" w:sz="4"/>
               <w:right w:val="single" w:color="C9C9C9" w:sz="4"/>
             </w:tcBorders>
-            <w:shd w:fill="F7F1F3" w:color="auto" w:val="clear"/>
+            <w:shd w:fill="FFFFFF" w:color="auto" w:val="clear"/>
             <w:tcMar>
               <w:top w:type="dxa" w:w="70"/>
               <w:left w:type="dxa" w:w="100"/>
@@ -2479,7 +2620,7 @@
           <w:sz w:val="20"/>
           <w:szCs w:val="20"/>
         </w:rPr>
-        <w:t xml:space="preserve">Las tareas 1 y 2 son nuevas respecto de la guía del 2 de octubre: cubren la entrada en dos pasos (qué se consulta y dónde) y la pestaña «Dónde empezar», incorporadas en las versiones 17.28 y 17.30. La tarea 4 reúne las anteriores 3 y 4. La herramienta recuerda la última consulta: si la persona ya la había abierto en ese teléfono, no verá la ventana de entrada y la tarea 1 se registra con esa nota.</w:t>
+        <w:t xml:space="preserve">Cambios respecto de la guía del 4 de octubre: la tarea 8 es nueva y pone a prueba la fila «Banqueta» (versión 17.35); la tarea 5 añade la revisión en Street View, y en la tarea 1 aparece el recorrido guiado (versión 17.36). La tarea 9 es la anterior 8. La herramienta recuerda la última consulta y si ya se vio el recorrido: si la persona ya la había abierto en ese teléfono, no verá la ventana de entrada ni el recorrido, y la tarea 1 se registra con esa nota. El filtro de banqueta que quede al final de la tarea 8 se mantiene en la tarea 9; no se corrige.</w:t>
       </w:r>
     </w:p>
     <w:p>
@@ -3308,7 +3449,7 @@
                 <w:sz w:val="18"/>
                 <w:szCs w:val="18"/>
               </w:rPr>
-              <w:t xml:space="preserve">Toca en el mapa un tramo de esa avenida y pide la ruta para llegar a él.</w:t>
+              <w:t xml:space="preserve">Toca en el mapa un tramo de esa avenida, revísalo en Street View y pide la ruta para llegar a él.</w:t>
             </w:r>
           </w:p>
         </w:tc>
@@ -3342,7 +3483,7 @@
                 <w:sz w:val="18"/>
                 <w:szCs w:val="18"/>
               </w:rPr>
-              <w:t xml:space="preserve">Se abre Google Maps con el destino.</w:t>
+              <w:t xml:space="preserve">Abre Street View desde la ficha del tramo y después Google Maps con el destino.</w:t>
             </w:r>
           </w:p>
         </w:tc>
@@ -3731,6 +3872,147 @@
                 <w:sz w:val="18"/>
                 <w:szCs w:val="18"/>
               </w:rPr>
+              <w:t xml:space="preserve">No aplica.</w:t>
+            </w:r>
+          </w:p>
+        </w:tc>
+        <w:tc>
+          <w:tcPr>
+            <w:tcW w:type="dxa" w:w="2500"/>
+            <w:tcBorders>
+              <w:top w:val="single" w:color="C9C9C9" w:sz="4"/>
+              <w:left w:val="single" w:color="C9C9C9" w:sz="4"/>
+              <w:bottom w:val="single" w:color="C9C9C9" w:sz="4"/>
+              <w:right w:val="single" w:color="C9C9C9" w:sz="4"/>
+            </w:tcBorders>
+            <w:shd w:fill="F7F1F3" w:color="auto" w:val="clear"/>
+            <w:tcMar>
+              <w:top w:type="dxa" w:w="70"/>
+              <w:left w:type="dxa" w:w="100"/>
+              <w:bottom w:type="dxa" w:w="70"/>
+              <w:right w:type="dxa" w:w="100"/>
+            </w:tcMar>
+            <w:vAlign w:val="top"/>
+          </w:tcPr>
+          <w:p>
+            <w:pPr>
+              <w:spacing w:after="30" w:line="250"/>
+              <w:jc w:val="left"/>
+            </w:pPr>
+            <w:r>
+              <w:rPr>
+                <w:rFonts w:ascii="Roboto" w:cs="Roboto" w:eastAsia="Roboto" w:hAnsi="Roboto"/>
+                <w:color w:val="1A1A1A"/>
+                <w:sz w:val="18"/>
+                <w:szCs w:val="18"/>
+              </w:rPr>
+              <w:t xml:space="preserve">La fila «Banqueta» es solo para los frentes de las alcaldías; con Gobierno Central no aparece.</w:t>
+            </w:r>
+          </w:p>
+        </w:tc>
+        <w:tc>
+          <w:tcPr>
+            <w:tcW w:type="dxa" w:w="3672"/>
+            <w:tcBorders>
+              <w:top w:val="single" w:color="C9C9C9" w:sz="4"/>
+              <w:left w:val="single" w:color="C9C9C9" w:sz="4"/>
+              <w:bottom w:val="single" w:color="C9C9C9" w:sz="4"/>
+              <w:right w:val="single" w:color="C9C9C9" w:sz="4"/>
+            </w:tcBorders>
+            <w:shd w:fill="F7F1F3" w:color="auto" w:val="clear"/>
+            <w:tcMar>
+              <w:top w:type="dxa" w:w="70"/>
+              <w:left w:type="dxa" w:w="100"/>
+              <w:bottom w:type="dxa" w:w="70"/>
+              <w:right w:type="dxa" w:w="100"/>
+            </w:tcMar>
+            <w:vAlign w:val="top"/>
+          </w:tcPr>
+          <w:p>
+            <w:pPr>
+              <w:spacing w:after="30" w:line="250"/>
+              <w:jc w:val="left"/>
+            </w:pPr>
+            <w:r>
+              <w:rPr>
+                <w:rFonts w:ascii="Roboto" w:cs="Roboto" w:eastAsia="Roboto" w:hAnsi="Roboto"/>
+                <w:color w:val="1A1A1A"/>
+                <w:sz w:val="18"/>
+                <w:szCs w:val="18"/>
+              </w:rPr>
+              <w:t xml:space="preserve">Se pasa a la tarea 9.</w:t>
+            </w:r>
+          </w:p>
+        </w:tc>
+      </w:tr>
+      <w:tr>
+        <w:trPr>
+          <w:cantSplit/>
+        </w:trPr>
+        <w:tc>
+          <w:tcPr>
+            <w:tcW w:type="dxa" w:w="500"/>
+            <w:tcBorders>
+              <w:top w:val="single" w:color="C9C9C9" w:sz="4"/>
+              <w:left w:val="single" w:color="C9C9C9" w:sz="4"/>
+              <w:bottom w:val="single" w:color="C9C9C9" w:sz="4"/>
+              <w:right w:val="single" w:color="C9C9C9" w:sz="4"/>
+            </w:tcBorders>
+            <w:shd w:fill="FFFFFF" w:color="auto" w:val="clear"/>
+            <w:tcMar>
+              <w:top w:type="dxa" w:w="70"/>
+              <w:left w:type="dxa" w:w="100"/>
+              <w:bottom w:type="dxa" w:w="70"/>
+              <w:right w:type="dxa" w:w="100"/>
+            </w:tcMar>
+            <w:vAlign w:val="top"/>
+          </w:tcPr>
+          <w:p>
+            <w:pPr>
+              <w:spacing w:after="30" w:line="250"/>
+              <w:jc w:val="left"/>
+            </w:pPr>
+            <w:r>
+              <w:rPr>
+                <w:rFonts w:ascii="Roboto" w:cs="Roboto" w:eastAsia="Roboto" w:hAnsi="Roboto"/>
+                <w:color w:val="1A1A1A"/>
+                <w:sz w:val="18"/>
+                <w:szCs w:val="18"/>
+              </w:rPr>
+              <w:t xml:space="preserve">9</w:t>
+            </w:r>
+          </w:p>
+        </w:tc>
+        <w:tc>
+          <w:tcPr>
+            <w:tcW w:type="dxa" w:w="3300"/>
+            <w:tcBorders>
+              <w:top w:val="single" w:color="C9C9C9" w:sz="4"/>
+              <w:left w:val="single" w:color="C9C9C9" w:sz="4"/>
+              <w:bottom w:val="single" w:color="C9C9C9" w:sz="4"/>
+              <w:right w:val="single" w:color="C9C9C9" w:sz="4"/>
+            </w:tcBorders>
+            <w:shd w:fill="FFFFFF" w:color="auto" w:val="clear"/>
+            <w:tcMar>
+              <w:top w:type="dxa" w:w="70"/>
+              <w:left w:type="dxa" w:w="100"/>
+              <w:bottom w:type="dxa" w:w="70"/>
+              <w:right w:type="dxa" w:w="100"/>
+            </w:tcMar>
+            <w:vAlign w:val="top"/>
+          </w:tcPr>
+          <w:p>
+            <w:pPr>
+              <w:spacing w:after="30" w:line="250"/>
+              <w:jc w:val="left"/>
+            </w:pPr>
+            <w:r>
+              <w:rPr>
+                <w:rFonts w:ascii="Roboto" w:cs="Roboto" w:eastAsia="Roboto" w:hAnsi="Roboto"/>
+                <w:color w:val="1A1A1A"/>
+                <w:sz w:val="18"/>
+                <w:szCs w:val="18"/>
+              </w:rPr>
               <w:t xml:space="preserve">Ya en la calle: usa tu ubicación en el mapa y dime cuál es la calle prioritaria más cercana a ti y a cuántos metros está.</w:t>
             </w:r>
           </w:p>
@@ -3744,7 +4026,7 @@
               <w:bottom w:val="single" w:color="C9C9C9" w:sz="4"/>
               <w:right w:val="single" w:color="C9C9C9" w:sz="4"/>
             </w:tcBorders>
-            <w:shd w:fill="F7F1F3" w:color="auto" w:val="clear"/>
+            <w:shd w:fill="FFFFFF" w:color="auto" w:val="clear"/>
             <w:tcMar>
               <w:top w:type="dxa" w:w="70"/>
               <w:left w:type="dxa" w:w="100"/>
@@ -3778,7 +4060,7 @@
               <w:bottom w:val="single" w:color="C9C9C9" w:sz="4"/>
               <w:right w:val="single" w:color="C9C9C9" w:sz="4"/>
             </w:tcBorders>
-            <w:shd w:fill="F7F1F3" w:color="auto" w:val="clear"/>
+            <w:shd w:fill="FFFFFF" w:color="auto" w:val="clear"/>
             <w:tcMar>
               <w:top w:type="dxa" w:w="70"/>
               <w:left w:type="dxa" w:w="100"/>
@@ -3821,6 +4103,498 @@
         <w:t xml:space="preserve">Nota: las vialidades primarias y de acceso controlado corresponden al Gobierno de la Ciudad. La asignación de cada frente a la alcaldía o al Gobierno Central es preliminar; la herramienta lo advierte.</w:t>
       </w:r>
     </w:p>
+    <w:p>
+      <w:pPr>
+        <w:spacing w:after="120" w:line="276"/>
+        <w:jc w:val="both"/>
+      </w:pPr>
+      <w:r>
+        <w:rPr>
+          <w:rFonts w:ascii="Roboto" w:cs="Roboto" w:eastAsia="Roboto" w:hAnsi="Roboto"/>
+          <w:color w:val="1A1A1A"/>
+          <w:sz w:val="20"/>
+          <w:szCs w:val="20"/>
+        </w:rPr>
+        <w:t xml:space="preserve">Acceso con cuenta. En el enlace de prueba (github.io) la herramienta no pide cuenta. Si la prueba se hace ya instalada en el servidor del SIA, con acceso restringido, la Secretaría da de alta a cada participante al menos un día antes y le entrega la contraseña temporal por un medio distinto del enlace. Antes de la tarea 1 se hace la tarea 0 de la tabla 4 y, al terminar, el cierre de sesión. No entran en la proporción de la tabla 5; se anotan en el formato de registro.</w:t>
+      </w:r>
+    </w:p>
+    <w:p>
+      <w:pPr>
+        <w:keepNext/>
+        <w:spacing w:after="100" w:before="160" w:line="240"/>
+      </w:pPr>
+      <w:r>
+        <w:rPr>
+          <w:rFonts w:ascii="Roboto" w:cs="Roboto" w:eastAsia="Roboto" w:hAnsi="Roboto"/>
+          <w:b/>
+          <w:bCs/>
+          <w:color w:val="9D2148"/>
+          <w:sz w:val="19"/>
+          <w:szCs w:val="19"/>
+        </w:rPr>
+        <w:t xml:space="preserve">Tabla 4. </w:t>
+      </w:r>
+      <w:r>
+        <w:rPr>
+          <w:rFonts w:ascii="Roboto" w:cs="Roboto" w:eastAsia="Roboto" w:hAnsi="Roboto"/>
+          <w:color w:val="1A1A1A"/>
+          <w:sz w:val="19"/>
+          <w:szCs w:val="19"/>
+        </w:rPr>
+        <w:t xml:space="preserve">Acceso con cuenta (solo si la prueba se hace en el servidor del SIA)</w:t>
+      </w:r>
+    </w:p>
+    <w:tbl>
+      <w:tblPr>
+        <w:tblW w:type="dxa" w:w="9972"/>
+        <w:tblBorders>
+          <w:top w:val="single" w:color="auto" w:sz="4"/>
+          <w:left w:val="single" w:color="auto" w:sz="4"/>
+          <w:bottom w:val="single" w:color="auto" w:sz="4"/>
+          <w:right w:val="single" w:color="auto" w:sz="4"/>
+          <w:insideH w:val="single" w:color="auto" w:sz="4"/>
+          <w:insideV w:val="single" w:color="auto" w:sz="4"/>
+        </w:tblBorders>
+      </w:tblPr>
+      <w:tblGrid>
+        <w:gridCol w:w="500"/>
+        <w:gridCol w:w="3300"/>
+        <w:gridCol w:w="2500"/>
+        <w:gridCol w:w="3672"/>
+      </w:tblGrid>
+      <w:tr>
+        <w:trPr>
+          <w:cantSplit/>
+          <w:tblHeader/>
+        </w:trPr>
+        <w:tc>
+          <w:tcPr>
+            <w:tcW w:type="dxa" w:w="500"/>
+            <w:tcBorders>
+              <w:top w:val="single" w:color="C9C9C9" w:sz="4"/>
+              <w:left w:val="single" w:color="C9C9C9" w:sz="4"/>
+              <w:bottom w:val="single" w:color="C9C9C9" w:sz="4"/>
+              <w:right w:val="single" w:color="C9C9C9" w:sz="4"/>
+            </w:tcBorders>
+            <w:shd w:fill="9D2148" w:color="auto" w:val="clear"/>
+            <w:tcMar>
+              <w:top w:type="dxa" w:w="70"/>
+              <w:left w:type="dxa" w:w="100"/>
+              <w:bottom w:type="dxa" w:w="70"/>
+              <w:right w:type="dxa" w:w="100"/>
+            </w:tcMar>
+            <w:vAlign w:val="center"/>
+          </w:tcPr>
+          <w:p>
+            <w:pPr>
+              <w:spacing w:after="30" w:line="250"/>
+              <w:jc w:val="left"/>
+            </w:pPr>
+            <w:r>
+              <w:rPr>
+                <w:rFonts w:ascii="Roboto" w:cs="Roboto" w:eastAsia="Roboto" w:hAnsi="Roboto"/>
+                <w:b/>
+                <w:bCs/>
+                <w:color w:val="FFFFFF"/>
+                <w:sz w:val="18"/>
+                <w:szCs w:val="18"/>
+              </w:rPr>
+              <w:t xml:space="preserve">#</w:t>
+            </w:r>
+          </w:p>
+        </w:tc>
+        <w:tc>
+          <w:tcPr>
+            <w:tcW w:type="dxa" w:w="3300"/>
+            <w:tcBorders>
+              <w:top w:val="single" w:color="C9C9C9" w:sz="4"/>
+              <w:left w:val="single" w:color="C9C9C9" w:sz="4"/>
+              <w:bottom w:val="single" w:color="C9C9C9" w:sz="4"/>
+              <w:right w:val="single" w:color="C9C9C9" w:sz="4"/>
+            </w:tcBorders>
+            <w:shd w:fill="9D2148" w:color="auto" w:val="clear"/>
+            <w:tcMar>
+              <w:top w:type="dxa" w:w="70"/>
+              <w:left w:type="dxa" w:w="100"/>
+              <w:bottom w:type="dxa" w:w="70"/>
+              <w:right w:type="dxa" w:w="100"/>
+            </w:tcMar>
+            <w:vAlign w:val="center"/>
+          </w:tcPr>
+          <w:p>
+            <w:pPr>
+              <w:spacing w:after="30" w:line="250"/>
+              <w:jc w:val="left"/>
+            </w:pPr>
+            <w:r>
+              <w:rPr>
+                <w:rFonts w:ascii="Roboto" w:cs="Roboto" w:eastAsia="Roboto" w:hAnsi="Roboto"/>
+                <w:b/>
+                <w:bCs/>
+                <w:color w:val="FFFFFF"/>
+                <w:sz w:val="18"/>
+                <w:szCs w:val="18"/>
+              </w:rPr>
+              <w:t xml:space="preserve">Tarea (se lee a la persona)</w:t>
+            </w:r>
+          </w:p>
+        </w:tc>
+        <w:tc>
+          <w:tcPr>
+            <w:tcW w:type="dxa" w:w="2500"/>
+            <w:tcBorders>
+              <w:top w:val="single" w:color="C9C9C9" w:sz="4"/>
+              <w:left w:val="single" w:color="C9C9C9" w:sz="4"/>
+              <w:bottom w:val="single" w:color="C9C9C9" w:sz="4"/>
+              <w:right w:val="single" w:color="C9C9C9" w:sz="4"/>
+            </w:tcBorders>
+            <w:shd w:fill="9D2148" w:color="auto" w:val="clear"/>
+            <w:tcMar>
+              <w:top w:type="dxa" w:w="70"/>
+              <w:left w:type="dxa" w:w="100"/>
+              <w:bottom w:type="dxa" w:w="70"/>
+              <w:right w:type="dxa" w:w="100"/>
+            </w:tcMar>
+            <w:vAlign w:val="center"/>
+          </w:tcPr>
+          <w:p>
+            <w:pPr>
+              <w:spacing w:after="30" w:line="250"/>
+              <w:jc w:val="left"/>
+            </w:pPr>
+            <w:r>
+              <w:rPr>
+                <w:rFonts w:ascii="Roboto" w:cs="Roboto" w:eastAsia="Roboto" w:hAnsi="Roboto"/>
+                <w:b/>
+                <w:bCs/>
+                <w:color w:val="FFFFFF"/>
+                <w:sz w:val="18"/>
+                <w:szCs w:val="18"/>
+              </w:rPr>
+              <w:t xml:space="preserve">Se cumple si…</w:t>
+            </w:r>
+          </w:p>
+        </w:tc>
+        <w:tc>
+          <w:tcPr>
+            <w:tcW w:type="dxa" w:w="3672"/>
+            <w:tcBorders>
+              <w:top w:val="single" w:color="C9C9C9" w:sz="4"/>
+              <w:left w:val="single" w:color="C9C9C9" w:sz="4"/>
+              <w:bottom w:val="single" w:color="C9C9C9" w:sz="4"/>
+              <w:right w:val="single" w:color="C9C9C9" w:sz="4"/>
+            </w:tcBorders>
+            <w:shd w:fill="9D2148" w:color="auto" w:val="clear"/>
+            <w:tcMar>
+              <w:top w:type="dxa" w:w="70"/>
+              <w:left w:type="dxa" w:w="100"/>
+              <w:bottom w:type="dxa" w:w="70"/>
+              <w:right w:type="dxa" w:w="100"/>
+            </w:tcMar>
+            <w:vAlign w:val="center"/>
+          </w:tcPr>
+          <w:p>
+            <w:pPr>
+              <w:spacing w:after="30" w:line="250"/>
+              <w:jc w:val="left"/>
+            </w:pPr>
+            <w:r>
+              <w:rPr>
+                <w:rFonts w:ascii="Roboto" w:cs="Roboto" w:eastAsia="Roboto" w:hAnsi="Roboto"/>
+                <w:b/>
+                <w:bCs/>
+                <w:color w:val="FFFFFF"/>
+                <w:sz w:val="18"/>
+                <w:szCs w:val="18"/>
+              </w:rPr>
+              <w:t xml:space="preserve">Qué observar</w:t>
+            </w:r>
+          </w:p>
+        </w:tc>
+      </w:tr>
+      <w:tr>
+        <w:trPr>
+          <w:cantSplit/>
+        </w:trPr>
+        <w:tc>
+          <w:tcPr>
+            <w:tcW w:type="dxa" w:w="500"/>
+            <w:tcBorders>
+              <w:top w:val="single" w:color="C9C9C9" w:sz="4"/>
+              <w:left w:val="single" w:color="C9C9C9" w:sz="4"/>
+              <w:bottom w:val="single" w:color="C9C9C9" w:sz="4"/>
+              <w:right w:val="single" w:color="C9C9C9" w:sz="4"/>
+            </w:tcBorders>
+            <w:shd w:fill="FFFFFF" w:color="auto" w:val="clear"/>
+            <w:tcMar>
+              <w:top w:type="dxa" w:w="70"/>
+              <w:left w:type="dxa" w:w="100"/>
+              <w:bottom w:type="dxa" w:w="70"/>
+              <w:right w:type="dxa" w:w="100"/>
+            </w:tcMar>
+            <w:vAlign w:val="top"/>
+          </w:tcPr>
+          <w:p>
+            <w:pPr>
+              <w:spacing w:after="30" w:line="250"/>
+              <w:jc w:val="left"/>
+            </w:pPr>
+            <w:r>
+              <w:rPr>
+                <w:rFonts w:ascii="Roboto" w:cs="Roboto" w:eastAsia="Roboto" w:hAnsi="Roboto"/>
+                <w:color w:val="1A1A1A"/>
+                <w:sz w:val="18"/>
+                <w:szCs w:val="18"/>
+              </w:rPr>
+              <w:t xml:space="preserve">0</w:t>
+            </w:r>
+          </w:p>
+        </w:tc>
+        <w:tc>
+          <w:tcPr>
+            <w:tcW w:type="dxa" w:w="3300"/>
+            <w:tcBorders>
+              <w:top w:val="single" w:color="C9C9C9" w:sz="4"/>
+              <w:left w:val="single" w:color="C9C9C9" w:sz="4"/>
+              <w:bottom w:val="single" w:color="C9C9C9" w:sz="4"/>
+              <w:right w:val="single" w:color="C9C9C9" w:sz="4"/>
+            </w:tcBorders>
+            <w:shd w:fill="FFFFFF" w:color="auto" w:val="clear"/>
+            <w:tcMar>
+              <w:top w:type="dxa" w:w="70"/>
+              <w:left w:type="dxa" w:w="100"/>
+              <w:bottom w:type="dxa" w:w="70"/>
+              <w:right w:type="dxa" w:w="100"/>
+            </w:tcMar>
+            <w:vAlign w:val="top"/>
+          </w:tcPr>
+          <w:p>
+            <w:pPr>
+              <w:spacing w:after="30" w:line="250"/>
+              <w:jc w:val="left"/>
+            </w:pPr>
+            <w:r>
+              <w:rPr>
+                <w:rFonts w:ascii="Roboto" w:cs="Roboto" w:eastAsia="Roboto" w:hAnsi="Roboto"/>
+                <w:color w:val="1A1A1A"/>
+                <w:sz w:val="18"/>
+                <w:szCs w:val="18"/>
+              </w:rPr>
+              <w:t xml:space="preserve">Entra a la herramienta con el correo y la contraseña temporal que te enviamos.</w:t>
+            </w:r>
+          </w:p>
+        </w:tc>
+        <w:tc>
+          <w:tcPr>
+            <w:tcW w:type="dxa" w:w="2500"/>
+            <w:tcBorders>
+              <w:top w:val="single" w:color="C9C9C9" w:sz="4"/>
+              <w:left w:val="single" w:color="C9C9C9" w:sz="4"/>
+              <w:bottom w:val="single" w:color="C9C9C9" w:sz="4"/>
+              <w:right w:val="single" w:color="C9C9C9" w:sz="4"/>
+            </w:tcBorders>
+            <w:shd w:fill="FFFFFF" w:color="auto" w:val="clear"/>
+            <w:tcMar>
+              <w:top w:type="dxa" w:w="70"/>
+              <w:left w:type="dxa" w:w="100"/>
+              <w:bottom w:type="dxa" w:w="70"/>
+              <w:right w:type="dxa" w:w="100"/>
+            </w:tcMar>
+            <w:vAlign w:val="top"/>
+          </w:tcPr>
+          <w:p>
+            <w:pPr>
+              <w:spacing w:after="30" w:line="250"/>
+              <w:jc w:val="left"/>
+            </w:pPr>
+            <w:r>
+              <w:rPr>
+                <w:rFonts w:ascii="Roboto" w:cs="Roboto" w:eastAsia="Roboto" w:hAnsi="Roboto"/>
+                <w:color w:val="1A1A1A"/>
+                <w:sz w:val="18"/>
+                <w:szCs w:val="18"/>
+              </w:rPr>
+              <w:t xml:space="preserve">Crea su contraseña (al menos 12 caracteres) y llega a la ventana de entrada de la herramienta.</w:t>
+            </w:r>
+          </w:p>
+        </w:tc>
+        <w:tc>
+          <w:tcPr>
+            <w:tcW w:type="dxa" w:w="3672"/>
+            <w:tcBorders>
+              <w:top w:val="single" w:color="C9C9C9" w:sz="4"/>
+              <w:left w:val="single" w:color="C9C9C9" w:sz="4"/>
+              <w:bottom w:val="single" w:color="C9C9C9" w:sz="4"/>
+              <w:right w:val="single" w:color="C9C9C9" w:sz="4"/>
+            </w:tcBorders>
+            <w:shd w:fill="FFFFFF" w:color="auto" w:val="clear"/>
+            <w:tcMar>
+              <w:top w:type="dxa" w:w="70"/>
+              <w:left w:type="dxa" w:w="100"/>
+              <w:bottom w:type="dxa" w:w="70"/>
+              <w:right w:type="dxa" w:w="100"/>
+            </w:tcMar>
+            <w:vAlign w:val="top"/>
+          </w:tcPr>
+          <w:p>
+            <w:pPr>
+              <w:spacing w:after="30" w:line="250"/>
+              <w:jc w:val="left"/>
+            </w:pPr>
+            <w:r>
+              <w:rPr>
+                <w:rFonts w:ascii="Roboto" w:cs="Roboto" w:eastAsia="Roboto" w:hAnsi="Roboto"/>
+                <w:color w:val="1A1A1A"/>
+                <w:sz w:val="18"/>
+                <w:szCs w:val="18"/>
+              </w:rPr>
+              <w:t xml:space="preserve">Si escribe bien el correo (personal o institucional). Si entiende por qué se le pide crear una contraseña y la regla de 12 caracteres. Si usa «Mostrar». Si lee o pregunta por el aviso de privacidad. Segundos hasta ver la herramienta.</w:t>
+            </w:r>
+          </w:p>
+        </w:tc>
+      </w:tr>
+      <w:tr>
+        <w:trPr>
+          <w:cantSplit/>
+        </w:trPr>
+        <w:tc>
+          <w:tcPr>
+            <w:tcW w:type="dxa" w:w="500"/>
+            <w:tcBorders>
+              <w:top w:val="single" w:color="C9C9C9" w:sz="4"/>
+              <w:left w:val="single" w:color="C9C9C9" w:sz="4"/>
+              <w:bottom w:val="single" w:color="C9C9C9" w:sz="4"/>
+              <w:right w:val="single" w:color="C9C9C9" w:sz="4"/>
+            </w:tcBorders>
+            <w:shd w:fill="F7F1F3" w:color="auto" w:val="clear"/>
+            <w:tcMar>
+              <w:top w:type="dxa" w:w="70"/>
+              <w:left w:type="dxa" w:w="100"/>
+              <w:bottom w:type="dxa" w:w="70"/>
+              <w:right w:type="dxa" w:w="100"/>
+            </w:tcMar>
+            <w:vAlign w:val="top"/>
+          </w:tcPr>
+          <w:p>
+            <w:pPr>
+              <w:spacing w:after="30" w:line="250"/>
+              <w:jc w:val="left"/>
+            </w:pPr>
+            <w:r>
+              <w:rPr>
+                <w:rFonts w:ascii="Roboto" w:cs="Roboto" w:eastAsia="Roboto" w:hAnsi="Roboto"/>
+                <w:color w:val="1A1A1A"/>
+                <w:sz w:val="18"/>
+                <w:szCs w:val="18"/>
+              </w:rPr>
+              <w:t xml:space="preserve">Al final</w:t>
+            </w:r>
+          </w:p>
+        </w:tc>
+        <w:tc>
+          <w:tcPr>
+            <w:tcW w:type="dxa" w:w="3300"/>
+            <w:tcBorders>
+              <w:top w:val="single" w:color="C9C9C9" w:sz="4"/>
+              <w:left w:val="single" w:color="C9C9C9" w:sz="4"/>
+              <w:bottom w:val="single" w:color="C9C9C9" w:sz="4"/>
+              <w:right w:val="single" w:color="C9C9C9" w:sz="4"/>
+            </w:tcBorders>
+            <w:shd w:fill="F7F1F3" w:color="auto" w:val="clear"/>
+            <w:tcMar>
+              <w:top w:type="dxa" w:w="70"/>
+              <w:left w:type="dxa" w:w="100"/>
+              <w:bottom w:type="dxa" w:w="70"/>
+              <w:right w:type="dxa" w:w="100"/>
+            </w:tcMar>
+            <w:vAlign w:val="top"/>
+          </w:tcPr>
+          <w:p>
+            <w:pPr>
+              <w:spacing w:after="30" w:line="250"/>
+              <w:jc w:val="left"/>
+            </w:pPr>
+            <w:r>
+              <w:rPr>
+                <w:rFonts w:ascii="Roboto" w:cs="Roboto" w:eastAsia="Roboto" w:hAnsi="Roboto"/>
+                <w:color w:val="1A1A1A"/>
+                <w:sz w:val="18"/>
+                <w:szCs w:val="18"/>
+              </w:rPr>
+              <w:t xml:space="preserve">Cierra tu sesión.</w:t>
+            </w:r>
+          </w:p>
+        </w:tc>
+        <w:tc>
+          <w:tcPr>
+            <w:tcW w:type="dxa" w:w="2500"/>
+            <w:tcBorders>
+              <w:top w:val="single" w:color="C9C9C9" w:sz="4"/>
+              <w:left w:val="single" w:color="C9C9C9" w:sz="4"/>
+              <w:bottom w:val="single" w:color="C9C9C9" w:sz="4"/>
+              <w:right w:val="single" w:color="C9C9C9" w:sz="4"/>
+            </w:tcBorders>
+            <w:shd w:fill="F7F1F3" w:color="auto" w:val="clear"/>
+            <w:tcMar>
+              <w:top w:type="dxa" w:w="70"/>
+              <w:left w:type="dxa" w:w="100"/>
+              <w:bottom w:type="dxa" w:w="70"/>
+              <w:right w:type="dxa" w:w="100"/>
+            </w:tcMar>
+            <w:vAlign w:val="top"/>
+          </w:tcPr>
+          <w:p>
+            <w:pPr>
+              <w:spacing w:after="30" w:line="250"/>
+              <w:jc w:val="left"/>
+            </w:pPr>
+            <w:r>
+              <w:rPr>
+                <w:rFonts w:ascii="Roboto" w:cs="Roboto" w:eastAsia="Roboto" w:hAnsi="Roboto"/>
+                <w:color w:val="1A1A1A"/>
+                <w:sz w:val="18"/>
+                <w:szCs w:val="18"/>
+              </w:rPr>
+              <w:t xml:space="preserve">Toca «Salir», junto a los logotipos, y vuelve a la pantalla de acceso.</w:t>
+            </w:r>
+          </w:p>
+        </w:tc>
+        <w:tc>
+          <w:tcPr>
+            <w:tcW w:type="dxa" w:w="3672"/>
+            <w:tcBorders>
+              <w:top w:val="single" w:color="C9C9C9" w:sz="4"/>
+              <w:left w:val="single" w:color="C9C9C9" w:sz="4"/>
+              <w:bottom w:val="single" w:color="C9C9C9" w:sz="4"/>
+              <w:right w:val="single" w:color="C9C9C9" w:sz="4"/>
+            </w:tcBorders>
+            <w:shd w:fill="F7F1F3" w:color="auto" w:val="clear"/>
+            <w:tcMar>
+              <w:top w:type="dxa" w:w="70"/>
+              <w:left w:type="dxa" w:w="100"/>
+              <w:bottom w:type="dxa" w:w="70"/>
+              <w:right w:type="dxa" w:w="100"/>
+            </w:tcMar>
+            <w:vAlign w:val="top"/>
+          </w:tcPr>
+          <w:p>
+            <w:pPr>
+              <w:spacing w:after="30" w:line="250"/>
+              <w:jc w:val="left"/>
+            </w:pPr>
+            <w:r>
+              <w:rPr>
+                <w:rFonts w:ascii="Roboto" w:cs="Roboto" w:eastAsia="Roboto" w:hAnsi="Roboto"/>
+                <w:color w:val="1A1A1A"/>
+                <w:sz w:val="18"/>
+                <w:szCs w:val="18"/>
+              </w:rPr>
+              <w:t xml:space="preserve">Si encuentra «Salir» sin ayuda. Si intenta usar «Compartir» con alguien sin cuenta: la herramienta avisa que para abrir el enlace se necesita una cuenta.</w:t>
+            </w:r>
+          </w:p>
+        </w:tc>
+      </w:tr>
+    </w:tbl>
     <w:p>
       <w:pPr>
         <w:keepNext/>
@@ -4082,7 +4856,7 @@
           <w:sz w:val="19"/>
           <w:szCs w:val="19"/>
         </w:rPr>
-        <w:t xml:space="preserve">Tabla 4. </w:t>
+        <w:t xml:space="preserve">Tabla 5. </w:t>
       </w:r>
       <w:r>
         <w:rPr>
@@ -4855,7 +5629,7 @@
           <w:sz w:val="19"/>
           <w:szCs w:val="19"/>
         </w:rPr>
-        <w:t xml:space="preserve">Tabla 5. </w:t>
+        <w:t xml:space="preserve">Tabla 6. </w:t>
       </w:r>
       <w:r>
         <w:rPr>
@@ -5214,7 +5988,7 @@
                 <w:sz w:val="18"/>
                 <w:szCs w:val="18"/>
               </w:rPr>
-              <w:t xml:space="preserve">El aviso de ubicación aproximada aparece en la mitad o más de las pruebas de la tarea 8</w:t>
+              <w:t xml:space="preserve">El aviso de ubicación aproximada aparece en la mitad o más de las pruebas de la tarea 9</w:t>
             </w:r>
           </w:p>
         </w:tc>
@@ -5249,6 +6023,79 @@
                 <w:szCs w:val="18"/>
               </w:rPr>
               <w:t xml:space="preserve">Revisar el umbral de precisión (100 m) y el texto del aviso.</w:t>
+            </w:r>
+          </w:p>
+        </w:tc>
+      </w:tr>
+      <w:tr>
+        <w:trPr>
+          <w:cantSplit/>
+        </w:trPr>
+        <w:tc>
+          <w:tcPr>
+            <w:tcW w:type="dxa" w:w="4500"/>
+            <w:tcBorders>
+              <w:top w:val="single" w:color="C9C9C9" w:sz="4"/>
+              <w:left w:val="single" w:color="C9C9C9" w:sz="4"/>
+              <w:bottom w:val="single" w:color="C9C9C9" w:sz="4"/>
+              <w:right w:val="single" w:color="C9C9C9" w:sz="4"/>
+            </w:tcBorders>
+            <w:shd w:fill="FFFFFF" w:color="auto" w:val="clear"/>
+            <w:tcMar>
+              <w:top w:type="dxa" w:w="70"/>
+              <w:left w:type="dxa" w:w="100"/>
+              <w:bottom w:type="dxa" w:w="70"/>
+              <w:right w:type="dxa" w:w="100"/>
+            </w:tcMar>
+            <w:vAlign w:val="top"/>
+          </w:tcPr>
+          <w:p>
+            <w:pPr>
+              <w:spacing w:after="30" w:line="250"/>
+              <w:jc w:val="left"/>
+            </w:pPr>
+            <w:r>
+              <w:rPr>
+                <w:rFonts w:ascii="Roboto" w:cs="Roboto" w:eastAsia="Roboto" w:hAnsi="Roboto"/>
+                <w:color w:val="1A1A1A"/>
+                <w:sz w:val="18"/>
+                <w:szCs w:val="18"/>
+              </w:rPr>
+              <w:t xml:space="preserve">La mitad o más deja el recorrido guiado antes del paso «Banqueta»</w:t>
+            </w:r>
+          </w:p>
+        </w:tc>
+        <w:tc>
+          <w:tcPr>
+            <w:tcW w:type="dxa" w:w="5472"/>
+            <w:tcBorders>
+              <w:top w:val="single" w:color="C9C9C9" w:sz="4"/>
+              <w:left w:val="single" w:color="C9C9C9" w:sz="4"/>
+              <w:bottom w:val="single" w:color="C9C9C9" w:sz="4"/>
+              <w:right w:val="single" w:color="C9C9C9" w:sz="4"/>
+            </w:tcBorders>
+            <w:shd w:fill="FFFFFF" w:color="auto" w:val="clear"/>
+            <w:tcMar>
+              <w:top w:type="dxa" w:w="70"/>
+              <w:left w:type="dxa" w:w="100"/>
+              <w:bottom w:type="dxa" w:w="70"/>
+              <w:right w:type="dxa" w:w="100"/>
+            </w:tcMar>
+            <w:vAlign w:val="top"/>
+          </w:tcPr>
+          <w:p>
+            <w:pPr>
+              <w:spacing w:after="30" w:line="250"/>
+              <w:jc w:val="left"/>
+            </w:pPr>
+            <w:r>
+              <w:rPr>
+                <w:rFonts w:ascii="Roboto" w:cs="Roboto" w:eastAsia="Roboto" w:hAnsi="Roboto"/>
+                <w:color w:val="1A1A1A"/>
+                <w:sz w:val="18"/>
+                <w:szCs w:val="18"/>
+              </w:rPr>
+              <w:t xml:space="preserve">Acortar el recorrido o adelantar ese paso.</w:t>
             </w:r>
           </w:p>
         </w:tc>
@@ -5323,7 +6170,7 @@
           <w:sz w:val="20"/>
           <w:szCs w:val="20"/>
         </w:rPr>
-        <w:t xml:space="preserve">Capturas de la versión 17.30 en un teléfono de 390 × 844. Sirven para que el moderador reconozca a qué pantalla debe llegar la persona en cada tarea; no se muestran al participante.</w:t>
+        <w:t xml:space="preserve">Capturas de la versión 17.38 en un teléfono de 390 × 844. Sirven para que el moderador reconozca a qué pantalla debe llegar la persona en cada tarea; no se muestran al participante.</w:t>
       </w:r>
     </w:p>
     <w:tbl>
@@ -5462,7 +6309,7 @@
                 <wp:inline distT="0" distB="0" distL="0" distR="0">
                   <wp:extent cx="1314450" cy="2847975"/>
                   <wp:effectExtent t="0" r="0" b="0" l="0"/>
-                  <wp:docPr id="1" name="" descr="" title=""/>
+                  <wp:docPr id="2" name="" descr="" title=""/>
                   <wp:cNvGraphicFramePr>
                     <a:graphicFrameLocks xmlns:a="http://schemas.openxmlformats.org/drawingml/2006/main" noChangeAspect="1"/>
                   </wp:cNvGraphicFramePr>
@@ -5551,7 +6398,7 @@
                 <wp:inline distT="0" distB="0" distL="0" distR="0">
                   <wp:extent cx="1314450" cy="2847975"/>
                   <wp:effectExtent t="0" r="0" b="0" l="0"/>
-                  <wp:docPr id="1" name="" descr="" title=""/>
+                  <wp:docPr id="3" name="" descr="" title=""/>
                   <wp:cNvGraphicFramePr>
                     <a:graphicFrameLocks xmlns:a="http://schemas.openxmlformats.org/drawingml/2006/main" noChangeAspect="1"/>
                   </wp:cNvGraphicFramePr>
@@ -5654,7 +6501,7 @@
           <w:sz w:val="18"/>
           <w:szCs w:val="18"/>
         </w:rPr>
-        <w:t xml:space="preserve">Fuente: herramienta «Calles prioritarias para reforestar», versión 17.30, teléfono simulado de 390 × 844, 4 de octubre de 2026.</w:t>
+        <w:t xml:space="preserve">Fuente: herramienta «Calles prioritarias para reforestar», versión 17.38, teléfono simulado de 390 × 844, 5 de octubre de 2026.</w:t>
       </w:r>
     </w:p>
     <w:tbl>
@@ -5704,7 +6551,7 @@
                 <wp:inline distT="0" distB="0" distL="0" distR="0">
                   <wp:extent cx="1314450" cy="2847975"/>
                   <wp:effectExtent t="0" r="0" b="0" l="0"/>
-                  <wp:docPr id="1" name="" descr="" title=""/>
+                  <wp:docPr id="4" name="" descr="" title=""/>
                   <wp:cNvGraphicFramePr>
                     <a:graphicFrameLocks xmlns:a="http://schemas.openxmlformats.org/drawingml/2006/main" noChangeAspect="1"/>
                   </wp:cNvGraphicFramePr>
@@ -5793,7 +6640,7 @@
                 <wp:inline distT="0" distB="0" distL="0" distR="0">
                   <wp:extent cx="1314450" cy="2847975"/>
                   <wp:effectExtent t="0" r="0" b="0" l="0"/>
-                  <wp:docPr id="1" name="" descr="" title=""/>
+                  <wp:docPr id="5" name="" descr="" title=""/>
                   <wp:cNvGraphicFramePr>
                     <a:graphicFrameLocks xmlns:a="http://schemas.openxmlformats.org/drawingml/2006/main" noChangeAspect="1"/>
                   </wp:cNvGraphicFramePr>
@@ -5882,7 +6729,7 @@
                 <wp:inline distT="0" distB="0" distL="0" distR="0">
                   <wp:extent cx="1314450" cy="2847975"/>
                   <wp:effectExtent t="0" r="0" b="0" l="0"/>
-                  <wp:docPr id="1" name="" descr="" title=""/>
+                  <wp:docPr id="6" name="" descr="" title=""/>
                   <wp:cNvGraphicFramePr>
                     <a:graphicFrameLocks xmlns:a="http://schemas.openxmlformats.org/drawingml/2006/main" noChangeAspect="1"/>
                   </wp:cNvGraphicFramePr>
@@ -5985,7 +6832,7 @@
           <w:sz w:val="18"/>
           <w:szCs w:val="18"/>
         </w:rPr>
-        <w:t xml:space="preserve">Fuente: herramienta «Calles prioritarias para reforestar», versión 17.30, teléfono simulado de 390 × 844, 4 de octubre de 2026.</w:t>
+        <w:t xml:space="preserve">Fuente: herramienta «Calles prioritarias para reforestar», versión 17.38, teléfono simulado de 390 × 844, 5 de octubre de 2026.</w:t>
       </w:r>
     </w:p>
     <w:tbl>
@@ -6035,7 +6882,7 @@
                 <wp:inline distT="0" distB="0" distL="0" distR="0">
                   <wp:extent cx="1314450" cy="2847975"/>
                   <wp:effectExtent t="0" r="0" b="0" l="0"/>
-                  <wp:docPr id="1" name="" descr="" title=""/>
+                  <wp:docPr id="7" name="" descr="" title=""/>
                   <wp:cNvGraphicFramePr>
                     <a:graphicFrameLocks xmlns:a="http://schemas.openxmlformats.org/drawingml/2006/main" noChangeAspect="1"/>
                   </wp:cNvGraphicFramePr>
@@ -6124,7 +6971,7 @@
                 <wp:inline distT="0" distB="0" distL="0" distR="0">
                   <wp:extent cx="1314450" cy="2847975"/>
                   <wp:effectExtent t="0" r="0" b="0" l="0"/>
-                  <wp:docPr id="1" name="" descr="" title=""/>
+                  <wp:docPr id="8" name="" descr="" title=""/>
                   <wp:cNvGraphicFramePr>
                     <a:graphicFrameLocks xmlns:a="http://schemas.openxmlformats.org/drawingml/2006/main" noChangeAspect="1"/>
                   </wp:cNvGraphicFramePr>
@@ -6213,7 +7060,7 @@
                 <wp:inline distT="0" distB="0" distL="0" distR="0">
                   <wp:extent cx="1314450" cy="2847975"/>
                   <wp:effectExtent t="0" r="0" b="0" l="0"/>
-                  <wp:docPr id="1" name="" descr="" title=""/>
+                  <wp:docPr id="9" name="" descr="" title=""/>
                   <wp:cNvGraphicFramePr>
                     <a:graphicFrameLocks xmlns:a="http://schemas.openxmlformats.org/drawingml/2006/main" noChangeAspect="1"/>
                   </wp:cNvGraphicFramePr>
@@ -6316,7 +7163,7 @@
           <w:sz w:val="18"/>
           <w:szCs w:val="18"/>
         </w:rPr>
-        <w:t xml:space="preserve">Fuente: herramienta «Calles prioritarias para reforestar», versión 17.30, teléfono simulado de 390 × 844, 4 de octubre de 2026.</w:t>
+        <w:t xml:space="preserve">Fuente: herramienta «Calles prioritarias para reforestar», versión 17.38, teléfono simulado de 390 × 844, 5 de octubre de 2026.</w:t>
       </w:r>
     </w:p>
     <w:tbl>
@@ -6366,7 +7213,7 @@
                 <wp:inline distT="0" distB="0" distL="0" distR="0">
                   <wp:extent cx="1314450" cy="2847975"/>
                   <wp:effectExtent t="0" r="0" b="0" l="0"/>
-                  <wp:docPr id="1" name="" descr="" title=""/>
+                  <wp:docPr id="10" name="" descr="" title=""/>
                   <wp:cNvGraphicFramePr>
                     <a:graphicFrameLocks xmlns:a="http://schemas.openxmlformats.org/drawingml/2006/main" noChangeAspect="1"/>
                   </wp:cNvGraphicFramePr>
@@ -6425,7 +7272,7 @@
                 <w:sz w:val="17"/>
                 <w:szCs w:val="17"/>
               </w:rPr>
-              <w:t xml:space="preserve"> Tarea 8: Mi ubicación y calles prioritarias cercanas.</w:t>
+              <w:t xml:space="preserve"> Tarea 9: Mi ubicación y calles prioritarias cercanas.</w:t>
             </w:r>
           </w:p>
         </w:tc>
@@ -6455,7 +7302,7 @@
                 <wp:inline distT="0" distB="0" distL="0" distR="0">
                   <wp:extent cx="1314450" cy="2847975"/>
                   <wp:effectExtent t="0" r="0" b="0" l="0"/>
-                  <wp:docPr id="1" name="" descr="" title=""/>
+                  <wp:docPr id="11" name="" descr="" title=""/>
                   <wp:cNvGraphicFramePr>
                     <a:graphicFrameLocks xmlns:a="http://schemas.openxmlformats.org/drawingml/2006/main" noChangeAspect="1"/>
                   </wp:cNvGraphicFramePr>
@@ -6544,7 +7391,7 @@
                 <wp:inline distT="0" distB="0" distL="0" distR="0">
                   <wp:extent cx="1314450" cy="2847975"/>
                   <wp:effectExtent t="0" r="0" b="0" l="0"/>
-                  <wp:docPr id="1" name="" descr="" title=""/>
+                  <wp:docPr id="12" name="" descr="" title=""/>
                   <wp:cNvGraphicFramePr>
                     <a:graphicFrameLocks xmlns:a="http://schemas.openxmlformats.org/drawingml/2006/main" noChangeAspect="1"/>
                   </wp:cNvGraphicFramePr>
@@ -6647,7 +7494,669 @@
           <w:sz w:val="18"/>
           <w:szCs w:val="18"/>
         </w:rPr>
-        <w:t xml:space="preserve">Fuente: herramienta «Calles prioritarias para reforestar», versión 17.30, teléfono simulado de 390 × 844, 4 de octubre de 2026.</w:t>
+        <w:t xml:space="preserve">Fuente: herramienta «Calles prioritarias para reforestar», versión 17.38, teléfono simulado de 390 × 844, 5 de octubre de 2026.</w:t>
+      </w:r>
+    </w:p>
+    <w:tbl>
+      <w:tblPr>
+        <w:tblW w:type="dxa" w:w="9972"/>
+        <w:tblBorders>
+          <w:top w:val="none" w:color="FFFFFF" w:sz="0"/>
+          <w:left w:val="none" w:color="FFFFFF" w:sz="0"/>
+          <w:bottom w:val="none" w:color="FFFFFF" w:sz="0"/>
+          <w:right w:val="none" w:color="FFFFFF" w:sz="0"/>
+          <w:insideH w:val="none" w:color="FFFFFF" w:sz="0"/>
+          <w:insideV w:val="none" w:color="FFFFFF" w:sz="0"/>
+        </w:tblBorders>
+      </w:tblPr>
+      <w:tblGrid>
+        <w:gridCol w:w="3324"/>
+        <w:gridCol w:w="3324"/>
+        <w:gridCol w:w="3324"/>
+      </w:tblGrid>
+      <w:tr>
+        <w:trPr>
+          <w:cantSplit/>
+        </w:trPr>
+        <w:tc>
+          <w:tcPr>
+            <w:tcW w:type="dxa" w:w="3324"/>
+            <w:tcBorders>
+              <w:top w:val="none" w:color="FFFFFF" w:sz="0"/>
+              <w:left w:val="none" w:color="FFFFFF" w:sz="0"/>
+              <w:bottom w:val="none" w:color="FFFFFF" w:sz="0"/>
+              <w:right w:val="none" w:color="FFFFFF" w:sz="0"/>
+            </w:tcBorders>
+            <w:tcMar>
+              <w:top w:type="dxa" w:w="40"/>
+              <w:left w:type="dxa" w:w="60"/>
+              <w:bottom w:type="dxa" w:w="40"/>
+              <w:right w:type="dxa" w:w="60"/>
+            </w:tcMar>
+          </w:tcPr>
+          <w:p>
+            <w:pPr>
+              <w:spacing w:after="40"/>
+              <w:jc w:val="center"/>
+            </w:pPr>
+            <w:r>
+              <w:drawing>
+                <wp:inline distT="0" distB="0" distL="0" distR="0">
+                  <wp:extent cx="1314450" cy="2847975"/>
+                  <wp:effectExtent t="0" r="0" b="0" l="0"/>
+                  <wp:docPr id="13" name="" descr="" title=""/>
+                  <wp:cNvGraphicFramePr>
+                    <a:graphicFrameLocks xmlns:a="http://schemas.openxmlformats.org/drawingml/2006/main" noChangeAspect="1"/>
+                  </wp:cNvGraphicFramePr>
+                  <a:graphic xmlns:a="http://schemas.openxmlformats.org/drawingml/2006/main">
+                    <a:graphicData uri="http://schemas.openxmlformats.org/drawingml/2006/picture">
+                      <pic:pic xmlns:pic="http://schemas.openxmlformats.org/drawingml/2006/picture">
+                        <pic:nvPicPr>
+                          <pic:cNvPr id="0" name="" descr=""/>
+                          <pic:cNvPicPr>
+                            <a:picLocks noChangeAspect="1" noChangeArrowheads="1"/>
+                          </pic:cNvPicPr>
+                        </pic:nvPicPr>
+                        <pic:blipFill>
+                          <a:blip r:embed="rId100" cstate="none"/>
+                          <a:srcRect/>
+                          <a:stretch>
+                            <a:fillRect/>
+                          </a:stretch>
+                        </pic:blipFill>
+                        <pic:spPr bwMode="auto">
+                          <a:xfrm>
+                            <a:off x="0" y="0"/>
+                            <a:ext cx="1314450" cy="2847975"/>
+                          </a:xfrm>
+                          <a:prstGeom prst="rect">
+                            <a:avLst/>
+                          </a:prstGeom>
+                        </pic:spPr>
+                      </pic:pic>
+                    </a:graphicData>
+                  </a:graphic>
+                </wp:inline>
+              </w:drawing>
+            </w:r>
+          </w:p>
+          <w:p>
+            <w:pPr>
+              <w:spacing w:after="0" w:line="230"/>
+              <w:jc w:val="center"/>
+            </w:pPr>
+            <w:r>
+              <w:rPr>
+                <w:rFonts w:ascii="Roboto" w:cs="Roboto" w:eastAsia="Roboto" w:hAnsi="Roboto"/>
+                <w:b/>
+                <w:bCs/>
+                <w:color w:val="55585A"/>
+                <w:sz w:val="17"/>
+                <w:szCs w:val="17"/>
+              </w:rPr>
+              <w:t xml:space="preserve">m)</w:t>
+            </w:r>
+            <w:r>
+              <w:rPr>
+                <w:rFonts w:ascii="Roboto" w:cs="Roboto" w:eastAsia="Roboto" w:hAnsi="Roboto"/>
+                <w:color w:val="55585A"/>
+                <w:sz w:val="17"/>
+                <w:szCs w:val="17"/>
+              </w:rPr>
+              <w:t xml:space="preserve"> Tarea 1: el recorrido guiado arranca solo en la primera visita (paso «Banqueta»).</w:t>
+            </w:r>
+          </w:p>
+        </w:tc>
+        <w:tc>
+          <w:tcPr>
+            <w:tcW w:type="dxa" w:w="3324"/>
+            <w:tcBorders>
+              <w:top w:val="none" w:color="FFFFFF" w:sz="0"/>
+              <w:left w:val="none" w:color="FFFFFF" w:sz="0"/>
+              <w:bottom w:val="none" w:color="FFFFFF" w:sz="0"/>
+              <w:right w:val="none" w:color="FFFFFF" w:sz="0"/>
+            </w:tcBorders>
+            <w:tcMar>
+              <w:top w:type="dxa" w:w="40"/>
+              <w:left w:type="dxa" w:w="60"/>
+              <w:bottom w:type="dxa" w:w="40"/>
+              <w:right w:type="dxa" w:w="60"/>
+            </w:tcMar>
+          </w:tcPr>
+          <w:p>
+            <w:pPr>
+              <w:spacing w:after="40"/>
+              <w:jc w:val="center"/>
+            </w:pPr>
+            <w:r>
+              <w:drawing>
+                <wp:inline distT="0" distB="0" distL="0" distR="0">
+                  <wp:extent cx="1314450" cy="2847975"/>
+                  <wp:effectExtent t="0" r="0" b="0" l="0"/>
+                  <wp:docPr id="14" name="" descr="" title=""/>
+                  <wp:cNvGraphicFramePr>
+                    <a:graphicFrameLocks xmlns:a="http://schemas.openxmlformats.org/drawingml/2006/main" noChangeAspect="1"/>
+                  </wp:cNvGraphicFramePr>
+                  <a:graphic xmlns:a="http://schemas.openxmlformats.org/drawingml/2006/main">
+                    <a:graphicData uri="http://schemas.openxmlformats.org/drawingml/2006/picture">
+                      <pic:pic xmlns:pic="http://schemas.openxmlformats.org/drawingml/2006/picture">
+                        <pic:nvPicPr>
+                          <pic:cNvPr id="0" name="" descr=""/>
+                          <pic:cNvPicPr>
+                            <a:picLocks noChangeAspect="1" noChangeArrowheads="1"/>
+                          </pic:cNvPicPr>
+                        </pic:nvPicPr>
+                        <pic:blipFill>
+                          <a:blip r:embed="rId101" cstate="none"/>
+                          <a:srcRect/>
+                          <a:stretch>
+                            <a:fillRect/>
+                          </a:stretch>
+                        </pic:blipFill>
+                        <pic:spPr bwMode="auto">
+                          <a:xfrm>
+                            <a:off x="0" y="0"/>
+                            <a:ext cx="1314450" cy="2847975"/>
+                          </a:xfrm>
+                          <a:prstGeom prst="rect">
+                            <a:avLst/>
+                          </a:prstGeom>
+                        </pic:spPr>
+                      </pic:pic>
+                    </a:graphicData>
+                  </a:graphic>
+                </wp:inline>
+              </w:drawing>
+            </w:r>
+          </w:p>
+          <w:p>
+            <w:pPr>
+              <w:spacing w:after="0" w:line="230"/>
+              <w:jc w:val="center"/>
+            </w:pPr>
+            <w:r>
+              <w:rPr>
+                <w:rFonts w:ascii="Roboto" w:cs="Roboto" w:eastAsia="Roboto" w:hAnsi="Roboto"/>
+                <w:b/>
+                <w:bCs/>
+                <w:color w:val="55585A"/>
+                <w:sz w:val="17"/>
+                <w:szCs w:val="17"/>
+              </w:rPr>
+              <w:t xml:space="preserve">n)</w:t>
+            </w:r>
+            <w:r>
+              <w:rPr>
+                <w:rFonts w:ascii="Roboto" w:cs="Roboto" w:eastAsia="Roboto" w:hAnsi="Roboto"/>
+                <w:color w:val="55585A"/>
+                <w:sz w:val="17"/>
+                <w:szCs w:val="17"/>
+              </w:rPr>
+              <w:t xml:space="preserve"> Tarea 8: «Sin o por verificar» elegido; el recuadro del mapa cambia.</w:t>
+            </w:r>
+          </w:p>
+        </w:tc>
+        <w:tc>
+          <w:tcPr>
+            <w:tcW w:type="dxa" w:w="3324"/>
+            <w:tcBorders>
+              <w:top w:val="none" w:color="FFFFFF" w:sz="0"/>
+              <w:left w:val="none" w:color="FFFFFF" w:sz="0"/>
+              <w:bottom w:val="none" w:color="FFFFFF" w:sz="0"/>
+              <w:right w:val="none" w:color="FFFFFF" w:sz="0"/>
+            </w:tcBorders>
+            <w:tcMar>
+              <w:top w:type="dxa" w:w="40"/>
+              <w:left w:type="dxa" w:w="60"/>
+              <w:bottom w:type="dxa" w:w="40"/>
+              <w:right w:type="dxa" w:w="60"/>
+            </w:tcMar>
+          </w:tcPr>
+          <w:p>
+            <w:pPr>
+              <w:spacing w:after="40"/>
+              <w:jc w:val="center"/>
+            </w:pPr>
+            <w:r>
+              <w:drawing>
+                <wp:inline distT="0" distB="0" distL="0" distR="0">
+                  <wp:extent cx="1314450" cy="2847975"/>
+                  <wp:effectExtent t="0" r="0" b="0" l="0"/>
+                  <wp:docPr id="15" name="" descr="" title=""/>
+                  <wp:cNvGraphicFramePr>
+                    <a:graphicFrameLocks xmlns:a="http://schemas.openxmlformats.org/drawingml/2006/main" noChangeAspect="1"/>
+                  </wp:cNvGraphicFramePr>
+                  <a:graphic xmlns:a="http://schemas.openxmlformats.org/drawingml/2006/main">
+                    <a:graphicData uri="http://schemas.openxmlformats.org/drawingml/2006/picture">
+                      <pic:pic xmlns:pic="http://schemas.openxmlformats.org/drawingml/2006/picture">
+                        <pic:nvPicPr>
+                          <pic:cNvPr id="0" name="" descr=""/>
+                          <pic:cNvPicPr>
+                            <a:picLocks noChangeAspect="1" noChangeArrowheads="1"/>
+                          </pic:cNvPicPr>
+                        </pic:nvPicPr>
+                        <pic:blipFill>
+                          <a:blip r:embed="rId102" cstate="none"/>
+                          <a:srcRect/>
+                          <a:stretch>
+                            <a:fillRect/>
+                          </a:stretch>
+                        </pic:blipFill>
+                        <pic:spPr bwMode="auto">
+                          <a:xfrm>
+                            <a:off x="0" y="0"/>
+                            <a:ext cx="1314450" cy="2847975"/>
+                          </a:xfrm>
+                          <a:prstGeom prst="rect">
+                            <a:avLst/>
+                          </a:prstGeom>
+                        </pic:spPr>
+                      </pic:pic>
+                    </a:graphicData>
+                  </a:graphic>
+                </wp:inline>
+              </w:drawing>
+            </w:r>
+          </w:p>
+          <w:p>
+            <w:pPr>
+              <w:spacing w:after="0" w:line="230"/>
+              <w:jc w:val="center"/>
+            </w:pPr>
+            <w:r>
+              <w:rPr>
+                <w:rFonts w:ascii="Roboto" w:cs="Roboto" w:eastAsia="Roboto" w:hAnsi="Roboto"/>
+                <w:b/>
+                <w:bCs/>
+                <w:color w:val="55585A"/>
+                <w:sz w:val="17"/>
+                <w:szCs w:val="17"/>
+              </w:rPr>
+              <w:t xml:space="preserve">o)</w:t>
+            </w:r>
+            <w:r>
+              <w:rPr>
+                <w:rFonts w:ascii="Roboto" w:cs="Roboto" w:eastAsia="Roboto" w:hAnsi="Roboto"/>
+                <w:color w:val="55585A"/>
+                <w:sz w:val="17"/>
+                <w:szCs w:val="17"/>
+              </w:rPr>
+              <w:t xml:space="preserve"> Tarea 8: desglose por banqueta en la pestaña «Resumen».</w:t>
+            </w:r>
+          </w:p>
+        </w:tc>
+      </w:tr>
+    </w:tbl>
+    <w:p>
+      <w:pPr>
+        <w:spacing w:after="220" w:before="80" w:line="240"/>
+        <w:jc w:val="center"/>
+      </w:pPr>
+      <w:r>
+        <w:rPr>
+          <w:rFonts w:ascii="Roboto" w:cs="Roboto" w:eastAsia="Roboto" w:hAnsi="Roboto"/>
+          <w:b/>
+          <w:bCs/>
+          <w:i/>
+          <w:iCs/>
+          <w:color w:val="55585A"/>
+          <w:sz w:val="18"/>
+          <w:szCs w:val="18"/>
+        </w:rPr>
+        <w:t xml:space="preserve">Figura 5. </w:t>
+      </w:r>
+      <w:r>
+        <w:rPr>
+          <w:rFonts w:ascii="Roboto" w:cs="Roboto" w:eastAsia="Roboto" w:hAnsi="Roboto"/>
+          <w:i/>
+          <w:iCs/>
+          <w:color w:val="55585A"/>
+          <w:sz w:val="18"/>
+          <w:szCs w:val="18"/>
+        </w:rPr>
+        <w:t xml:space="preserve">Recorrido guiado y filtro de banqueta. </w:t>
+      </w:r>
+      <w:r>
+        <w:rPr>
+          <w:rFonts w:ascii="Roboto" w:cs="Roboto" w:eastAsia="Roboto" w:hAnsi="Roboto"/>
+          <w:i/>
+          <w:iCs/>
+          <w:color w:val="55585A"/>
+          <w:sz w:val="18"/>
+          <w:szCs w:val="18"/>
+        </w:rPr>
+        <w:t xml:space="preserve">Fuente: herramienta «Calles prioritarias para reforestar», versión 17.38, teléfono simulado de 390 × 844, 5 de octubre de 2026.</w:t>
+      </w:r>
+    </w:p>
+    <w:tbl>
+      <w:tblPr>
+        <w:tblW w:type="dxa" w:w="9972"/>
+        <w:tblBorders>
+          <w:top w:val="none" w:color="FFFFFF" w:sz="0"/>
+          <w:left w:val="none" w:color="FFFFFF" w:sz="0"/>
+          <w:bottom w:val="none" w:color="FFFFFF" w:sz="0"/>
+          <w:right w:val="none" w:color="FFFFFF" w:sz="0"/>
+          <w:insideH w:val="none" w:color="FFFFFF" w:sz="0"/>
+          <w:insideV w:val="none" w:color="FFFFFF" w:sz="0"/>
+        </w:tblBorders>
+      </w:tblPr>
+      <w:tblGrid>
+        <w:gridCol w:w="3324"/>
+        <w:gridCol w:w="3324"/>
+        <w:gridCol w:w="3324"/>
+      </w:tblGrid>
+      <w:tr>
+        <w:trPr>
+          <w:cantSplit/>
+        </w:trPr>
+        <w:tc>
+          <w:tcPr>
+            <w:tcW w:type="dxa" w:w="3324"/>
+            <w:tcBorders>
+              <w:top w:val="none" w:color="FFFFFF" w:sz="0"/>
+              <w:left w:val="none" w:color="FFFFFF" w:sz="0"/>
+              <w:bottom w:val="none" w:color="FFFFFF" w:sz="0"/>
+              <w:right w:val="none" w:color="FFFFFF" w:sz="0"/>
+            </w:tcBorders>
+            <w:tcMar>
+              <w:top w:type="dxa" w:w="40"/>
+              <w:left w:type="dxa" w:w="60"/>
+              <w:bottom w:type="dxa" w:w="40"/>
+              <w:right w:type="dxa" w:w="60"/>
+            </w:tcMar>
+          </w:tcPr>
+          <w:p>
+            <w:pPr>
+              <w:spacing w:after="40"/>
+              <w:jc w:val="center"/>
+            </w:pPr>
+            <w:r>
+              <w:drawing>
+                <wp:inline distT="0" distB="0" distL="0" distR="0">
+                  <wp:extent cx="1314450" cy="2847975"/>
+                  <wp:effectExtent t="0" r="0" b="0" l="0"/>
+                  <wp:docPr id="16" name="" descr="" title=""/>
+                  <wp:cNvGraphicFramePr>
+                    <a:graphicFrameLocks xmlns:a="http://schemas.openxmlformats.org/drawingml/2006/main" noChangeAspect="1"/>
+                  </wp:cNvGraphicFramePr>
+                  <a:graphic xmlns:a="http://schemas.openxmlformats.org/drawingml/2006/main">
+                    <a:graphicData uri="http://schemas.openxmlformats.org/drawingml/2006/picture">
+                      <pic:pic xmlns:pic="http://schemas.openxmlformats.org/drawingml/2006/picture">
+                        <pic:nvPicPr>
+                          <pic:cNvPr id="0" name="" descr=""/>
+                          <pic:cNvPicPr>
+                            <a:picLocks noChangeAspect="1" noChangeArrowheads="1"/>
+                          </pic:cNvPicPr>
+                        </pic:nvPicPr>
+                        <pic:blipFill>
+                          <a:blip r:embed="rId103" cstate="none"/>
+                          <a:srcRect/>
+                          <a:stretch>
+                            <a:fillRect/>
+                          </a:stretch>
+                        </pic:blipFill>
+                        <pic:spPr bwMode="auto">
+                          <a:xfrm>
+                            <a:off x="0" y="0"/>
+                            <a:ext cx="1314450" cy="2847975"/>
+                          </a:xfrm>
+                          <a:prstGeom prst="rect">
+                            <a:avLst/>
+                          </a:prstGeom>
+                        </pic:spPr>
+                      </pic:pic>
+                    </a:graphicData>
+                  </a:graphic>
+                </wp:inline>
+              </w:drawing>
+            </w:r>
+          </w:p>
+          <w:p>
+            <w:pPr>
+              <w:spacing w:after="0" w:line="230"/>
+              <w:jc w:val="center"/>
+            </w:pPr>
+            <w:r>
+              <w:rPr>
+                <w:rFonts w:ascii="Roboto" w:cs="Roboto" w:eastAsia="Roboto" w:hAnsi="Roboto"/>
+                <w:b/>
+                <w:bCs/>
+                <w:color w:val="55585A"/>
+                <w:sz w:val="17"/>
+                <w:szCs w:val="17"/>
+              </w:rPr>
+              <w:t xml:space="preserve">p)</w:t>
+            </w:r>
+            <w:r>
+              <w:rPr>
+                <w:rFonts w:ascii="Roboto" w:cs="Roboto" w:eastAsia="Roboto" w:hAnsi="Roboto"/>
+                <w:color w:val="55585A"/>
+                <w:sz w:val="17"/>
+                <w:szCs w:val="17"/>
+              </w:rPr>
+              <w:t xml:space="preserve"> Tarea 5: paso «Street View» del recorrido; el botón está en la ficha de cada frente.</w:t>
+            </w:r>
+          </w:p>
+        </w:tc>
+        <w:tc>
+          <w:tcPr>
+            <w:tcW w:type="dxa" w:w="3324"/>
+            <w:tcBorders>
+              <w:top w:val="none" w:color="FFFFFF" w:sz="0"/>
+              <w:left w:val="none" w:color="FFFFFF" w:sz="0"/>
+              <w:bottom w:val="none" w:color="FFFFFF" w:sz="0"/>
+              <w:right w:val="none" w:color="FFFFFF" w:sz="0"/>
+            </w:tcBorders>
+            <w:tcMar>
+              <w:top w:type="dxa" w:w="40"/>
+              <w:left w:type="dxa" w:w="60"/>
+              <w:bottom w:type="dxa" w:w="40"/>
+              <w:right w:type="dxa" w:w="60"/>
+            </w:tcMar>
+          </w:tcPr>
+          <w:p>
+            <w:pPr>
+              <w:spacing w:after="40"/>
+              <w:jc w:val="center"/>
+            </w:pPr>
+            <w:r>
+              <w:drawing>
+                <wp:inline distT="0" distB="0" distL="0" distR="0">
+                  <wp:extent cx="1314450" cy="2847975"/>
+                  <wp:effectExtent t="0" r="0" b="0" l="0"/>
+                  <wp:docPr id="17" name="" descr="" title=""/>
+                  <wp:cNvGraphicFramePr>
+                    <a:graphicFrameLocks xmlns:a="http://schemas.openxmlformats.org/drawingml/2006/main" noChangeAspect="1"/>
+                  </wp:cNvGraphicFramePr>
+                  <a:graphic xmlns:a="http://schemas.openxmlformats.org/drawingml/2006/main">
+                    <a:graphicData uri="http://schemas.openxmlformats.org/drawingml/2006/picture">
+                      <pic:pic xmlns:pic="http://schemas.openxmlformats.org/drawingml/2006/picture">
+                        <pic:nvPicPr>
+                          <pic:cNvPr id="0" name="" descr=""/>
+                          <pic:cNvPicPr>
+                            <a:picLocks noChangeAspect="1" noChangeArrowheads="1"/>
+                          </pic:cNvPicPr>
+                        </pic:nvPicPr>
+                        <pic:blipFill>
+                          <a:blip r:embed="rId104" cstate="none"/>
+                          <a:srcRect/>
+                          <a:stretch>
+                            <a:fillRect/>
+                          </a:stretch>
+                        </pic:blipFill>
+                        <pic:spPr bwMode="auto">
+                          <a:xfrm>
+                            <a:off x="0" y="0"/>
+                            <a:ext cx="1314450" cy="2847975"/>
+                          </a:xfrm>
+                          <a:prstGeom prst="rect">
+                            <a:avLst/>
+                          </a:prstGeom>
+                        </pic:spPr>
+                      </pic:pic>
+                    </a:graphicData>
+                  </a:graphic>
+                </wp:inline>
+              </w:drawing>
+            </w:r>
+          </w:p>
+          <w:p>
+            <w:pPr>
+              <w:spacing w:after="0" w:line="230"/>
+              <w:jc w:val="center"/>
+            </w:pPr>
+            <w:r>
+              <w:rPr>
+                <w:rFonts w:ascii="Roboto" w:cs="Roboto" w:eastAsia="Roboto" w:hAnsi="Roboto"/>
+                <w:b/>
+                <w:bCs/>
+                <w:color w:val="55585A"/>
+                <w:sz w:val="17"/>
+                <w:szCs w:val="17"/>
+              </w:rPr>
+              <w:t xml:space="preserve">q)</w:t>
+            </w:r>
+            <w:r>
+              <w:rPr>
+                <w:rFonts w:ascii="Roboto" w:cs="Roboto" w:eastAsia="Roboto" w:hAnsi="Roboto"/>
+                <w:color w:val="55585A"/>
+                <w:sz w:val="17"/>
+                <w:szCs w:val="17"/>
+              </w:rPr>
+              <w:t xml:space="preserve"> Tabla 4, tarea 0: pantalla de acceso con cuenta.</w:t>
+            </w:r>
+          </w:p>
+        </w:tc>
+        <w:tc>
+          <w:tcPr>
+            <w:tcW w:type="dxa" w:w="3324"/>
+            <w:tcBorders>
+              <w:top w:val="none" w:color="FFFFFF" w:sz="0"/>
+              <w:left w:val="none" w:color="FFFFFF" w:sz="0"/>
+              <w:bottom w:val="none" w:color="FFFFFF" w:sz="0"/>
+              <w:right w:val="none" w:color="FFFFFF" w:sz="0"/>
+            </w:tcBorders>
+            <w:tcMar>
+              <w:top w:type="dxa" w:w="40"/>
+              <w:left w:type="dxa" w:w="60"/>
+              <w:bottom w:type="dxa" w:w="40"/>
+              <w:right w:type="dxa" w:w="60"/>
+            </w:tcMar>
+          </w:tcPr>
+          <w:p>
+            <w:pPr>
+              <w:spacing w:after="40"/>
+              <w:jc w:val="center"/>
+            </w:pPr>
+            <w:r>
+              <w:drawing>
+                <wp:inline distT="0" distB="0" distL="0" distR="0">
+                  <wp:extent cx="1314450" cy="2847975"/>
+                  <wp:effectExtent t="0" r="0" b="0" l="0"/>
+                  <wp:docPr id="18" name="" descr="" title=""/>
+                  <wp:cNvGraphicFramePr>
+                    <a:graphicFrameLocks xmlns:a="http://schemas.openxmlformats.org/drawingml/2006/main" noChangeAspect="1"/>
+                  </wp:cNvGraphicFramePr>
+                  <a:graphic xmlns:a="http://schemas.openxmlformats.org/drawingml/2006/main">
+                    <a:graphicData uri="http://schemas.openxmlformats.org/drawingml/2006/picture">
+                      <pic:pic xmlns:pic="http://schemas.openxmlformats.org/drawingml/2006/picture">
+                        <pic:nvPicPr>
+                          <pic:cNvPr id="0" name="" descr=""/>
+                          <pic:cNvPicPr>
+                            <a:picLocks noChangeAspect="1" noChangeArrowheads="1"/>
+                          </pic:cNvPicPr>
+                        </pic:nvPicPr>
+                        <pic:blipFill>
+                          <a:blip r:embed="rId105" cstate="none"/>
+                          <a:srcRect/>
+                          <a:stretch>
+                            <a:fillRect/>
+                          </a:stretch>
+                        </pic:blipFill>
+                        <pic:spPr bwMode="auto">
+                          <a:xfrm>
+                            <a:off x="0" y="0"/>
+                            <a:ext cx="1314450" cy="2847975"/>
+                          </a:xfrm>
+                          <a:prstGeom prst="rect">
+                            <a:avLst/>
+                          </a:prstGeom>
+                        </pic:spPr>
+                      </pic:pic>
+                    </a:graphicData>
+                  </a:graphic>
+                </wp:inline>
+              </w:drawing>
+            </w:r>
+          </w:p>
+          <w:p>
+            <w:pPr>
+              <w:spacing w:after="0" w:line="230"/>
+              <w:jc w:val="center"/>
+            </w:pPr>
+            <w:r>
+              <w:rPr>
+                <w:rFonts w:ascii="Roboto" w:cs="Roboto" w:eastAsia="Roboto" w:hAnsi="Roboto"/>
+                <w:b/>
+                <w:bCs/>
+                <w:color w:val="55585A"/>
+                <w:sz w:val="17"/>
+                <w:szCs w:val="17"/>
+              </w:rPr>
+              <w:t xml:space="preserve">r)</w:t>
+            </w:r>
+            <w:r>
+              <w:rPr>
+                <w:rFonts w:ascii="Roboto" w:cs="Roboto" w:eastAsia="Roboto" w:hAnsi="Roboto"/>
+                <w:color w:val="55585A"/>
+                <w:sz w:val="17"/>
+                <w:szCs w:val="17"/>
+              </w:rPr>
+              <w:t xml:space="preserve"> Tabla 4, tarea 0: «Crea tu contraseña», tras entrar con la temporal.</w:t>
+            </w:r>
+          </w:p>
+        </w:tc>
+      </w:tr>
+    </w:tbl>
+    <w:p>
+      <w:pPr>
+        <w:spacing w:after="220" w:before="80" w:line="240"/>
+        <w:jc w:val="center"/>
+      </w:pPr>
+      <w:r>
+        <w:rPr>
+          <w:rFonts w:ascii="Roboto" w:cs="Roboto" w:eastAsia="Roboto" w:hAnsi="Roboto"/>
+          <w:b/>
+          <w:bCs/>
+          <w:i/>
+          <w:iCs/>
+          <w:color w:val="55585A"/>
+          <w:sz w:val="18"/>
+          <w:szCs w:val="18"/>
+        </w:rPr>
+        <w:t xml:space="preserve">Figura 6. </w:t>
+      </w:r>
+      <w:r>
+        <w:rPr>
+          <w:rFonts w:ascii="Roboto" w:cs="Roboto" w:eastAsia="Roboto" w:hAnsi="Roboto"/>
+          <w:i/>
+          <w:iCs/>
+          <w:color w:val="55585A"/>
+          <w:sz w:val="18"/>
+          <w:szCs w:val="18"/>
+        </w:rPr>
+        <w:t xml:space="preserve">Street View y acceso con cuenta. Las pantallas de acceso son del módulo de inicio de sesión que se instalará en el servidor del SIA, en una demostración local. </w:t>
+      </w:r>
+      <w:r>
+        <w:rPr>
+          <w:rFonts w:ascii="Roboto" w:cs="Roboto" w:eastAsia="Roboto" w:hAnsi="Roboto"/>
+          <w:i/>
+          <w:iCs/>
+          <w:color w:val="55585A"/>
+          <w:sz w:val="18"/>
+          <w:szCs w:val="18"/>
+        </w:rPr>
+        <w:t xml:space="preserve">Fuente: herramienta «Calles prioritarias para reforestar», versión 17.38, teléfono simulado de 390 × 844, 5 de octubre de 2026.</w:t>
       </w:r>
     </w:p>
     <w:p>
@@ -7487,7 +8996,7 @@
                 <w:sz w:val="18"/>
                 <w:szCs w:val="18"/>
               </w:rPr>
-              <w:t xml:space="preserve">Opción que eligió al entrar</w:t>
+              <w:t xml:space="preserve">¿Apareció el recorrido guiado?</w:t>
             </w:r>
           </w:p>
         </w:tc>
@@ -7521,7 +9030,7 @@
                 <w:sz w:val="18"/>
                 <w:szCs w:val="18"/>
               </w:rPr>
-              <w:t xml:space="preserve">☐ Calles y colonias   ☐ Vialidades primarias</w:t>
+              <w:t xml:space="preserve">☐ Lo siguió completo   ☐ Lo dejó antes del final   ☐ No apareció</w:t>
             </w:r>
           </w:p>
         </w:tc>
@@ -7561,6 +9070,80 @@
                 <w:sz w:val="18"/>
                 <w:szCs w:val="18"/>
               </w:rPr>
+              <w:t xml:space="preserve">Opción que eligió al entrar</w:t>
+            </w:r>
+          </w:p>
+        </w:tc>
+        <w:tc>
+          <w:tcPr>
+            <w:tcW w:type="dxa" w:w="6572"/>
+            <w:tcBorders>
+              <w:top w:val="single" w:color="C9C9C9" w:sz="4"/>
+              <w:left w:val="single" w:color="C9C9C9" w:sz="4"/>
+              <w:bottom w:val="single" w:color="C9C9C9" w:sz="4"/>
+              <w:right w:val="single" w:color="C9C9C9" w:sz="4"/>
+            </w:tcBorders>
+            <w:shd w:fill="F7F1F3" w:color="auto" w:val="clear"/>
+            <w:tcMar>
+              <w:top w:type="dxa" w:w="70"/>
+              <w:left w:type="dxa" w:w="100"/>
+              <w:bottom w:type="dxa" w:w="70"/>
+              <w:right w:type="dxa" w:w="100"/>
+            </w:tcMar>
+            <w:vAlign w:val="top"/>
+          </w:tcPr>
+          <w:p>
+            <w:pPr>
+              <w:spacing w:after="30" w:line="250"/>
+              <w:jc w:val="left"/>
+            </w:pPr>
+            <w:r>
+              <w:rPr>
+                <w:rFonts w:ascii="Roboto" w:cs="Roboto" w:eastAsia="Roboto" w:hAnsi="Roboto"/>
+                <w:color w:val="1A1A1A"/>
+                <w:sz w:val="18"/>
+                <w:szCs w:val="18"/>
+              </w:rPr>
+              <w:t xml:space="preserve">☐ Calles y colonias   ☐ Vialidades primarias</w:t>
+            </w:r>
+          </w:p>
+        </w:tc>
+      </w:tr>
+      <w:tr>
+        <w:trPr>
+          <w:cantSplit/>
+          <w:trHeight w:val="320" w:hRule="atLeast"/>
+        </w:trPr>
+        <w:tc>
+          <w:tcPr>
+            <w:tcW w:type="dxa" w:w="3400"/>
+            <w:tcBorders>
+              <w:top w:val="single" w:color="C9C9C9" w:sz="4"/>
+              <w:left w:val="single" w:color="C9C9C9" w:sz="4"/>
+              <w:bottom w:val="single" w:color="C9C9C9" w:sz="4"/>
+              <w:right w:val="single" w:color="C9C9C9" w:sz="4"/>
+            </w:tcBorders>
+            <w:shd w:fill="FFFFFF" w:color="auto" w:val="clear"/>
+            <w:tcMar>
+              <w:top w:type="dxa" w:w="70"/>
+              <w:left w:type="dxa" w:w="100"/>
+              <w:bottom w:type="dxa" w:w="70"/>
+              <w:right w:type="dxa" w:w="100"/>
+            </w:tcMar>
+            <w:vAlign w:val="top"/>
+          </w:tcPr>
+          <w:p>
+            <w:pPr>
+              <w:spacing w:after="30" w:line="250"/>
+              <w:jc w:val="left"/>
+            </w:pPr>
+            <w:r>
+              <w:rPr>
+                <w:rFonts w:ascii="Roboto" w:cs="Roboto" w:eastAsia="Roboto" w:hAnsi="Roboto"/>
+                <w:color w:val="1A1A1A"/>
+                <w:sz w:val="18"/>
+                <w:szCs w:val="18"/>
+              </w:rPr>
               <w:t xml:space="preserve">Prueba de acceso previa (tabla 1)</w:t>
             </w:r>
           </w:p>
@@ -7574,6 +9157,46 @@
               <w:bottom w:val="single" w:color="C9C9C9" w:sz="4"/>
               <w:right w:val="single" w:color="C9C9C9" w:sz="4"/>
             </w:tcBorders>
+            <w:shd w:fill="FFFFFF" w:color="auto" w:val="clear"/>
+            <w:tcMar>
+              <w:top w:type="dxa" w:w="70"/>
+              <w:left w:type="dxa" w:w="100"/>
+              <w:bottom w:type="dxa" w:w="70"/>
+              <w:right w:type="dxa" w:w="100"/>
+            </w:tcMar>
+            <w:vAlign w:val="top"/>
+          </w:tcPr>
+          <w:p>
+            <w:pPr>
+              <w:spacing w:after="30" w:line="250"/>
+              <w:jc w:val="left"/>
+            </w:pPr>
+            <w:r>
+              <w:rPr>
+                <w:rFonts w:ascii="Roboto" w:cs="Roboto" w:eastAsia="Roboto" w:hAnsi="Roboto"/>
+                <w:color w:val="1A1A1A"/>
+                <w:sz w:val="18"/>
+                <w:szCs w:val="18"/>
+              </w:rPr>
+              <w:t xml:space="preserve">☐ Abrió en la red de la alcaldía   ☐ Solo con datos móviles   ☐ No abrió</w:t>
+            </w:r>
+          </w:p>
+        </w:tc>
+      </w:tr>
+      <w:tr>
+        <w:trPr>
+          <w:cantSplit/>
+          <w:trHeight w:val="320" w:hRule="atLeast"/>
+        </w:trPr>
+        <w:tc>
+          <w:tcPr>
+            <w:tcW w:type="dxa" w:w="3400"/>
+            <w:tcBorders>
+              <w:top w:val="single" w:color="C9C9C9" w:sz="4"/>
+              <w:left w:val="single" w:color="C9C9C9" w:sz="4"/>
+              <w:bottom w:val="single" w:color="C9C9C9" w:sz="4"/>
+              <w:right w:val="single" w:color="C9C9C9" w:sz="4"/>
+            </w:tcBorders>
             <w:shd w:fill="F7F1F3" w:color="auto" w:val="clear"/>
             <w:tcMar>
               <w:top w:type="dxa" w:w="70"/>
@@ -7595,7 +9218,41 @@
                 <w:sz w:val="18"/>
                 <w:szCs w:val="18"/>
               </w:rPr>
-              <w:t xml:space="preserve">☐ Abrió en la red de la alcaldía   ☐ Solo con datos móviles   ☐ No abrió</w:t>
+              <w:t xml:space="preserve">Acceso con cuenta (tabla 4)</w:t>
+            </w:r>
+          </w:p>
+        </w:tc>
+        <w:tc>
+          <w:tcPr>
+            <w:tcW w:type="dxa" w:w="6572"/>
+            <w:tcBorders>
+              <w:top w:val="single" w:color="C9C9C9" w:sz="4"/>
+              <w:left w:val="single" w:color="C9C9C9" w:sz="4"/>
+              <w:bottom w:val="single" w:color="C9C9C9" w:sz="4"/>
+              <w:right w:val="single" w:color="C9C9C9" w:sz="4"/>
+            </w:tcBorders>
+            <w:shd w:fill="F7F1F3" w:color="auto" w:val="clear"/>
+            <w:tcMar>
+              <w:top w:type="dxa" w:w="70"/>
+              <w:left w:type="dxa" w:w="100"/>
+              <w:bottom w:type="dxa" w:w="70"/>
+              <w:right w:type="dxa" w:w="100"/>
+            </w:tcMar>
+            <w:vAlign w:val="top"/>
+          </w:tcPr>
+          <w:p>
+            <w:pPr>
+              <w:spacing w:after="30" w:line="250"/>
+              <w:jc w:val="left"/>
+            </w:pPr>
+            <w:r>
+              <w:rPr>
+                <w:rFonts w:ascii="Roboto" w:cs="Roboto" w:eastAsia="Roboto" w:hAnsi="Roboto"/>
+                <w:color w:val="1A1A1A"/>
+                <w:sz w:val="18"/>
+                <w:szCs w:val="18"/>
+              </w:rPr>
+              <w:t xml:space="preserve">☐ No aplica   ☐ Entró sin ayuda   ☐ Con ayuda   ☐ No lo logró</w:t>
             </w:r>
           </w:p>
         </w:tc>
@@ -9742,6 +11399,232 @@
               <w:right w:val="single" w:color="C9C9C9" w:sz="4"/>
             </w:tcBorders>
             <w:shd w:fill="F7F1F3" w:color="auto" w:val="clear"/>
+            <w:tcMar>
+              <w:top w:type="dxa" w:w="70"/>
+              <w:left w:type="dxa" w:w="100"/>
+              <w:bottom w:type="dxa" w:w="70"/>
+              <w:right w:type="dxa" w:w="100"/>
+            </w:tcMar>
+            <w:vAlign w:val="top"/>
+          </w:tcPr>
+          <w:p>
+            <w:pPr>
+              <w:spacing w:after="30" w:line="250"/>
+              <w:jc w:val="left"/>
+            </w:pPr>
+          </w:p>
+        </w:tc>
+      </w:tr>
+      <w:tr>
+        <w:trPr>
+          <w:cantSplit/>
+          <w:trHeight w:val="420" w:hRule="atLeast"/>
+        </w:trPr>
+        <w:tc>
+          <w:tcPr>
+            <w:tcW w:type="dxa" w:w="500"/>
+            <w:tcBorders>
+              <w:top w:val="single" w:color="C9C9C9" w:sz="4"/>
+              <w:left w:val="single" w:color="C9C9C9" w:sz="4"/>
+              <w:bottom w:val="single" w:color="C9C9C9" w:sz="4"/>
+              <w:right w:val="single" w:color="C9C9C9" w:sz="4"/>
+            </w:tcBorders>
+            <w:shd w:fill="FFFFFF" w:color="auto" w:val="clear"/>
+            <w:tcMar>
+              <w:top w:type="dxa" w:w="70"/>
+              <w:left w:type="dxa" w:w="100"/>
+              <w:bottom w:type="dxa" w:w="70"/>
+              <w:right w:type="dxa" w:w="100"/>
+            </w:tcMar>
+            <w:vAlign w:val="top"/>
+          </w:tcPr>
+          <w:p>
+            <w:pPr>
+              <w:spacing w:after="30" w:line="250"/>
+              <w:jc w:val="center"/>
+            </w:pPr>
+            <w:r>
+              <w:rPr>
+                <w:rFonts w:ascii="Roboto" w:cs="Roboto" w:eastAsia="Roboto" w:hAnsi="Roboto"/>
+                <w:color w:val="1A1A1A"/>
+                <w:sz w:val="18"/>
+                <w:szCs w:val="18"/>
+              </w:rPr>
+              <w:t xml:space="preserve">9</w:t>
+            </w:r>
+          </w:p>
+        </w:tc>
+        <w:tc>
+          <w:tcPr>
+            <w:tcW w:type="dxa" w:w="1100"/>
+            <w:tcBorders>
+              <w:top w:val="single" w:color="C9C9C9" w:sz="4"/>
+              <w:left w:val="single" w:color="C9C9C9" w:sz="4"/>
+              <w:bottom w:val="single" w:color="C9C9C9" w:sz="4"/>
+              <w:right w:val="single" w:color="C9C9C9" w:sz="4"/>
+            </w:tcBorders>
+            <w:shd w:fill="FFFFFF" w:color="auto" w:val="clear"/>
+            <w:tcMar>
+              <w:top w:type="dxa" w:w="70"/>
+              <w:left w:type="dxa" w:w="100"/>
+              <w:bottom w:type="dxa" w:w="70"/>
+              <w:right w:type="dxa" w:w="100"/>
+            </w:tcMar>
+            <w:vAlign w:val="top"/>
+          </w:tcPr>
+          <w:p>
+            <w:pPr>
+              <w:spacing w:after="30" w:line="250"/>
+              <w:jc w:val="center"/>
+            </w:pPr>
+            <w:r>
+              <w:rPr>
+                <w:rFonts w:ascii="Roboto" w:cs="Roboto" w:eastAsia="Roboto" w:hAnsi="Roboto"/>
+                <w:color w:val="1A1A1A"/>
+                <w:sz w:val="18"/>
+                <w:szCs w:val="18"/>
+              </w:rPr>
+              <w:t xml:space="preserve">☐</w:t>
+            </w:r>
+          </w:p>
+        </w:tc>
+        <w:tc>
+          <w:tcPr>
+            <w:tcW w:type="dxa" w:w="1100"/>
+            <w:tcBorders>
+              <w:top w:val="single" w:color="C9C9C9" w:sz="4"/>
+              <w:left w:val="single" w:color="C9C9C9" w:sz="4"/>
+              <w:bottom w:val="single" w:color="C9C9C9" w:sz="4"/>
+              <w:right w:val="single" w:color="C9C9C9" w:sz="4"/>
+            </w:tcBorders>
+            <w:shd w:fill="FFFFFF" w:color="auto" w:val="clear"/>
+            <w:tcMar>
+              <w:top w:type="dxa" w:w="70"/>
+              <w:left w:type="dxa" w:w="100"/>
+              <w:bottom w:type="dxa" w:w="70"/>
+              <w:right w:type="dxa" w:w="100"/>
+            </w:tcMar>
+            <w:vAlign w:val="top"/>
+          </w:tcPr>
+          <w:p>
+            <w:pPr>
+              <w:spacing w:after="30" w:line="250"/>
+              <w:jc w:val="center"/>
+            </w:pPr>
+            <w:r>
+              <w:rPr>
+                <w:rFonts w:ascii="Roboto" w:cs="Roboto" w:eastAsia="Roboto" w:hAnsi="Roboto"/>
+                <w:color w:val="1A1A1A"/>
+                <w:sz w:val="18"/>
+                <w:szCs w:val="18"/>
+              </w:rPr>
+              <w:t xml:space="preserve">☐</w:t>
+            </w:r>
+          </w:p>
+        </w:tc>
+        <w:tc>
+          <w:tcPr>
+            <w:tcW w:type="dxa" w:w="1200"/>
+            <w:tcBorders>
+              <w:top w:val="single" w:color="C9C9C9" w:sz="4"/>
+              <w:left w:val="single" w:color="C9C9C9" w:sz="4"/>
+              <w:bottom w:val="single" w:color="C9C9C9" w:sz="4"/>
+              <w:right w:val="single" w:color="C9C9C9" w:sz="4"/>
+            </w:tcBorders>
+            <w:shd w:fill="FFFFFF" w:color="auto" w:val="clear"/>
+            <w:tcMar>
+              <w:top w:type="dxa" w:w="70"/>
+              <w:left w:type="dxa" w:w="100"/>
+              <w:bottom w:type="dxa" w:w="70"/>
+              <w:right w:type="dxa" w:w="100"/>
+            </w:tcMar>
+            <w:vAlign w:val="top"/>
+          </w:tcPr>
+          <w:p>
+            <w:pPr>
+              <w:spacing w:after="30" w:line="250"/>
+              <w:jc w:val="center"/>
+            </w:pPr>
+            <w:r>
+              <w:rPr>
+                <w:rFonts w:ascii="Roboto" w:cs="Roboto" w:eastAsia="Roboto" w:hAnsi="Roboto"/>
+                <w:color w:val="1A1A1A"/>
+                <w:sz w:val="18"/>
+                <w:szCs w:val="18"/>
+              </w:rPr>
+              <w:t xml:space="preserve">☐</w:t>
+            </w:r>
+          </w:p>
+        </w:tc>
+        <w:tc>
+          <w:tcPr>
+            <w:tcW w:type="dxa" w:w="1300"/>
+            <w:tcBorders>
+              <w:top w:val="single" w:color="C9C9C9" w:sz="4"/>
+              <w:left w:val="single" w:color="C9C9C9" w:sz="4"/>
+              <w:bottom w:val="single" w:color="C9C9C9" w:sz="4"/>
+              <w:right w:val="single" w:color="C9C9C9" w:sz="4"/>
+            </w:tcBorders>
+            <w:shd w:fill="FFFFFF" w:color="auto" w:val="clear"/>
+            <w:tcMar>
+              <w:top w:type="dxa" w:w="70"/>
+              <w:left w:type="dxa" w:w="100"/>
+              <w:bottom w:type="dxa" w:w="70"/>
+              <w:right w:type="dxa" w:w="100"/>
+            </w:tcMar>
+            <w:vAlign w:val="top"/>
+          </w:tcPr>
+          <w:p>
+            <w:pPr>
+              <w:spacing w:after="30" w:line="250"/>
+              <w:jc w:val="center"/>
+            </w:pPr>
+            <w:r>
+              <w:rPr>
+                <w:rFonts w:ascii="Roboto" w:cs="Roboto" w:eastAsia="Roboto" w:hAnsi="Roboto"/>
+                <w:color w:val="1A1A1A"/>
+                <w:sz w:val="18"/>
+                <w:szCs w:val="18"/>
+              </w:rPr>
+              <w:t xml:space="preserve">—</w:t>
+            </w:r>
+          </w:p>
+        </w:tc>
+        <w:tc>
+          <w:tcPr>
+            <w:tcW w:type="dxa" w:w="1000"/>
+            <w:tcBorders>
+              <w:top w:val="single" w:color="C9C9C9" w:sz="4"/>
+              <w:left w:val="single" w:color="C9C9C9" w:sz="4"/>
+              <w:bottom w:val="single" w:color="C9C9C9" w:sz="4"/>
+              <w:right w:val="single" w:color="C9C9C9" w:sz="4"/>
+            </w:tcBorders>
+            <w:shd w:fill="FFFFFF" w:color="auto" w:val="clear"/>
+            <w:tcMar>
+              <w:top w:type="dxa" w:w="70"/>
+              <w:left w:type="dxa" w:w="100"/>
+              <w:bottom w:type="dxa" w:w="70"/>
+              <w:right w:type="dxa" w:w="100"/>
+            </w:tcMar>
+            <w:vAlign w:val="top"/>
+          </w:tcPr>
+          <w:p>
+            <w:pPr>
+              <w:spacing w:after="30" w:line="250"/>
+              <w:jc w:val="left"/>
+            </w:pPr>
+          </w:p>
+        </w:tc>
+        <w:tc>
+          <w:tcPr>
+            <w:tcW w:type="dxa" w:w="3772"/>
+            <w:tcBorders>
+              <w:top w:val="single" w:color="C9C9C9" w:sz="4"/>
+              <w:left w:val="single" w:color="C9C9C9" w:sz="4"/>
+              <w:bottom w:val="single" w:color="C9C9C9" w:sz="4"/>
+              <w:right w:val="single" w:color="C9C9C9" w:sz="4"/>
+            </w:tcBorders>
+            <w:shd w:fill="FFFFFF" w:color="auto" w:val="clear"/>
             <w:tcMar>
               <w:top w:type="dxa" w:w="70"/>
               <w:left w:type="dxa" w:w="100"/>

</xml_diff>